<commit_message>
BAOCAO: cập nhật số liệu, sơ đồ (Bước 8), biểu đồ và báo cáo theo mô hình cuối v6
Co-Authored-By: Claude Opus 5.5 <noreply@anthropic.com>
Claude-Session: https://claude.ai/code/session_01XC5TNctxsz3htoKADALTxX
</commit_message>
<xml_diff>
--- a/BAOCAO/Bao_cao_HUIM_IPS_UJIIndoorLoc.docx
+++ b/BAOCAO/Bao_cao_HUIM_IPS_UJIIndoorLoc.docx
@@ -202,7 +202,7 @@
         <w:rPr>
           <w:rFonts w:ascii="Times New Roman" w:cs="Times New Roman" w:eastAsia="Times New Roman" w:hAnsi="Times New Roman"/>
         </w:rPr>
-        <w:t xml:space="preserve"> của một hệ thống định vị trong nhà dựa trên vân tay Wi-Fi, thay vì chỉ dùng HUIM như một bước lọc điểm truy cập (AP) đứng trước bộ phân loại k-láng giềng gần nhất (k-NN). Mỗi điểm tham chiếu của tập huấn luyện được coi là một cơ sở dữ liệu giao dịch; thuật toán EFIM khai thác tập High Utility Itemset (HUI) của từng điểm, và tập HUI này chính là mô hình định vị. Khi định vị, vân tay cần xác định được coi là một giao dịch và được so khớp với HUI của mọi ô: điểm khớp đo lượng lợi ích HUI của ô mà vân tay chứa, mức độ phù hợp của cường độ tín hiệu và độ phủ của vân tay. Tầng được chọn trước theo các ô khớp tốt nhất, sau đó toạ độ được ước lượng bằng trọng tâm có trọng số của các ô tốt nhất trong tầng đó. Không có phép so khoảng cách nào giữa vân tay truy vấn và vân tay huấn luyện.</w:t>
+        <w:t xml:space="preserve"> của một hệ thống định vị trong nhà dựa trên vân tay Wi-Fi, thay vì chỉ dùng HUIM như một bước lọc điểm truy cập (AP) đứng trước bộ phân loại k-láng giềng gần nhất (k-NN). Mỗi điểm tham chiếu của tập huấn luyện được coi là một cơ sở dữ liệu giao dịch; thuật toán EFIM khai thác tập High Utility Itemset (HUI) của từng điểm, và tập HUI này chính là mô hình định vị. Khi định vị, vân tay cần xác định được coi là một giao dịch và được so khớp với HUI của mọi ô: điểm khớp đo lượng lợi ích HUI của ô mà vân tay chứa, mức độ phù hợp của cường độ tín hiệu và độ phủ của vân tay. Tầng được chọn trước theo các ô khớp tốt nhất; các ô ứng viên của tầng đó sau đó được xếp hạng lại bằng nhiều bằng chứng rút ra từ HUI (ba mô hình HUI với ba cách đặt lợi ích nội, và hồ sơ cường độ của ô suy ra từ chính các HUI), và toạ độ là trọng tâm có trọng số của các ô xếp đầu. Không có phép so khoảng cách nào giữa vân tay truy vấn và vân tay huấn luyện, và mô hình không lưu vân tay huấn luyện.</w:t>
       </w:r>
     </w:p>
     <w:p>
@@ -215,7 +215,7 @@
         <w:rPr>
           <w:rFonts w:ascii="Times New Roman" w:cs="Times New Roman" w:eastAsia="Times New Roman" w:hAnsi="Times New Roman"/>
         </w:rPr>
-        <w:t xml:space="preserve">Toàn bộ tham số được chọn trên các fold kiểm định (dev) tách từ tập huấn luyện; tập kiểm tra chỉ được dùng một lần. Trên 9 tập kiểm tra của 6 bộ dữ liệu, 8 tập đạt sai số trung bình dưới 7 m. Trên UJIIndoorLoc (1 111 vân tay kiểm tra, 80,4% xác định đúng tòa và tầng), sai số trung bình là 8,06 m và trung vị 6,15 m, chưa đạt mức 7 m. Phân tích cho thấy 78% tổng sai số nằm ở các mẫu đã xác định đúng tầng, và 9/11 điện thoại của tập kiểm tra không xuất hiện trong tập huấn luyện. Mọi con số được kiểm chứng độc lập (42 phép kiểm, 0 thất bại) và có thể tính lại bằng sổ Excel kèm theo.</w:t>
+        <w:t xml:space="preserve">Toàn bộ tham số được chọn trên các fold kiểm định (dev) tách từ tập huấn luyện; tập kiểm tra chỉ được dùng một lần. Trên 9 tập kiểm tra của 6 bộ dữ liệu, 9 tập đạt sai số trung bình dưới 7 m. Trên UJIIndoorLoc (1 111 vân tay kiểm tra, 80,4% xác định đúng tòa và tầng), sai số trung bình là 6,87 m và trung vị 5,14 m, giảm từ 8,06 m của phiên bản chỉ dùng một điểm khớp HUI; bước xếp hạng lại được chọn trên dev (sai số dev 7,65 m xuống 6,83 m) trước khi tập kiểm tra được chấm. Phần lớn sai số còn lại (76%) nằm ở các mẫu đã xác định đúng tầng, và 9/11 điện thoại của tập kiểm tra không xuất hiện trong tập huấn luyện. Mọi con số được kiểm chứng độc lập (50 phép kiểm, 0 thất bại) và có thể tính lại bằng sổ Excel kèm theo.</w:t>
       </w:r>
     </w:p>
     <w:p>
@@ -893,7 +893,7 @@
             <w:rPr>
               <w:rFonts w:ascii="Times New Roman" w:hAnsi="Times New Roman" w:cs="Times New Roman" w:eastAsia="Times New Roman"/>
             </w:rPr>
-            <w:t xml:space="preserve">3.7. Bước 7 — Ước lượng toạ độ</w:t>
+            <w:t xml:space="preserve">3.7. Bước 7 — Ô ứng viên và ước lượng ban đầu</w:t>
           </w:r>
           <w:r>
             <w:rPr>
@@ -920,7 +920,7 @@
             <w:rPr>
               <w:rFonts w:ascii="Times New Roman" w:hAnsi="Times New Roman" w:cs="Times New Roman" w:eastAsia="Times New Roman"/>
             </w:rPr>
-            <w:t xml:space="preserve">3.8. Thuật toán tổng hợp</w:t>
+            <w:t xml:space="preserve">3.8. Bước 8 — Xếp hạng lại ô ứng viên bằng bằng chứng HUI</w:t>
           </w:r>
           <w:r>
             <w:rPr>
@@ -932,7 +932,34 @@
             <w:rPr>
               <w:rFonts w:ascii="Times New Roman" w:hAnsi="Times New Roman" w:cs="Times New Roman" w:eastAsia="Times New Roman"/>
             </w:rPr>
-            <w:t>18</w:t>
+            <w:t>17</w:t>
+          </w:r>
+        </w:p>
+        <w:p>
+          <w:pPr>
+            <w:tabs>
+              <w:tab w:val="right" w:leader="dot" w:pos="9071"/>
+            </w:tabs>
+            <w:spacing w:before="0" w:after="60" w:line="300" w:lineRule="auto"/>
+            <w:ind w:left="283"/>
+          </w:pPr>
+          <w:r>
+            <w:rPr>
+              <w:rFonts w:ascii="Times New Roman" w:hAnsi="Times New Roman" w:cs="Times New Roman" w:eastAsia="Times New Roman"/>
+            </w:rPr>
+            <w:t xml:space="preserve">3.9. Thuật toán tổng hợp</w:t>
+          </w:r>
+          <w:r>
+            <w:rPr>
+              <w:rFonts w:ascii="Times New Roman" w:hAnsi="Times New Roman" w:cs="Times New Roman" w:eastAsia="Times New Roman"/>
+            </w:rPr>
+            <w:tab/>
+          </w:r>
+          <w:r>
+            <w:rPr>
+              <w:rFonts w:ascii="Times New Roman" w:hAnsi="Times New Roman" w:cs="Times New Roman" w:eastAsia="Times New Roman"/>
+            </w:rPr>
+            <w:t>19</w:t>
           </w:r>
         </w:p>
         <w:p>
@@ -962,7 +989,7 @@
               <w:rFonts w:ascii="Times New Roman" w:hAnsi="Times New Roman" w:cs="Times New Roman" w:eastAsia="Times New Roman"/>
               <w:b/>
             </w:rPr>
-            <w:t>19</w:t>
+            <w:t>20</w:t>
           </w:r>
         </w:p>
         <w:p>
@@ -989,7 +1016,7 @@
             <w:rPr>
               <w:rFonts w:ascii="Times New Roman" w:hAnsi="Times New Roman" w:cs="Times New Roman" w:eastAsia="Times New Roman"/>
             </w:rPr>
-            <w:t>19</w:t>
+            <w:t>20</w:t>
           </w:r>
         </w:p>
         <w:p>
@@ -1016,7 +1043,7 @@
             <w:rPr>
               <w:rFonts w:ascii="Times New Roman" w:hAnsi="Times New Roman" w:cs="Times New Roman" w:eastAsia="Times New Roman"/>
             </w:rPr>
-            <w:t>19</w:t>
+            <w:t>20</w:t>
           </w:r>
         </w:p>
         <w:p>
@@ -1043,7 +1070,7 @@
             <w:rPr>
               <w:rFonts w:ascii="Times New Roman" w:hAnsi="Times New Roman" w:cs="Times New Roman" w:eastAsia="Times New Roman"/>
             </w:rPr>
-            <w:t>20</w:t>
+            <w:t>22</w:t>
           </w:r>
         </w:p>
         <w:p>
@@ -1070,7 +1097,7 @@
             <w:rPr>
               <w:rFonts w:ascii="Times New Roman" w:hAnsi="Times New Roman" w:cs="Times New Roman" w:eastAsia="Times New Roman"/>
             </w:rPr>
-            <w:t>21</w:t>
+            <w:t>23</w:t>
           </w:r>
         </w:p>
         <w:p>
@@ -1097,7 +1124,7 @@
             <w:rPr>
               <w:rFonts w:ascii="Times New Roman" w:hAnsi="Times New Roman" w:cs="Times New Roman" w:eastAsia="Times New Roman"/>
             </w:rPr>
-            <w:t>22</w:t>
+            <w:t>24</w:t>
           </w:r>
         </w:p>
         <w:p>
@@ -1124,7 +1151,7 @@
             <w:rPr>
               <w:rFonts w:ascii="Times New Roman" w:hAnsi="Times New Roman" w:cs="Times New Roman" w:eastAsia="Times New Roman"/>
             </w:rPr>
-            <w:t>23</w:t>
+            <w:t>25</w:t>
           </w:r>
         </w:p>
         <w:p>
@@ -1151,7 +1178,7 @@
             <w:rPr>
               <w:rFonts w:ascii="Times New Roman" w:hAnsi="Times New Roman" w:cs="Times New Roman" w:eastAsia="Times New Roman"/>
             </w:rPr>
-            <w:t>23</w:t>
+            <w:t>25</w:t>
           </w:r>
         </w:p>
         <w:p>
@@ -1181,7 +1208,7 @@
               <w:rFonts w:ascii="Times New Roman" w:hAnsi="Times New Roman" w:cs="Times New Roman" w:eastAsia="Times New Roman"/>
               <w:b/>
             </w:rPr>
-            <w:t>24</w:t>
+            <w:t>27</w:t>
           </w:r>
         </w:p>
         <w:p>
@@ -1208,7 +1235,7 @@
             <w:rPr>
               <w:rFonts w:ascii="Times New Roman" w:hAnsi="Times New Roman" w:cs="Times New Roman" w:eastAsia="Times New Roman"/>
             </w:rPr>
-            <w:t>24</w:t>
+            <w:t>27</w:t>
           </w:r>
         </w:p>
         <w:p>
@@ -1235,7 +1262,7 @@
             <w:rPr>
               <w:rFonts w:ascii="Times New Roman" w:hAnsi="Times New Roman" w:cs="Times New Roman" w:eastAsia="Times New Roman"/>
             </w:rPr>
-            <w:t>24</w:t>
+            <w:t>27</w:t>
           </w:r>
         </w:p>
         <w:p>
@@ -1265,7 +1292,7 @@
               <w:rFonts w:ascii="Times New Roman" w:hAnsi="Times New Roman" w:cs="Times New Roman" w:eastAsia="Times New Roman"/>
               <w:b/>
             </w:rPr>
-            <w:t>25</w:t>
+            <w:t>28</w:t>
           </w:r>
         </w:p>
         <w:p>
@@ -1295,7 +1322,7 @@
               <w:rFonts w:ascii="Times New Roman" w:hAnsi="Times New Roman" w:cs="Times New Roman" w:eastAsia="Times New Roman"/>
               <w:b/>
             </w:rPr>
-            <w:t>26</w:t>
+            <w:t>30</w:t>
           </w:r>
         </w:p>
         <w:p>
@@ -1368,7 +1395,7 @@
             <w:rPr>
               <w:rFonts w:ascii="Times New Roman" w:hAnsi="Times New Roman" w:cs="Times New Roman" w:eastAsia="Times New Roman"/>
             </w:rPr>
-            <w:t xml:space="preserve">Hình 3.2. Bước 1 trên một vân tay thật (dòng 729 của validationData)</w:t>
+            <w:t xml:space="preserve">Hình 3.2. Bước 1 trên một vân tay thật (dòng 573 của validationData)</w:t>
           </w:r>
           <w:r>
             <w:rPr>
@@ -1530,7 +1557,7 @@
             <w:rPr>
               <w:rFonts w:ascii="Times New Roman" w:hAnsi="Times New Roman" w:cs="Times New Roman" w:eastAsia="Times New Roman"/>
             </w:rPr>
-            <w:t xml:space="preserve">Hình 3.8. Toạ độ ước lượng của vân tay ví dụ từ m ô tốt nhất</w:t>
+            <w:t xml:space="preserve">Hình 3.8. Ô ứng viên của tầng đã chọn và ước lượng ban đầu của vân tay ví dụ</w:t>
           </w:r>
           <w:r>
             <w:rPr>
@@ -1557,7 +1584,7 @@
             <w:rPr>
               <w:rFonts w:ascii="Times New Roman" w:hAnsi="Times New Roman" w:cs="Times New Roman" w:eastAsia="Times New Roman"/>
             </w:rPr>
-            <w:t xml:space="preserve">Hình 4.1. Giao thức đánh giá và kiểm chứng</w:t>
+            <w:t xml:space="preserve">Hình 3.9. Bước 8: bằng chứng HUI, bộ hồi quy và toạ độ cuối của vân tay ví dụ</w:t>
           </w:r>
           <w:r>
             <w:rPr>
@@ -1584,7 +1611,7 @@
             <w:rPr>
               <w:rFonts w:ascii="Times New Roman" w:hAnsi="Times New Roman" w:cs="Times New Roman" w:eastAsia="Times New Roman"/>
             </w:rPr>
-            <w:t xml:space="preserve">Hình 4.2. Sai số trên dev của UJIIndoorLoc theo σ và m (mỗi điểm là cấu hình tốt nhất của các tham số còn lại)</w:t>
+            <w:t xml:space="preserve">Hình 4.1. Giao thức đánh giá và kiểm chứng</w:t>
           </w:r>
           <w:r>
             <w:rPr>
@@ -1611,7 +1638,7 @@
             <w:rPr>
               <w:rFonts w:ascii="Times New Roman" w:hAnsi="Times New Roman" w:cs="Times New Roman" w:eastAsia="Times New Roman"/>
             </w:rPr>
-            <w:t xml:space="preserve">Hình 4.3. Sai số trung bình trên tập kiểm tra của mọi bộ dữ liệu; đường đứt là mức 7 m</w:t>
+            <w:t xml:space="preserve">Hình 4.2. Sai số trên dev của UJIIndoorLoc theo σ và m (mỗi điểm là cấu hình tốt nhất của các tham số còn lại)</w:t>
           </w:r>
           <w:r>
             <w:rPr>
@@ -1638,7 +1665,7 @@
             <w:rPr>
               <w:rFonts w:ascii="Times New Roman" w:hAnsi="Times New Roman" w:cs="Times New Roman" w:eastAsia="Times New Roman"/>
             </w:rPr>
-            <w:t xml:space="preserve">Hình 4.4. Phân bố sai số trên tập kiểm tra UJIIndoorLoc; hai đường k-NN chỉ để tham chiếu</w:t>
+            <w:t xml:space="preserve">Hình 4.3. Sai số trung bình trên tập kiểm tra của mọi bộ dữ liệu; đường đứt là mức 7 m</w:t>
           </w:r>
           <w:r>
             <w:rPr>
@@ -1650,7 +1677,34 @@
             <w:rPr>
               <w:rFonts w:ascii="Times New Roman" w:hAnsi="Times New Roman" w:cs="Times New Roman" w:eastAsia="Times New Roman"/>
             </w:rPr>
-            <w:t>21</w:t>
+            <w:t>22</w:t>
+          </w:r>
+        </w:p>
+        <w:p>
+          <w:pPr>
+            <w:tabs>
+              <w:tab w:val="right" w:leader="dot" w:pos="9071"/>
+            </w:tabs>
+            <w:spacing w:before="0" w:after="60" w:line="300" w:lineRule="auto"/>
+            <w:ind w:left="0"/>
+          </w:pPr>
+          <w:r>
+            <w:rPr>
+              <w:rFonts w:ascii="Times New Roman" w:hAnsi="Times New Roman" w:cs="Times New Roman" w:eastAsia="Times New Roman"/>
+            </w:rPr>
+            <w:t xml:space="preserve">Hình 4.4. Phân bố sai số trên tập kiểm tra UJIIndoorLoc: mô hình cuối, ước lượng ban đầu (v4) và hai đường k-NN chỉ để tham chiếu</w:t>
+          </w:r>
+          <w:r>
+            <w:rPr>
+              <w:rFonts w:ascii="Times New Roman" w:hAnsi="Times New Roman" w:cs="Times New Roman" w:eastAsia="Times New Roman"/>
+            </w:rPr>
+            <w:tab/>
+          </w:r>
+          <w:r>
+            <w:rPr>
+              <w:rFonts w:ascii="Times New Roman" w:hAnsi="Times New Roman" w:cs="Times New Roman" w:eastAsia="Times New Roman"/>
+            </w:rPr>
+            <w:t>23</w:t>
           </w:r>
         </w:p>
         <w:p>
@@ -1735,7 +1789,7 @@
             <w:rPr>
               <w:rFonts w:ascii="Times New Roman" w:hAnsi="Times New Roman" w:cs="Times New Roman" w:eastAsia="Times New Roman"/>
             </w:rPr>
-            <w:t>18</w:t>
+            <w:t>19</w:t>
           </w:r>
         </w:p>
         <w:p>
@@ -1762,33 +1816,6 @@
             <w:rPr>
               <w:rFonts w:ascii="Times New Roman" w:hAnsi="Times New Roman" w:cs="Times New Roman" w:eastAsia="Times New Roman"/>
             </w:rPr>
-            <w:t>19</w:t>
-          </w:r>
-        </w:p>
-        <w:p>
-          <w:pPr>
-            <w:tabs>
-              <w:tab w:val="right" w:leader="dot" w:pos="9071"/>
-            </w:tabs>
-            <w:spacing w:before="0" w:after="60" w:line="300" w:lineRule="auto"/>
-            <w:ind w:left="0"/>
-          </w:pPr>
-          <w:r>
-            <w:rPr>
-              <w:rFonts w:ascii="Times New Roman" w:hAnsi="Times New Roman" w:cs="Times New Roman" w:eastAsia="Times New Roman"/>
-            </w:rPr>
-            <w:t xml:space="preserve">Bảng 4.2. Kết quả định vị chỉ bằng HUIM trên tập kiểm tra</w:t>
-          </w:r>
-          <w:r>
-            <w:rPr>
-              <w:rFonts w:ascii="Times New Roman" w:hAnsi="Times New Roman" w:cs="Times New Roman" w:eastAsia="Times New Roman"/>
-            </w:rPr>
-            <w:tab/>
-          </w:r>
-          <w:r>
-            <w:rPr>
-              <w:rFonts w:ascii="Times New Roman" w:hAnsi="Times New Roman" w:cs="Times New Roman" w:eastAsia="Times New Roman"/>
-            </w:rPr>
             <w:t>20</w:t>
           </w:r>
         </w:p>
@@ -1804,7 +1831,7 @@
             <w:rPr>
               <w:rFonts w:ascii="Times New Roman" w:hAnsi="Times New Roman" w:cs="Times New Roman" w:eastAsia="Times New Roman"/>
             </w:rPr>
-            <w:t xml:space="preserve">Bảng 4.3. Tách sai số theo việc xác định đúng hay sai tầng (UJIIndoorLoc)</w:t>
+            <w:t xml:space="preserve">Bảng 4.2. Các biến thể của Bước 8 thử trên dev UJIIndoorLoc (sai số trung bình ngoài fold, 19 937 truy vấn)</w:t>
           </w:r>
           <w:r>
             <w:rPr>
@@ -1831,7 +1858,7 @@
             <w:rPr>
               <w:rFonts w:ascii="Times New Roman" w:hAnsi="Times New Roman" w:cs="Times New Roman" w:eastAsia="Times New Roman"/>
             </w:rPr>
-            <w:t xml:space="preserve">Bảng 4.4. Các phiên bản đã thử trên UJIIndoorLoc (mỗi phiên bản chọn trên dev rồi chấm tập kiểm tra một lần)</w:t>
+            <w:t xml:space="preserve">Bảng 4.3. Kết quả định vị chỉ bằng HUIM trên tập kiểm tra</w:t>
           </w:r>
           <w:r>
             <w:rPr>
@@ -1858,34 +1885,7 @@
             <w:rPr>
               <w:rFonts w:ascii="Times New Roman" w:hAnsi="Times New Roman" w:cs="Times New Roman" w:eastAsia="Times New Roman"/>
             </w:rPr>
-            <w:t xml:space="preserve">Bảng 4.5. Sai số trung bình (m) của hệ thống chỉ dùng HUIM và các hệ thống tham chiếu dùng k-NN</w:t>
-          </w:r>
-          <w:r>
-            <w:rPr>
-              <w:rFonts w:ascii="Times New Roman" w:hAnsi="Times New Roman" w:cs="Times New Roman" w:eastAsia="Times New Roman"/>
-            </w:rPr>
-            <w:tab/>
-          </w:r>
-          <w:r>
-            <w:rPr>
-              <w:rFonts w:ascii="Times New Roman" w:hAnsi="Times New Roman" w:cs="Times New Roman" w:eastAsia="Times New Roman"/>
-            </w:rPr>
-            <w:t>22</w:t>
-          </w:r>
-        </w:p>
-        <w:p>
-          <w:pPr>
-            <w:tabs>
-              <w:tab w:val="right" w:leader="dot" w:pos="9071"/>
-            </w:tabs>
-            <w:spacing w:before="0" w:after="60" w:line="300" w:lineRule="auto"/>
-            <w:ind w:left="0"/>
-          </w:pPr>
-          <w:r>
-            <w:rPr>
-              <w:rFonts w:ascii="Times New Roman" w:hAnsi="Times New Roman" w:cs="Times New Roman" w:eastAsia="Times New Roman"/>
-            </w:rPr>
-            <w:t xml:space="preserve">Bảng 4.6. Kết quả kiểm chứng độc lập</w:t>
+            <w:t xml:space="preserve">Bảng 4.4. Tách sai số theo việc xác định đúng hay sai tầng (UJIIndoorLoc)</w:t>
           </w:r>
           <w:r>
             <w:rPr>
@@ -1912,6 +1912,87 @@
             <w:rPr>
               <w:rFonts w:ascii="Times New Roman" w:hAnsi="Times New Roman" w:cs="Times New Roman" w:eastAsia="Times New Roman"/>
             </w:rPr>
+            <w:t xml:space="preserve">Bảng 4.5. Các phiên bản đã thử trên UJIIndoorLoc (mỗi phiên bản chọn trên dev rồi chấm tập kiểm tra một lần)</w:t>
+          </w:r>
+          <w:r>
+            <w:rPr>
+              <w:rFonts w:ascii="Times New Roman" w:hAnsi="Times New Roman" w:cs="Times New Roman" w:eastAsia="Times New Roman"/>
+            </w:rPr>
+            <w:tab/>
+          </w:r>
+          <w:r>
+            <w:rPr>
+              <w:rFonts w:ascii="Times New Roman" w:hAnsi="Times New Roman" w:cs="Times New Roman" w:eastAsia="Times New Roman"/>
+            </w:rPr>
+            <w:t>24</w:t>
+          </w:r>
+        </w:p>
+        <w:p>
+          <w:pPr>
+            <w:tabs>
+              <w:tab w:val="right" w:leader="dot" w:pos="9071"/>
+            </w:tabs>
+            <w:spacing w:before="0" w:after="60" w:line="300" w:lineRule="auto"/>
+            <w:ind w:left="0"/>
+          </w:pPr>
+          <w:r>
+            <w:rPr>
+              <w:rFonts w:ascii="Times New Roman" w:hAnsi="Times New Roman" w:cs="Times New Roman" w:eastAsia="Times New Roman"/>
+            </w:rPr>
+            <w:t xml:space="preserve">Bảng 4.6. Sai số trung bình (m) của hệ thống chỉ dùng HUIM và các hệ thống tham chiếu dùng k-NN</w:t>
+          </w:r>
+          <w:r>
+            <w:rPr>
+              <w:rFonts w:ascii="Times New Roman" w:hAnsi="Times New Roman" w:cs="Times New Roman" w:eastAsia="Times New Roman"/>
+            </w:rPr>
+            <w:tab/>
+          </w:r>
+          <w:r>
+            <w:rPr>
+              <w:rFonts w:ascii="Times New Roman" w:hAnsi="Times New Roman" w:cs="Times New Roman" w:eastAsia="Times New Roman"/>
+            </w:rPr>
+            <w:t>24</w:t>
+          </w:r>
+        </w:p>
+        <w:p>
+          <w:pPr>
+            <w:tabs>
+              <w:tab w:val="right" w:leader="dot" w:pos="9071"/>
+            </w:tabs>
+            <w:spacing w:before="0" w:after="60" w:line="300" w:lineRule="auto"/>
+            <w:ind w:left="0"/>
+          </w:pPr>
+          <w:r>
+            <w:rPr>
+              <w:rFonts w:ascii="Times New Roman" w:hAnsi="Times New Roman" w:cs="Times New Roman" w:eastAsia="Times New Roman"/>
+            </w:rPr>
+            <w:t xml:space="preserve">Bảng 4.7. Kết quả kiểm chứng độc lập</w:t>
+          </w:r>
+          <w:r>
+            <w:rPr>
+              <w:rFonts w:ascii="Times New Roman" w:hAnsi="Times New Roman" w:cs="Times New Roman" w:eastAsia="Times New Roman"/>
+            </w:rPr>
+            <w:tab/>
+          </w:r>
+          <w:r>
+            <w:rPr>
+              <w:rFonts w:ascii="Times New Roman" w:hAnsi="Times New Roman" w:cs="Times New Roman" w:eastAsia="Times New Roman"/>
+            </w:rPr>
+            <w:t>25</w:t>
+          </w:r>
+        </w:p>
+        <w:p>
+          <w:pPr>
+            <w:tabs>
+              <w:tab w:val="right" w:leader="dot" w:pos="9071"/>
+            </w:tabs>
+            <w:spacing w:before="0" w:after="60" w:line="300" w:lineRule="auto"/>
+            <w:ind w:left="0"/>
+          </w:pPr>
+          <w:r>
+            <w:rPr>
+              <w:rFonts w:ascii="Times New Roman" w:hAnsi="Times New Roman" w:cs="Times New Roman" w:eastAsia="Times New Roman"/>
+            </w:rPr>
             <w:t xml:space="preserve">Bảng A.1. Nội dung thư mục BAOCAO</w:t>
           </w:r>
           <w:r>
@@ -1924,7 +2005,7 @@
             <w:rPr>
               <w:rFonts w:ascii="Times New Roman" w:hAnsi="Times New Roman" w:cs="Times New Roman" w:eastAsia="Times New Roman"/>
             </w:rPr>
-            <w:t>26</w:t>
+            <w:t>30</w:t>
           </w:r>
         </w:p>
         <w:p>
@@ -2780,6 +2861,245 @@
                 <w:szCs w:val="22"/>
               </w:rPr>
               <w:t xml:space="preserve">ngưỡng lợi ích tối thiểu tương đối (% lợi ích của cơ sở dữ liệu)</w:t>
+            </w:r>
+          </w:p>
+        </w:tc>
+      </w:tr>
+      <w:tr>
+        <w:tc>
+          <w:tcPr>
+            <w:tcW w:type="dxa" w:w="1800"/>
+            <w:tcBorders>
+              <w:top w:val="single" w:color="808080" w:sz="4"/>
+              <w:left w:val="single" w:color="808080" w:sz="4"/>
+              <w:bottom w:val="single" w:color="808080" w:sz="4"/>
+              <w:right w:val="single" w:color="808080" w:sz="4"/>
+            </w:tcBorders>
+            <w:tcMar>
+              <w:top w:type="dxa" w:w="50"/>
+              <w:left w:type="dxa" w:w="90"/>
+              <w:bottom w:type="dxa" w:w="50"/>
+              <w:right w:type="dxa" w:w="90"/>
+            </w:tcMar>
+            <w:vAlign w:val="center"/>
+          </w:tcPr>
+          <w:p>
+            <w:pPr>
+              <w:jc w:val="left"/>
+            </w:pPr>
+            <w:r>
+              <w:rPr>
+                <w:rFonts w:ascii="Times New Roman" w:cs="Times New Roman" w:eastAsia="Times New Roman" w:hAnsi="Times New Roman"/>
+                <w:b w:val="false"/>
+                <w:bCs w:val="false"/>
+                <w:sz w:val="22"/>
+                <w:szCs w:val="22"/>
+              </w:rPr>
+              <w:t xml:space="preserve">Ô ứng viên</w:t>
+            </w:r>
+          </w:p>
+        </w:tc>
+        <w:tc>
+          <w:tcPr>
+            <w:tcW w:type="dxa" w:w="7200"/>
+            <w:tcBorders>
+              <w:top w:val="single" w:color="808080" w:sz="4"/>
+              <w:left w:val="single" w:color="808080" w:sz="4"/>
+              <w:bottom w:val="single" w:color="808080" w:sz="4"/>
+              <w:right w:val="single" w:color="808080" w:sz="4"/>
+            </w:tcBorders>
+            <w:tcMar>
+              <w:top w:type="dxa" w:w="50"/>
+              <w:left w:type="dxa" w:w="90"/>
+              <w:bottom w:type="dxa" w:w="50"/>
+              <w:right w:type="dxa" w:w="90"/>
+            </w:tcMar>
+            <w:vAlign w:val="center"/>
+          </w:tcPr>
+          <w:p>
+            <w:pPr>
+              <w:jc w:val="left"/>
+            </w:pPr>
+            <w:r>
+              <w:rPr>
+                <w:rFonts w:ascii="Times New Roman" w:cs="Times New Roman" w:eastAsia="Times New Roman" w:hAnsi="Times New Roman"/>
+                <w:b w:val="false"/>
+                <w:bCs w:val="false"/>
+                <w:sz w:val="22"/>
+                <w:szCs w:val="22"/>
+              </w:rPr>
+              <w:t xml:space="preserve">một trong K ô có điểm HUI cao nhất của tầng đã chọn, được xếp hạng lại ở Bước 8</w:t>
+            </w:r>
+          </w:p>
+        </w:tc>
+      </w:tr>
+      <w:tr>
+        <w:tc>
+          <w:tcPr>
+            <w:tcW w:type="dxa" w:w="1800"/>
+            <w:tcBorders>
+              <w:top w:val="single" w:color="808080" w:sz="4"/>
+              <w:left w:val="single" w:color="808080" w:sz="4"/>
+              <w:bottom w:val="single" w:color="808080" w:sz="4"/>
+              <w:right w:val="single" w:color="808080" w:sz="4"/>
+            </w:tcBorders>
+            <w:tcMar>
+              <w:top w:type="dxa" w:w="50"/>
+              <w:left w:type="dxa" w:w="90"/>
+              <w:bottom w:type="dxa" w:w="50"/>
+              <w:right w:type="dxa" w:w="90"/>
+            </w:tcMar>
+            <w:vAlign w:val="center"/>
+          </w:tcPr>
+          <w:p>
+            <w:pPr>
+              <w:jc w:val="left"/>
+            </w:pPr>
+            <w:r>
+              <w:rPr>
+                <w:rFonts w:ascii="Times New Roman" w:cs="Times New Roman" w:eastAsia="Times New Roman" w:hAnsi="Times New Roman"/>
+                <w:b w:val="false"/>
+                <w:bCs w:val="false"/>
+                <w:i/>
+                <w:iCs/>
+                <w:sz w:val="22"/>
+                <w:szCs w:val="22"/>
+              </w:rPr>
+              <w:t xml:space="preserve">q</w:t>
+            </w:r>
+            <w:r>
+              <w:rPr>
+                <w:rFonts w:ascii="Times New Roman" w:cs="Times New Roman" w:eastAsia="Times New Roman" w:hAnsi="Times New Roman"/>
+                <w:b w:val="false"/>
+                <w:bCs w:val="false"/>
+                <w:sz w:val="22"/>
+                <w:szCs w:val="22"/>
+              </w:rPr>
+              <w:t xml:space="preserve">̂</w:t>
+            </w:r>
+            <w:r>
+              <w:rPr>
+                <w:rFonts w:ascii="Times New Roman" w:cs="Times New Roman" w:eastAsia="Times New Roman" w:hAnsi="Times New Roman"/>
+                <w:b w:val="false"/>
+                <w:bCs w:val="false"/>
+                <w:i/>
+                <w:iCs/>
+                <w:sz w:val="22"/>
+                <w:szCs w:val="22"/>
+                <w:vertAlign w:val="subscript"/>
+              </w:rPr>
+              <w:t xml:space="preserve">c</w:t>
+            </w:r>
+            <w:r>
+              <w:rPr>
+                <w:rFonts w:ascii="Times New Roman" w:cs="Times New Roman" w:eastAsia="Times New Roman" w:hAnsi="Times New Roman"/>
+                <w:b w:val="false"/>
+                <w:bCs w:val="false"/>
+                <w:sz w:val="22"/>
+                <w:szCs w:val="22"/>
+              </w:rPr>
+              <w:t xml:space="preserve">(i)</w:t>
+            </w:r>
+          </w:p>
+        </w:tc>
+        <w:tc>
+          <w:tcPr>
+            <w:tcW w:type="dxa" w:w="7200"/>
+            <w:tcBorders>
+              <w:top w:val="single" w:color="808080" w:sz="4"/>
+              <w:left w:val="single" w:color="808080" w:sz="4"/>
+              <w:bottom w:val="single" w:color="808080" w:sz="4"/>
+              <w:right w:val="single" w:color="808080" w:sz="4"/>
+            </w:tcBorders>
+            <w:tcMar>
+              <w:top w:type="dxa" w:w="50"/>
+              <w:left w:type="dxa" w:w="90"/>
+              <w:bottom w:type="dxa" w:w="50"/>
+              <w:right w:type="dxa" w:w="90"/>
+            </w:tcMar>
+            <w:vAlign w:val="center"/>
+          </w:tcPr>
+          <w:p>
+            <w:pPr>
+              <w:jc w:val="left"/>
+            </w:pPr>
+            <w:r>
+              <w:rPr>
+                <w:rFonts w:ascii="Times New Roman" w:cs="Times New Roman" w:eastAsia="Times New Roman" w:hAnsi="Times New Roman"/>
+                <w:b w:val="false"/>
+                <w:bCs w:val="false"/>
+                <w:sz w:val="22"/>
+                <w:szCs w:val="22"/>
+              </w:rPr>
+              <w:t xml:space="preserve">cường độ ước lượng của AP i tại ô c, suy ra từ các HUI của ô (hồ sơ cường độ)</w:t>
+            </w:r>
+          </w:p>
+        </w:tc>
+      </w:tr>
+      <w:tr>
+        <w:tc>
+          <w:tcPr>
+            <w:tcW w:type="dxa" w:w="1800"/>
+            <w:tcBorders>
+              <w:top w:val="single" w:color="808080" w:sz="4"/>
+              <w:left w:val="single" w:color="808080" w:sz="4"/>
+              <w:bottom w:val="single" w:color="808080" w:sz="4"/>
+              <w:right w:val="single" w:color="808080" w:sz="4"/>
+            </w:tcBorders>
+            <w:tcMar>
+              <w:top w:type="dxa" w:w="50"/>
+              <w:left w:type="dxa" w:w="90"/>
+              <w:bottom w:type="dxa" w:w="50"/>
+              <w:right w:type="dxa" w:w="90"/>
+            </w:tcMar>
+            <w:vAlign w:val="center"/>
+          </w:tcPr>
+          <w:p>
+            <w:pPr>
+              <w:jc w:val="left"/>
+            </w:pPr>
+            <w:r>
+              <w:rPr>
+                <w:rFonts w:ascii="Times New Roman" w:cs="Times New Roman" w:eastAsia="Times New Roman" w:hAnsi="Times New Roman"/>
+                <w:b w:val="false"/>
+                <w:bCs w:val="false"/>
+                <w:sz w:val="22"/>
+                <w:szCs w:val="22"/>
+              </w:rPr>
+              <w:t xml:space="preserve">GBM</w:t>
+            </w:r>
+          </w:p>
+        </w:tc>
+        <w:tc>
+          <w:tcPr>
+            <w:tcW w:type="dxa" w:w="7200"/>
+            <w:tcBorders>
+              <w:top w:val="single" w:color="808080" w:sz="4"/>
+              <w:left w:val="single" w:color="808080" w:sz="4"/>
+              <w:bottom w:val="single" w:color="808080" w:sz="4"/>
+              <w:right w:val="single" w:color="808080" w:sz="4"/>
+            </w:tcBorders>
+            <w:tcMar>
+              <w:top w:type="dxa" w:w="50"/>
+              <w:left w:type="dxa" w:w="90"/>
+              <w:bottom w:type="dxa" w:w="50"/>
+              <w:right w:type="dxa" w:w="90"/>
+            </w:tcMar>
+            <w:vAlign w:val="center"/>
+          </w:tcPr>
+          <w:p>
+            <w:pPr>
+              <w:jc w:val="left"/>
+            </w:pPr>
+            <w:r>
+              <w:rPr>
+                <w:rFonts w:ascii="Times New Roman" w:cs="Times New Roman" w:eastAsia="Times New Roman" w:hAnsi="Times New Roman"/>
+                <w:b w:val="false"/>
+                <w:bCs w:val="false"/>
+                <w:sz w:val="22"/>
+                <w:szCs w:val="22"/>
+              </w:rPr>
+              <w:t xml:space="preserve">Gradient Boosting Machine — mô hình hồi quy cây tăng cường, dùng ở Bước 8</w:t>
             </w:r>
           </w:p>
         </w:tc>
@@ -6398,7 +6718,7 @@
           <wp:inline distT="0" distB="0" distL="0" distR="0">
             <wp:extent cx="5715000" cy="2990850"/>
             <wp:effectExtent t="0" r="0" b="0" l="0"/>
-            <wp:docPr id="1" name="d02_buoc1_utility.png" descr="Bước 1 trên một vân tay thật (dòng 729 của validationData)" title="Bước 1 trên một vân tay thật (dòng 729 của validationData)"/>
+            <wp:docPr id="1" name="d02_buoc1_utility.png" descr="Bước 1 trên một vân tay thật (dòng 573 của validationData)" title="Bước 1 trên một vân tay thật (dòng 573 của validationData)"/>
             <wp:cNvGraphicFramePr>
               <a:graphicFrameLocks xmlns:a="http://schemas.openxmlformats.org/drawingml/2006/main" noChangeAspect="1"/>
             </wp:cNvGraphicFramePr>
@@ -6450,7 +6770,7 @@
         <w:rPr>
           <w:rFonts w:ascii="Times New Roman" w:cs="Times New Roman" w:eastAsia="Times New Roman" w:hAnsi="Times New Roman"/>
         </w:rPr>
-        <w:t xml:space="preserve">Bước 1 trên một vân tay thật (dòng 729 của validationData)</w:t>
+        <w:t xml:space="preserve">Bước 1 trên một vân tay thật (dòng 573 của validationData)</w:t>
       </w:r>
     </w:p>
     <w:p>
@@ -9010,7 +9330,7 @@
         <w:rPr>
           <w:rFonts w:ascii="Times New Roman" w:cs="Times New Roman" w:eastAsia="Times New Roman" w:hAnsi="Times New Roman"/>
         </w:rPr>
-        <w:t xml:space="preserve">3.7. Bước 7 — Ước lượng toạ độ</w:t>
+        <w:t xml:space="preserve">3.7. Bước 7 — Ô ứng viên và ước lượng ban đầu</w:t>
       </w:r>
     </w:p>
     <w:p>
@@ -9023,7 +9343,30 @@
         <w:rPr>
           <w:rFonts w:ascii="Times New Roman" w:cs="Times New Roman" w:eastAsia="Times New Roman" w:hAnsi="Times New Roman"/>
         </w:rPr>
-        <w:t xml:space="preserve">Toạ độ là trọng tâm có trọng số của m ô có điểm cao nhất trong tầng đã chọn; số mũ p điều chỉnh độ tập trung của trọng số:</w:t>
+        <w:t xml:space="preserve">K = 30 ô có điểm </w:t>
+      </w:r>
+      <w:r>
+        <w:rPr>
+          <w:rFonts w:ascii="Times New Roman" w:cs="Times New Roman" w:eastAsia="Times New Roman" w:hAnsi="Times New Roman"/>
+          <w:i/>
+          <w:iCs/>
+        </w:rPr>
+        <w:t xml:space="preserve">S</w:t>
+      </w:r>
+      <w:r>
+        <w:rPr>
+          <w:rFonts w:ascii="Times New Roman" w:cs="Times New Roman" w:eastAsia="Times New Roman" w:hAnsi="Times New Roman"/>
+          <w:i/>
+          <w:iCs/>
+          <w:vertAlign w:val="subscript"/>
+        </w:rPr>
+        <w:t xml:space="preserve">c</w:t>
+      </w:r>
+      <w:r>
+        <w:rPr>
+          <w:rFonts w:ascii="Times New Roman" w:cs="Times New Roman" w:eastAsia="Times New Roman" w:hAnsi="Times New Roman"/>
+        </w:rPr>
+        <w:t xml:space="preserve"> cao nhất trong tầng đã chọn được giữ làm ô ứng viên cho Bước 8. Ước lượng ban đầu là trọng tâm có trọng số của m = 12 ô tốt nhất; số mũ p = 8 điều chỉnh độ tập trung của trọng số:</w:t>
       </w:r>
     </w:p>
     <w:tbl>
@@ -9304,7 +9647,7 @@
         <w:rPr>
           <w:rFonts w:ascii="Times New Roman" w:cs="Times New Roman" w:eastAsia="Times New Roman" w:hAnsi="Times New Roman"/>
         </w:rPr>
-        <w:t xml:space="preserve">Bước cuối có hình thức giống bước tổng hợp của k-NN có trọng số, nhưng điểm khác căn bản là các ô được chọn và trọng số của chúng hoàn toàn do điểm khớp HUI quyết định; không có khoảng cách nào giữa vân tay truy vấn và vân tay huấn luyện được tính.</w:t>
+        <w:t xml:space="preserve">Ước lượng ban đầu chính là đầu ra của phiên bản v4 (mục 4.4). Phân tích v4 trên tập kiểm tra UJIIndoorLoc cho thấy trong 12 ô được chọn, ô gần vị trí thật nhất cách trung bình 2,40 m, trong khi ô có điểm cao nhất cách 8,82 m: tập ứng viên đúng vùng nhưng một điểm khớp duy nhất không sắp được các ô lân cận theo đúng thứ tự. Bước 8 giải quyết việc này.</w:t>
       </w:r>
     </w:p>
     <w:p>
@@ -9316,9 +9659,9 @@
       <w:r>
         <w:drawing>
           <wp:inline distT="0" distB="0" distL="0" distR="0">
-            <wp:extent cx="5715000" cy="4067175"/>
+            <wp:extent cx="5715000" cy="4086225"/>
             <wp:effectExtent t="0" r="0" b="0" l="0"/>
-            <wp:docPr id="1" name="d08_buoc7_toa_do.png" descr="Toạ độ ước lượng của vân tay ví dụ từ m ô tốt nhất" title="Toạ độ ước lượng của vân tay ví dụ từ m ô tốt nhất"/>
+            <wp:docPr id="1" name="d08_buoc7_toa_do.png" descr="Ô ứng viên của tầng đã chọn và ước lượng ban đầu của vân tay ví dụ" title="Ô ứng viên của tầng đã chọn và ước lượng ban đầu của vân tay ví dụ"/>
             <wp:cNvGraphicFramePr>
               <a:graphicFrameLocks xmlns:a="http://schemas.openxmlformats.org/drawingml/2006/main" noChangeAspect="1"/>
             </wp:cNvGraphicFramePr>
@@ -9341,7 +9684,7 @@
                   <pic:spPr bwMode="auto">
                     <a:xfrm>
                       <a:off x="0" y="0"/>
-                      <a:ext cx="5715000" cy="4067175"/>
+                      <a:ext cx="5715000" cy="4086225"/>
                     </a:xfrm>
                     <a:prstGeom prst="rect">
                       <a:avLst/>
@@ -9370,7 +9713,7 @@
         <w:rPr>
           <w:rFonts w:ascii="Times New Roman" w:cs="Times New Roman" w:eastAsia="Times New Roman" w:hAnsi="Times New Roman"/>
         </w:rPr>
-        <w:t xml:space="preserve">Toạ độ ước lượng của vân tay ví dụ từ m ô tốt nhất</w:t>
+        <w:t xml:space="preserve">Ô ứng viên của tầng đã chọn và ước lượng ban đầu của vân tay ví dụ</w:t>
       </w:r>
     </w:p>
     <w:p>
@@ -9381,7 +9724,1495 @@
         <w:rPr>
           <w:rFonts w:ascii="Times New Roman" w:cs="Times New Roman" w:eastAsia="Times New Roman" w:hAnsi="Times New Roman"/>
         </w:rPr>
-        <w:t xml:space="preserve">3.8. Thuật toán tổng hợp</w:t>
+        <w:t xml:space="preserve">3.8. Bước 8 — Xếp hạng lại ô ứng viên bằng bằng chứng HUI</w:t>
+      </w:r>
+    </w:p>
+    <w:p>
+      <w:pPr>
+        <w:spacing w:after="120" w:line="360"/>
+        <w:ind w:firstLine="567"/>
+        <w:jc w:val="both"/>
+      </w:pPr>
+      <w:r>
+        <w:rPr>
+          <w:rFonts w:ascii="Times New Roman" w:cs="Times New Roman" w:eastAsia="Times New Roman" w:hAnsi="Times New Roman"/>
+        </w:rPr>
+        <w:t xml:space="preserve">Mỗi ô ứng viên được mô tả bằng một véc-tơ bằng chứng, mọi thành phần đều tính từ tập HUI. Ngoài mô hình chính (lợi ích nội rank), hai mô hình HUI phụ được khai thác bằng chính quy trình Bước 2–4: mô hình </w:t>
+      </w:r>
+      <w:r>
+        <w:rPr>
+          <w:rFonts w:ascii="Times New Roman" w:cs="Times New Roman" w:eastAsia="Times New Roman" w:hAnsi="Times New Roman"/>
+          <w:b/>
+          <w:bCs/>
+        </w:rPr>
+        <w:t xml:space="preserve">mục theo mức cường độ</w:t>
+      </w:r>
+      <w:r>
+        <w:rPr>
+          <w:rFonts w:ascii="Times New Roman" w:cs="Times New Roman" w:eastAsia="Times New Roman" w:hAnsi="Times New Roman"/>
+        </w:rPr>
+        <w:t xml:space="preserve">, trong đó mỗi AP được tách thành L = 3 mục theo mức của lợi ích nội (1 031 786 HUI), và mô hình </w:t>
+      </w:r>
+      <w:r>
+        <w:rPr>
+          <w:rFonts w:ascii="Times New Roman" w:cs="Times New Roman" w:eastAsia="Times New Roman" w:hAnsi="Times New Roman"/>
+          <w:b/>
+          <w:bCs/>
+        </w:rPr>
+        <w:t xml:space="preserve">lợi ích abs</w:t>
+      </w:r>
+      <w:r>
+        <w:rPr>
+          <w:rFonts w:ascii="Times New Roman" w:cs="Times New Roman" w:eastAsia="Times New Roman" w:hAnsi="Times New Roman"/>
+        </w:rPr>
+        <w:t xml:space="preserve"> theo cường độ tuyệt đối (3 062 754 HUI):</w:t>
+      </w:r>
+    </w:p>
+    <w:tbl>
+      <w:tblPr>
+        <w:tblW w:type="dxa" w:w="9071"/>
+        <w:tblBorders>
+          <w:top w:val="none" w:color="FFFFFF" w:sz="0"/>
+          <w:left w:val="none" w:color="FFFFFF" w:sz="0"/>
+          <w:bottom w:val="none" w:color="FFFFFF" w:sz="0"/>
+          <w:right w:val="none" w:color="FFFFFF" w:sz="0"/>
+          <w:insideH w:val="none" w:color="FFFFFF" w:sz="0"/>
+          <w:insideV w:val="none" w:color="FFFFFF" w:sz="0"/>
+        </w:tblBorders>
+      </w:tblPr>
+      <w:tblGrid>
+        <w:gridCol w:w="1000"/>
+        <w:gridCol w:w="7071"/>
+        <w:gridCol w:w="1000"/>
+      </w:tblGrid>
+      <w:tr>
+        <w:trPr>
+          <w:cantSplit/>
+        </w:trPr>
+        <w:tc>
+          <w:tcPr>
+            <w:tcW w:type="dxa" w:w="1000"/>
+            <w:tcBorders>
+              <w:top w:val="none" w:color="FFFFFF" w:sz="0"/>
+              <w:left w:val="none" w:color="FFFFFF" w:sz="0"/>
+              <w:bottom w:val="none" w:color="FFFFFF" w:sz="0"/>
+              <w:right w:val="none" w:color="FFFFFF" w:sz="0"/>
+            </w:tcBorders>
+            <w:tcMar>
+              <w:top w:type="dxa" w:w="40"/>
+              <w:left w:type="dxa" w:w="0"/>
+              <w:bottom w:type="dxa" w:w="40"/>
+              <w:right w:type="dxa" w:w="0"/>
+            </w:tcMar>
+            <w:vAlign w:val="center"/>
+          </w:tcPr>
+          <w:p>
+            <w:pPr>
+              <w:spacing w:after="60" w:before="60"/>
+              <w:jc w:val="left"/>
+            </w:pPr>
+          </w:p>
+        </w:tc>
+        <w:tc>
+          <w:tcPr>
+            <w:tcW w:type="dxa" w:w="7071"/>
+            <w:tcBorders>
+              <w:top w:val="none" w:color="FFFFFF" w:sz="0"/>
+              <w:left w:val="none" w:color="FFFFFF" w:sz="0"/>
+              <w:bottom w:val="none" w:color="FFFFFF" w:sz="0"/>
+              <w:right w:val="none" w:color="FFFFFF" w:sz="0"/>
+            </w:tcBorders>
+            <w:tcMar>
+              <w:top w:type="dxa" w:w="40"/>
+              <w:left w:type="dxa" w:w="0"/>
+              <w:bottom w:type="dxa" w:w="40"/>
+              <w:right w:type="dxa" w:w="0"/>
+            </w:tcMar>
+            <w:vAlign w:val="center"/>
+          </w:tcPr>
+          <w:p>
+            <w:pPr>
+              <w:spacing w:after="60" w:before="60"/>
+              <w:jc w:val="center"/>
+            </w:pPr>
+            <m:oMath>
+              <m:r>
+                <m:t>i</m:t>
+              </m:r>
+              <m:r>
+                <m:t> ↦ </m:t>
+              </m:r>
+              <m:d>
+                <m:dPr/>
+                <m:e>
+                  <m:r>
+                    <m:t>i,ℓ</m:t>
+                  </m:r>
+                </m:e>
+              </m:d>
+              <m:r>
+                <m:t>,   </m:t>
+              </m:r>
+              <m:r>
+                <m:t>ℓ</m:t>
+              </m:r>
+              <m:r>
+                <m:t>=</m:t>
+              </m:r>
+              <m:r>
+                <m:rPr>
+                  <m:sty m:val="p"/>
+                </m:rPr>
+                <m:t>min</m:t>
+              </m:r>
+              <m:d>
+                <m:dPr/>
+                <m:e>
+                  <m:r>
+                    <m:t>L−1, </m:t>
+                  </m:r>
+                  <m:d>
+                    <m:dPr>
+                      <m:begChr m:val="⌊"/>
+                      <m:endChr m:val="⌋"/>
+                    </m:dPr>
+                    <m:e>
+                      <m:f>
+                        <m:num>
+                          <m:d>
+                            <m:dPr/>
+                            <m:e>
+                              <m:r>
+                                <m:t>q</m:t>
+                              </m:r>
+                              <m:d>
+                                <m:dPr/>
+                                <m:e>
+                                  <m:r>
+                                    <m:t>i,T</m:t>
+                                  </m:r>
+                                </m:e>
+                              </m:d>
+                              <m:r>
+                                <m:t>−1</m:t>
+                              </m:r>
+                            </m:e>
+                          </m:d>
+                          <m:r>
+                            <m:t>·L</m:t>
+                          </m:r>
+                        </m:num>
+                        <m:den>
+                          <m:r>
+                            <m:t>100</m:t>
+                          </m:r>
+                        </m:den>
+                      </m:f>
+                    </m:e>
+                  </m:d>
+                </m:e>
+              </m:d>
+            </m:oMath>
+          </w:p>
+        </w:tc>
+        <w:tc>
+          <w:tcPr>
+            <w:tcW w:type="dxa" w:w="1000"/>
+            <w:tcBorders>
+              <w:top w:val="none" w:color="FFFFFF" w:sz="0"/>
+              <w:left w:val="none" w:color="FFFFFF" w:sz="0"/>
+              <w:bottom w:val="none" w:color="FFFFFF" w:sz="0"/>
+              <w:right w:val="none" w:color="FFFFFF" w:sz="0"/>
+            </w:tcBorders>
+            <w:tcMar>
+              <w:top w:type="dxa" w:w="40"/>
+              <w:left w:type="dxa" w:w="0"/>
+              <w:bottom w:type="dxa" w:w="40"/>
+              <w:right w:type="dxa" w:w="0"/>
+            </w:tcMar>
+            <w:vAlign w:val="center"/>
+          </w:tcPr>
+          <w:p>
+            <w:pPr>
+              <w:spacing w:after="60" w:before="60"/>
+              <w:jc w:val="right"/>
+            </w:pPr>
+            <w:r>
+              <w:rPr>
+                <w:rFonts w:ascii="Times New Roman" w:cs="Times New Roman" w:eastAsia="Times New Roman" w:hAnsi="Times New Roman"/>
+              </w:rPr>
+              <w:t xml:space="preserve">(3.13)</w:t>
+            </w:r>
+          </w:p>
+        </w:tc>
+      </w:tr>
+    </w:tbl>
+    <w:p>
+      <w:pPr>
+        <w:spacing w:after="120" w:line="360"/>
+        <w:ind w:firstLine="567"/>
+        <w:jc w:val="both"/>
+      </w:pPr>
+      <w:r>
+        <w:rPr>
+          <w:rFonts w:ascii="Times New Roman" w:cs="Times New Roman" w:eastAsia="Times New Roman" w:hAnsi="Times New Roman"/>
+        </w:rPr>
+        <w:t xml:space="preserve">Từ HUI của mỗi ô có thể suy ra một hồ sơ cường độ: khối lượng HUI đặt trên AP i và cường độ ước lượng của AP i tại ô, với w(X) và </w:t>
+      </w:r>
+      <w:r>
+        <w:rPr>
+          <w:rFonts w:ascii="Times New Roman" w:cs="Times New Roman" w:eastAsia="Times New Roman" w:hAnsi="Times New Roman"/>
+          <w:i/>
+          <w:iCs/>
+        </w:rPr>
+        <w:t xml:space="preserve">q</w:t>
+      </w:r>
+      <w:r>
+        <w:rPr>
+          <w:rFonts w:ascii="Times New Roman" w:cs="Times New Roman" w:eastAsia="Times New Roman" w:hAnsi="Times New Roman"/>
+        </w:rPr>
+        <w:t xml:space="preserve">̄</w:t>
+      </w:r>
+      <w:r>
+        <w:rPr>
+          <w:rFonts w:ascii="Times New Roman" w:cs="Times New Roman" w:eastAsia="Times New Roman" w:hAnsi="Times New Roman"/>
+          <w:i/>
+          <w:iCs/>
+          <w:vertAlign w:val="subscript"/>
+        </w:rPr>
+        <w:t xml:space="preserve">c</w:t>
+      </w:r>
+      <w:r>
+        <w:rPr>
+          <w:rFonts w:ascii="Times New Roman" w:cs="Times New Roman" w:eastAsia="Times New Roman" w:hAnsi="Times New Roman"/>
+        </w:rPr>
+        <w:t xml:space="preserve">(X) như ở (3.5)–(3.8):</w:t>
+      </w:r>
+    </w:p>
+    <w:tbl>
+      <w:tblPr>
+        <w:tblW w:type="dxa" w:w="9071"/>
+        <w:tblBorders>
+          <w:top w:val="none" w:color="FFFFFF" w:sz="0"/>
+          <w:left w:val="none" w:color="FFFFFF" w:sz="0"/>
+          <w:bottom w:val="none" w:color="FFFFFF" w:sz="0"/>
+          <w:right w:val="none" w:color="FFFFFF" w:sz="0"/>
+          <w:insideH w:val="none" w:color="FFFFFF" w:sz="0"/>
+          <w:insideV w:val="none" w:color="FFFFFF" w:sz="0"/>
+        </w:tblBorders>
+      </w:tblPr>
+      <w:tblGrid>
+        <w:gridCol w:w="1000"/>
+        <w:gridCol w:w="7071"/>
+        <w:gridCol w:w="1000"/>
+      </w:tblGrid>
+      <w:tr>
+        <w:trPr>
+          <w:cantSplit/>
+        </w:trPr>
+        <w:tc>
+          <w:tcPr>
+            <w:tcW w:type="dxa" w:w="1000"/>
+            <w:tcBorders>
+              <w:top w:val="none" w:color="FFFFFF" w:sz="0"/>
+              <w:left w:val="none" w:color="FFFFFF" w:sz="0"/>
+              <w:bottom w:val="none" w:color="FFFFFF" w:sz="0"/>
+              <w:right w:val="none" w:color="FFFFFF" w:sz="0"/>
+            </w:tcBorders>
+            <w:tcMar>
+              <w:top w:type="dxa" w:w="40"/>
+              <w:left w:type="dxa" w:w="0"/>
+              <w:bottom w:type="dxa" w:w="40"/>
+              <w:right w:type="dxa" w:w="0"/>
+            </w:tcMar>
+            <w:vAlign w:val="center"/>
+          </w:tcPr>
+          <w:p>
+            <w:pPr>
+              <w:spacing w:after="60" w:before="60"/>
+              <w:jc w:val="left"/>
+            </w:pPr>
+          </w:p>
+        </w:tc>
+        <w:tc>
+          <w:tcPr>
+            <w:tcW w:type="dxa" w:w="7071"/>
+            <w:tcBorders>
+              <w:top w:val="none" w:color="FFFFFF" w:sz="0"/>
+              <w:left w:val="none" w:color="FFFFFF" w:sz="0"/>
+              <w:bottom w:val="none" w:color="FFFFFF" w:sz="0"/>
+              <w:right w:val="none" w:color="FFFFFF" w:sz="0"/>
+            </w:tcBorders>
+            <w:tcMar>
+              <w:top w:type="dxa" w:w="40"/>
+              <w:left w:type="dxa" w:w="0"/>
+              <w:bottom w:type="dxa" w:w="40"/>
+              <w:right w:type="dxa" w:w="0"/>
+            </w:tcMar>
+            <w:vAlign w:val="center"/>
+          </w:tcPr>
+          <w:p>
+            <w:pPr>
+              <w:spacing w:after="60" w:before="60"/>
+              <w:jc w:val="center"/>
+            </w:pPr>
+            <m:oMath>
+              <m:sSub>
+                <m:sSubPr/>
+                <m:e>
+                  <m:r>
+                    <m:t>m</m:t>
+                  </m:r>
+                </m:e>
+                <m:sub>
+                  <m:r>
+                    <m:t>c</m:t>
+                  </m:r>
+                </m:sub>
+              </m:sSub>
+              <m:d>
+                <m:dPr/>
+                <m:e>
+                  <m:r>
+                    <m:t>i</m:t>
+                  </m:r>
+                </m:e>
+              </m:d>
+              <m:r>
+                <m:t>∝</m:t>
+              </m:r>
+              <m:nary>
+                <m:naryPr>
+                  <m:chr m:val="∑"/>
+                  <m:limLoc m:val="undOvr"/>
+                  <m:supHide m:val="1"/>
+                </m:naryPr>
+                <m:sub>
+                  <m:r>
+                    <m:t>X∈</m:t>
+                  </m:r>
+                  <m:sSub>
+                    <m:sSubPr/>
+                    <m:e>
+                      <m:r>
+                        <m:rPr>
+                          <m:sty m:val="p"/>
+                        </m:rPr>
+                        <m:t>HUI</m:t>
+                      </m:r>
+                    </m:e>
+                    <m:sub>
+                      <m:r>
+                        <m:t>c</m:t>
+                      </m:r>
+                    </m:sub>
+                  </m:sSub>
+                  <m:r>
+                    <m:t>, i∈X</m:t>
+                  </m:r>
+                </m:sub>
+                <m:sup/>
+                <m:e>
+                  <m:f>
+                    <m:num>
+                      <m:r>
+                        <m:t>w</m:t>
+                      </m:r>
+                      <m:d>
+                        <m:dPr/>
+                        <m:e>
+                          <m:r>
+                            <m:t>X</m:t>
+                          </m:r>
+                        </m:e>
+                      </m:d>
+                    </m:num>
+                    <m:den>
+                      <m:d>
+                        <m:dPr>
+                          <m:begChr m:val="|"/>
+                          <m:endChr m:val="|"/>
+                        </m:dPr>
+                        <m:e>
+                          <m:r>
+                            <m:t>X</m:t>
+                          </m:r>
+                        </m:e>
+                      </m:d>
+                    </m:den>
+                  </m:f>
+                </m:e>
+              </m:nary>
+              <m:r>
+                <m:t>,   </m:t>
+              </m:r>
+              <m:sSub>
+                <m:sSubPr/>
+                <m:e>
+                  <m:r>
+                    <m:t>q̂</m:t>
+                  </m:r>
+                </m:e>
+                <m:sub>
+                  <m:r>
+                    <m:t>c</m:t>
+                  </m:r>
+                </m:sub>
+              </m:sSub>
+              <m:d>
+                <m:dPr/>
+                <m:e>
+                  <m:r>
+                    <m:t>i</m:t>
+                  </m:r>
+                </m:e>
+              </m:d>
+              <m:r>
+                <m:t>=</m:t>
+              </m:r>
+              <m:f>
+                <m:num>
+                  <m:nary>
+                    <m:naryPr>
+                      <m:chr m:val="∑"/>
+                      <m:limLoc m:val="undOvr"/>
+                      <m:supHide m:val="1"/>
+                    </m:naryPr>
+                    <m:sub>
+                      <m:r>
+                        <m:t>X∋i</m:t>
+                      </m:r>
+                    </m:sub>
+                    <m:sup/>
+                    <m:e>
+                      <m:r>
+                        <m:t>w</m:t>
+                      </m:r>
+                      <m:d>
+                        <m:dPr/>
+                        <m:e>
+                          <m:r>
+                            <m:t>X</m:t>
+                          </m:r>
+                        </m:e>
+                      </m:d>
+                      <m:sSub>
+                        <m:sSubPr/>
+                        <m:e>
+                          <m:r>
+                            <m:t>q̄</m:t>
+                          </m:r>
+                        </m:e>
+                        <m:sub>
+                          <m:r>
+                            <m:t>c</m:t>
+                          </m:r>
+                        </m:sub>
+                      </m:sSub>
+                      <m:d>
+                        <m:dPr/>
+                        <m:e>
+                          <m:r>
+                            <m:t>X</m:t>
+                          </m:r>
+                        </m:e>
+                      </m:d>
+                    </m:e>
+                  </m:nary>
+                </m:num>
+                <m:den>
+                  <m:nary>
+                    <m:naryPr>
+                      <m:chr m:val="∑"/>
+                      <m:limLoc m:val="undOvr"/>
+                      <m:supHide m:val="1"/>
+                    </m:naryPr>
+                    <m:sub>
+                      <m:r>
+                        <m:t>X∋i</m:t>
+                      </m:r>
+                    </m:sub>
+                    <m:sup/>
+                    <m:e>
+                      <m:r>
+                        <m:t>w</m:t>
+                      </m:r>
+                      <m:d>
+                        <m:dPr/>
+                        <m:e>
+                          <m:r>
+                            <m:t>X</m:t>
+                          </m:r>
+                        </m:e>
+                      </m:d>
+                    </m:e>
+                  </m:nary>
+                </m:den>
+              </m:f>
+            </m:oMath>
+          </w:p>
+        </w:tc>
+        <w:tc>
+          <w:tcPr>
+            <w:tcW w:type="dxa" w:w="1000"/>
+            <w:tcBorders>
+              <w:top w:val="none" w:color="FFFFFF" w:sz="0"/>
+              <w:left w:val="none" w:color="FFFFFF" w:sz="0"/>
+              <w:bottom w:val="none" w:color="FFFFFF" w:sz="0"/>
+              <w:right w:val="none" w:color="FFFFFF" w:sz="0"/>
+            </w:tcBorders>
+            <w:tcMar>
+              <w:top w:type="dxa" w:w="40"/>
+              <w:left w:type="dxa" w:w="0"/>
+              <w:bottom w:type="dxa" w:w="40"/>
+              <w:right w:type="dxa" w:w="0"/>
+            </w:tcMar>
+            <w:vAlign w:val="center"/>
+          </w:tcPr>
+          <w:p>
+            <w:pPr>
+              <w:spacing w:after="60" w:before="60"/>
+              <w:jc w:val="right"/>
+            </w:pPr>
+            <w:r>
+              <w:rPr>
+                <w:rFonts w:ascii="Times New Roman" w:cs="Times New Roman" w:eastAsia="Times New Roman" w:hAnsi="Times New Roman"/>
+              </w:rPr>
+              <w:t xml:space="preserve">(3.14)</w:t>
+            </w:r>
+          </w:p>
+        </w:tc>
+      </w:tr>
+    </w:tbl>
+    <w:tbl>
+      <w:tblPr>
+        <w:tblW w:type="dxa" w:w="9071"/>
+        <w:tblBorders>
+          <w:top w:val="none" w:color="FFFFFF" w:sz="0"/>
+          <w:left w:val="none" w:color="FFFFFF" w:sz="0"/>
+          <w:bottom w:val="none" w:color="FFFFFF" w:sz="0"/>
+          <w:right w:val="none" w:color="FFFFFF" w:sz="0"/>
+          <w:insideH w:val="none" w:color="FFFFFF" w:sz="0"/>
+          <w:insideV w:val="none" w:color="FFFFFF" w:sz="0"/>
+        </w:tblBorders>
+      </w:tblPr>
+      <w:tblGrid>
+        <w:gridCol w:w="1000"/>
+        <w:gridCol w:w="7071"/>
+        <w:gridCol w:w="1000"/>
+      </w:tblGrid>
+      <w:tr>
+        <w:trPr>
+          <w:cantSplit/>
+        </w:trPr>
+        <w:tc>
+          <w:tcPr>
+            <w:tcW w:type="dxa" w:w="1000"/>
+            <w:tcBorders>
+              <w:top w:val="none" w:color="FFFFFF" w:sz="0"/>
+              <w:left w:val="none" w:color="FFFFFF" w:sz="0"/>
+              <w:bottom w:val="none" w:color="FFFFFF" w:sz="0"/>
+              <w:right w:val="none" w:color="FFFFFF" w:sz="0"/>
+            </w:tcBorders>
+            <w:tcMar>
+              <w:top w:type="dxa" w:w="40"/>
+              <w:left w:type="dxa" w:w="0"/>
+              <w:bottom w:type="dxa" w:w="40"/>
+              <w:right w:type="dxa" w:w="0"/>
+            </w:tcMar>
+            <w:vAlign w:val="center"/>
+          </w:tcPr>
+          <w:p>
+            <w:pPr>
+              <w:spacing w:after="60" w:before="60"/>
+              <w:jc w:val="left"/>
+            </w:pPr>
+          </w:p>
+        </w:tc>
+        <w:tc>
+          <w:tcPr>
+            <w:tcW w:type="dxa" w:w="7071"/>
+            <w:tcBorders>
+              <w:top w:val="none" w:color="FFFFFF" w:sz="0"/>
+              <w:left w:val="none" w:color="FFFFFF" w:sz="0"/>
+              <w:bottom w:val="none" w:color="FFFFFF" w:sz="0"/>
+              <w:right w:val="none" w:color="FFFFFF" w:sz="0"/>
+            </w:tcBorders>
+            <w:tcMar>
+              <w:top w:type="dxa" w:w="40"/>
+              <w:left w:type="dxa" w:w="0"/>
+              <w:bottom w:type="dxa" w:w="40"/>
+              <w:right w:type="dxa" w:w="0"/>
+            </w:tcMar>
+            <w:vAlign w:val="center"/>
+          </w:tcPr>
+          <w:p>
+            <w:pPr>
+              <w:spacing w:after="60" w:before="60"/>
+              <w:jc w:val="center"/>
+            </w:pPr>
+            <m:oMath>
+              <m:sSub>
+                <m:sSubPr/>
+                <m:e>
+                  <m:r>
+                    <m:t>R</m:t>
+                  </m:r>
+                </m:e>
+                <m:sub>
+                  <m:r>
+                    <m:t>c</m:t>
+                  </m:r>
+                </m:sub>
+              </m:sSub>
+              <m:d>
+                <m:dPr/>
+                <m:e>
+                  <m:r>
+                    <m:t>T</m:t>
+                  </m:r>
+                </m:e>
+              </m:d>
+              <m:r>
+                <m:t>=</m:t>
+              </m:r>
+              <m:nary>
+                <m:naryPr>
+                  <m:chr m:val="∑"/>
+                  <m:limLoc m:val="undOvr"/>
+                  <m:supHide m:val="1"/>
+                </m:naryPr>
+                <m:sub>
+                  <m:r>
+                    <m:t>i∈T</m:t>
+                  </m:r>
+                </m:sub>
+                <m:sup/>
+                <m:e>
+                  <m:sSub>
+                    <m:sSubPr/>
+                    <m:e>
+                      <m:r>
+                        <m:t>m</m:t>
+                      </m:r>
+                    </m:e>
+                    <m:sub>
+                      <m:r>
+                        <m:t>c</m:t>
+                      </m:r>
+                    </m:sub>
+                  </m:sSub>
+                  <m:d>
+                    <m:dPr/>
+                    <m:e>
+                      <m:r>
+                        <m:t>i</m:t>
+                      </m:r>
+                    </m:e>
+                  </m:d>
+                </m:e>
+              </m:nary>
+              <m:r>
+                <m:t>,   </m:t>
+              </m:r>
+              <m:sSub>
+                <m:sSubPr/>
+                <m:e>
+                  <m:r>
+                    <m:rPr>
+                      <m:sty m:val="p"/>
+                    </m:rPr>
+                    <m:t>MAE</m:t>
+                  </m:r>
+                </m:e>
+                <m:sub>
+                  <m:r>
+                    <m:t>c</m:t>
+                  </m:r>
+                </m:sub>
+              </m:sSub>
+              <m:d>
+                <m:dPr/>
+                <m:e>
+                  <m:r>
+                    <m:t>T</m:t>
+                  </m:r>
+                </m:e>
+              </m:d>
+              <m:r>
+                <m:t>=</m:t>
+              </m:r>
+              <m:f>
+                <m:num>
+                  <m:nary>
+                    <m:naryPr>
+                      <m:chr m:val="∑"/>
+                      <m:limLoc m:val="undOvr"/>
+                      <m:supHide m:val="1"/>
+                    </m:naryPr>
+                    <m:sub>
+                      <m:r>
+                        <m:t>i∈T∩</m:t>
+                      </m:r>
+                      <m:sSub>
+                        <m:sSubPr/>
+                        <m:e>
+                          <m:r>
+                            <m:t>I</m:t>
+                          </m:r>
+                        </m:e>
+                        <m:sub>
+                          <m:r>
+                            <m:t>c</m:t>
+                          </m:r>
+                        </m:sub>
+                      </m:sSub>
+                    </m:sub>
+                    <m:sup/>
+                    <m:e>
+                      <m:r>
+                        <m:t>q</m:t>
+                      </m:r>
+                      <m:d>
+                        <m:dPr/>
+                        <m:e>
+                          <m:r>
+                            <m:t>i,T</m:t>
+                          </m:r>
+                        </m:e>
+                      </m:d>
+                      <m:d>
+                        <m:dPr>
+                          <m:begChr m:val="|"/>
+                          <m:endChr m:val="|"/>
+                        </m:dPr>
+                        <m:e>
+                          <m:r>
+                            <m:t>q</m:t>
+                          </m:r>
+                          <m:d>
+                            <m:dPr/>
+                            <m:e>
+                              <m:r>
+                                <m:t>i,T</m:t>
+                              </m:r>
+                            </m:e>
+                          </m:d>
+                          <m:r>
+                            <m:t>−</m:t>
+                          </m:r>
+                          <m:sSub>
+                            <m:sSubPr/>
+                            <m:e>
+                              <m:r>
+                                <m:t>q̂</m:t>
+                              </m:r>
+                            </m:e>
+                            <m:sub>
+                              <m:r>
+                                <m:t>c</m:t>
+                              </m:r>
+                            </m:sub>
+                          </m:sSub>
+                          <m:d>
+                            <m:dPr/>
+                            <m:e>
+                              <m:r>
+                                <m:t>i</m:t>
+                              </m:r>
+                            </m:e>
+                          </m:d>
+                        </m:e>
+                      </m:d>
+                    </m:e>
+                  </m:nary>
+                </m:num>
+                <m:den>
+                  <m:nary>
+                    <m:naryPr>
+                      <m:chr m:val="∑"/>
+                      <m:limLoc m:val="undOvr"/>
+                      <m:supHide m:val="1"/>
+                    </m:naryPr>
+                    <m:sub>
+                      <m:r>
+                        <m:t>i∈T∩</m:t>
+                      </m:r>
+                      <m:sSub>
+                        <m:sSubPr/>
+                        <m:e>
+                          <m:r>
+                            <m:t>I</m:t>
+                          </m:r>
+                        </m:e>
+                        <m:sub>
+                          <m:r>
+                            <m:t>c</m:t>
+                          </m:r>
+                        </m:sub>
+                      </m:sSub>
+                    </m:sub>
+                    <m:sup/>
+                    <m:e>
+                      <m:r>
+                        <m:t>q</m:t>
+                      </m:r>
+                      <m:d>
+                        <m:dPr/>
+                        <m:e>
+                          <m:r>
+                            <m:t>i,T</m:t>
+                          </m:r>
+                        </m:e>
+                      </m:d>
+                    </m:e>
+                  </m:nary>
+                </m:den>
+              </m:f>
+            </m:oMath>
+          </w:p>
+        </w:tc>
+        <w:tc>
+          <w:tcPr>
+            <w:tcW w:type="dxa" w:w="1000"/>
+            <w:tcBorders>
+              <w:top w:val="none" w:color="FFFFFF" w:sz="0"/>
+              <w:left w:val="none" w:color="FFFFFF" w:sz="0"/>
+              <w:bottom w:val="none" w:color="FFFFFF" w:sz="0"/>
+              <w:right w:val="none" w:color="FFFFFF" w:sz="0"/>
+            </w:tcBorders>
+            <w:tcMar>
+              <w:top w:type="dxa" w:w="40"/>
+              <w:left w:type="dxa" w:w="0"/>
+              <w:bottom w:type="dxa" w:w="40"/>
+              <w:right w:type="dxa" w:w="0"/>
+            </w:tcMar>
+            <w:vAlign w:val="center"/>
+          </w:tcPr>
+          <w:p>
+            <w:pPr>
+              <w:spacing w:after="60" w:before="60"/>
+              <w:jc w:val="right"/>
+            </w:pPr>
+            <w:r>
+              <w:rPr>
+                <w:rFonts w:ascii="Times New Roman" w:cs="Times New Roman" w:eastAsia="Times New Roman" w:hAnsi="Times New Roman"/>
+              </w:rPr>
+              <w:t xml:space="preserve">(3.15)</w:t>
+            </w:r>
+          </w:p>
+        </w:tc>
+      </w:tr>
+    </w:tbl>
+    <w:p>
+      <w:pPr>
+        <w:spacing w:after="120" w:line="360"/>
+        <w:ind w:firstLine="567"/>
+        <w:jc w:val="both"/>
+      </w:pPr>
+      <w:r>
+        <w:rPr>
+          <w:rFonts w:ascii="Times New Roman" w:cs="Times New Roman" w:eastAsia="Times New Roman" w:hAnsi="Times New Roman"/>
+          <w:i/>
+          <w:iCs/>
+        </w:rPr>
+        <w:t xml:space="preserve">R</w:t>
+      </w:r>
+      <w:r>
+        <w:rPr>
+          <w:rFonts w:ascii="Times New Roman" w:cs="Times New Roman" w:eastAsia="Times New Roman" w:hAnsi="Times New Roman"/>
+          <w:i/>
+          <w:iCs/>
+          <w:vertAlign w:val="subscript"/>
+        </w:rPr>
+        <w:t xml:space="preserve">c</w:t>
+      </w:r>
+      <w:r>
+        <w:rPr>
+          <w:rFonts w:ascii="Times New Roman" w:cs="Times New Roman" w:eastAsia="Times New Roman" w:hAnsi="Times New Roman"/>
+        </w:rPr>
+        <w:t xml:space="preserve"> là độ phủ ngược (phần khối lượng HUI của ô có mặt trong vân tay), MAE</w:t>
+      </w:r>
+      <w:r>
+        <w:rPr>
+          <w:rFonts w:ascii="Times New Roman" w:cs="Times New Roman" w:eastAsia="Times New Roman" w:hAnsi="Times New Roman"/>
+          <w:i/>
+          <w:iCs/>
+          <w:vertAlign w:val="subscript"/>
+        </w:rPr>
+        <w:t xml:space="preserve">c</w:t>
+      </w:r>
+      <w:r>
+        <w:rPr>
+          <w:rFonts w:ascii="Times New Roman" w:cs="Times New Roman" w:eastAsia="Times New Roman" w:hAnsi="Times New Roman"/>
+        </w:rPr>
+        <w:t xml:space="preserve"> đo độ lệch giữa cường độ của vân tay và hồ sơ cường độ của ô. Véc-tơ bằng chứng φ(T, c) gồm 33 đặc trưng: các điểm </w:t>
+      </w:r>
+      <w:r>
+        <w:rPr>
+          <w:rFonts w:ascii="Times New Roman" w:cs="Times New Roman" w:eastAsia="Times New Roman" w:hAnsi="Times New Roman"/>
+          <w:i/>
+          <w:iCs/>
+        </w:rPr>
+        <w:t xml:space="preserve">P</w:t>
+      </w:r>
+      <w:r>
+        <w:rPr>
+          <w:rFonts w:ascii="Times New Roman" w:cs="Times New Roman" w:eastAsia="Times New Roman" w:hAnsi="Times New Roman"/>
+          <w:i/>
+          <w:iCs/>
+          <w:vertAlign w:val="subscript"/>
+        </w:rPr>
+        <w:t xml:space="preserve">c</w:t>
+      </w:r>
+      <w:r>
+        <w:rPr>
+          <w:rFonts w:ascii="Times New Roman" w:cs="Times New Roman" w:eastAsia="Times New Roman" w:hAnsi="Times New Roman"/>
+        </w:rPr>
+        <w:t xml:space="preserve">, </w:t>
+      </w:r>
+      <w:r>
+        <w:rPr>
+          <w:rFonts w:ascii="Times New Roman" w:cs="Times New Roman" w:eastAsia="Times New Roman" w:hAnsi="Times New Roman"/>
+          <w:i/>
+          <w:iCs/>
+        </w:rPr>
+        <w:t xml:space="preserve">V</w:t>
+      </w:r>
+      <w:r>
+        <w:rPr>
+          <w:rFonts w:ascii="Times New Roman" w:cs="Times New Roman" w:eastAsia="Times New Roman" w:hAnsi="Times New Roman"/>
+          <w:i/>
+          <w:iCs/>
+          <w:vertAlign w:val="subscript"/>
+        </w:rPr>
+        <w:t xml:space="preserve">c</w:t>
+      </w:r>
+      <w:r>
+        <w:rPr>
+          <w:rFonts w:ascii="Times New Roman" w:cs="Times New Roman" w:eastAsia="Times New Roman" w:hAnsi="Times New Roman"/>
+        </w:rPr>
+        <w:t xml:space="preserve">, </w:t>
+      </w:r>
+      <w:r>
+        <w:rPr>
+          <w:rFonts w:ascii="Times New Roman" w:cs="Times New Roman" w:eastAsia="Times New Roman" w:hAnsi="Times New Roman"/>
+          <w:i/>
+          <w:iCs/>
+        </w:rPr>
+        <w:t xml:space="preserve">R</w:t>
+      </w:r>
+      <w:r>
+        <w:rPr>
+          <w:rFonts w:ascii="Times New Roman" w:cs="Times New Roman" w:eastAsia="Times New Roman" w:hAnsi="Times New Roman"/>
+          <w:i/>
+          <w:iCs/>
+          <w:vertAlign w:val="subscript"/>
+        </w:rPr>
+        <w:t xml:space="preserve">c</w:t>
+      </w:r>
+      <w:r>
+        <w:rPr>
+          <w:rFonts w:ascii="Times New Roman" w:cs="Times New Roman" w:eastAsia="Times New Roman" w:hAnsi="Times New Roman"/>
+        </w:rPr>
+        <w:t xml:space="preserve">, </w:t>
+      </w:r>
+      <w:r>
+        <w:rPr>
+          <w:rFonts w:ascii="Times New Roman" w:cs="Times New Roman" w:eastAsia="Times New Roman" w:hAnsi="Times New Roman"/>
+          <w:i/>
+          <w:iCs/>
+        </w:rPr>
+        <w:t xml:space="preserve">S</w:t>
+      </w:r>
+      <w:r>
+        <w:rPr>
+          <w:rFonts w:ascii="Times New Roman" w:cs="Times New Roman" w:eastAsia="Times New Roman" w:hAnsi="Times New Roman"/>
+          <w:i/>
+          <w:iCs/>
+          <w:vertAlign w:val="subscript"/>
+        </w:rPr>
+        <w:t xml:space="preserve">c</w:t>
+      </w:r>
+      <w:r>
+        <w:rPr>
+          <w:rFonts w:ascii="Times New Roman" w:cs="Times New Roman" w:eastAsia="Times New Roman" w:hAnsi="Times New Roman"/>
+        </w:rPr>
+        <w:t xml:space="preserve"> của mô hình rank (kể cả </w:t>
+      </w:r>
+      <w:r>
+        <w:rPr>
+          <w:rFonts w:ascii="Times New Roman" w:cs="Times New Roman" w:eastAsia="Times New Roman" w:hAnsi="Times New Roman"/>
+          <w:i/>
+          <w:iCs/>
+        </w:rPr>
+        <w:t xml:space="preserve">P</w:t>
+      </w:r>
+      <w:r>
+        <w:rPr>
+          <w:rFonts w:ascii="Times New Roman" w:cs="Times New Roman" w:eastAsia="Times New Roman" w:hAnsi="Times New Roman"/>
+          <w:i/>
+          <w:iCs/>
+          <w:vertAlign w:val="subscript"/>
+        </w:rPr>
+        <w:t xml:space="preserve">c</w:t>
+      </w:r>
+      <w:r>
+        <w:rPr>
+          <w:rFonts w:ascii="Times New Roman" w:cs="Times New Roman" w:eastAsia="Times New Roman" w:hAnsi="Times New Roman"/>
+        </w:rPr>
+        <w:t xml:space="preserve"> với trọng số IDF của HUI giữa các ô lân cận), </w:t>
+      </w:r>
+      <w:r>
+        <w:rPr>
+          <w:rFonts w:ascii="Times New Roman" w:cs="Times New Roman" w:eastAsia="Times New Roman" w:hAnsi="Times New Roman"/>
+          <w:i/>
+          <w:iCs/>
+        </w:rPr>
+        <w:t xml:space="preserve">P</w:t>
+      </w:r>
+      <w:r>
+        <w:rPr>
+          <w:rFonts w:ascii="Times New Roman" w:cs="Times New Roman" w:eastAsia="Times New Roman" w:hAnsi="Times New Roman"/>
+          <w:i/>
+          <w:iCs/>
+          <w:vertAlign w:val="subscript"/>
+        </w:rPr>
+        <w:t xml:space="preserve">c</w:t>
+      </w:r>
+      <w:r>
+        <w:rPr>
+          <w:rFonts w:ascii="Times New Roman" w:cs="Times New Roman" w:eastAsia="Times New Roman" w:hAnsi="Times New Roman"/>
+        </w:rPr>
+        <w:t xml:space="preserve">, </w:t>
+      </w:r>
+      <w:r>
+        <w:rPr>
+          <w:rFonts w:ascii="Times New Roman" w:cs="Times New Roman" w:eastAsia="Times New Roman" w:hAnsi="Times New Roman"/>
+          <w:i/>
+          <w:iCs/>
+        </w:rPr>
+        <w:t xml:space="preserve">V</w:t>
+      </w:r>
+      <w:r>
+        <w:rPr>
+          <w:rFonts w:ascii="Times New Roman" w:cs="Times New Roman" w:eastAsia="Times New Roman" w:hAnsi="Times New Roman"/>
+          <w:i/>
+          <w:iCs/>
+          <w:vertAlign w:val="subscript"/>
+        </w:rPr>
+        <w:t xml:space="preserve">c</w:t>
+      </w:r>
+      <w:r>
+        <w:rPr>
+          <w:rFonts w:ascii="Times New Roman" w:cs="Times New Roman" w:eastAsia="Times New Roman" w:hAnsi="Times New Roman"/>
+        </w:rPr>
+        <w:t xml:space="preserve"> và thứ hạng của ô theo hai mô hình phụ, các đại lượng hồ sơ cường độ (MAE, hệ số tương quan, cosin) của mô hình rank, mô hình mức cường độ và mô hình abs, và độ đồng thuận không gian giữa các ứng viên (khoảng cách tới ước lượng ban đầu, tới ô xếp đầu, số ứng viên trong bán kính 5 m). Mỗi đặc trưng được dùng thêm ở dạng so với các ứng viên khác của cùng truy vấn (hiệu với giá trị lớn nhất, chuẩn hoá min–max và thứ hạng).</w:t>
+      </w:r>
+    </w:p>
+    <w:p>
+      <w:pPr>
+        <w:spacing w:after="120" w:line="360"/>
+        <w:ind w:firstLine="567"/>
+        <w:jc w:val="both"/>
+      </w:pPr>
+      <w:r>
+        <w:rPr>
+          <w:rFonts w:ascii="Times New Roman" w:cs="Times New Roman" w:eastAsia="Times New Roman" w:hAnsi="Times New Roman"/>
+        </w:rPr>
+        <w:t xml:space="preserve">Một bộ hồi quy Gradient Boosting [13], [14] học hàm g dự đoán khoảng cách từ tâm ô ứng viên tới vị trí thật, trên dữ liệu chỉ lấy từ các fold dev: với mỗi fold, đặc trưng của các truy vấn dev được tính từ mô hình HUI khai thác trên phần còn lại, nên bộ hồi quy chỉ học từ dữ liệu ngoài fold. Toạ độ cuối là trọng tâm của m = 20 ô có khoảng cách dự đoán nhỏ nhất, với λ = 2 m:</w:t>
+      </w:r>
+    </w:p>
+    <w:tbl>
+      <w:tblPr>
+        <w:tblW w:type="dxa" w:w="9071"/>
+        <w:tblBorders>
+          <w:top w:val="none" w:color="FFFFFF" w:sz="0"/>
+          <w:left w:val="none" w:color="FFFFFF" w:sz="0"/>
+          <w:bottom w:val="none" w:color="FFFFFF" w:sz="0"/>
+          <w:right w:val="none" w:color="FFFFFF" w:sz="0"/>
+          <w:insideH w:val="none" w:color="FFFFFF" w:sz="0"/>
+          <w:insideV w:val="none" w:color="FFFFFF" w:sz="0"/>
+        </w:tblBorders>
+      </w:tblPr>
+      <w:tblGrid>
+        <w:gridCol w:w="1000"/>
+        <w:gridCol w:w="7071"/>
+        <w:gridCol w:w="1000"/>
+      </w:tblGrid>
+      <w:tr>
+        <w:trPr>
+          <w:cantSplit/>
+        </w:trPr>
+        <w:tc>
+          <w:tcPr>
+            <w:tcW w:type="dxa" w:w="1000"/>
+            <w:tcBorders>
+              <w:top w:val="none" w:color="FFFFFF" w:sz="0"/>
+              <w:left w:val="none" w:color="FFFFFF" w:sz="0"/>
+              <w:bottom w:val="none" w:color="FFFFFF" w:sz="0"/>
+              <w:right w:val="none" w:color="FFFFFF" w:sz="0"/>
+            </w:tcBorders>
+            <w:tcMar>
+              <w:top w:type="dxa" w:w="40"/>
+              <w:left w:type="dxa" w:w="0"/>
+              <w:bottom w:type="dxa" w:w="40"/>
+              <w:right w:type="dxa" w:w="0"/>
+            </w:tcMar>
+            <w:vAlign w:val="center"/>
+          </w:tcPr>
+          <w:p>
+            <w:pPr>
+              <w:spacing w:after="60" w:before="60"/>
+              <w:jc w:val="left"/>
+            </w:pPr>
+          </w:p>
+        </w:tc>
+        <w:tc>
+          <w:tcPr>
+            <w:tcW w:type="dxa" w:w="7071"/>
+            <w:tcBorders>
+              <w:top w:val="none" w:color="FFFFFF" w:sz="0"/>
+              <w:left w:val="none" w:color="FFFFFF" w:sz="0"/>
+              <w:bottom w:val="none" w:color="FFFFFF" w:sz="0"/>
+              <w:right w:val="none" w:color="FFFFFF" w:sz="0"/>
+            </w:tcBorders>
+            <w:tcMar>
+              <w:top w:type="dxa" w:w="40"/>
+              <w:left w:type="dxa" w:w="0"/>
+              <w:bottom w:type="dxa" w:w="40"/>
+              <w:right w:type="dxa" w:w="0"/>
+            </w:tcMar>
+            <w:vAlign w:val="center"/>
+          </w:tcPr>
+          <w:p>
+            <w:pPr>
+              <w:spacing w:after="60" w:before="60"/>
+              <w:jc w:val="center"/>
+            </w:pPr>
+            <m:oMath>
+              <m:sSub>
+                <m:sSubPr/>
+                <m:e>
+                  <m:r>
+                    <m:t>d̂</m:t>
+                  </m:r>
+                </m:e>
+                <m:sub>
+                  <m:r>
+                    <m:t>c</m:t>
+                  </m:r>
+                </m:sub>
+              </m:sSub>
+              <m:r>
+                <m:t>=</m:t>
+              </m:r>
+              <m:r>
+                <m:rPr>
+                  <m:sty m:val="p"/>
+                </m:rPr>
+                <m:t>exp</m:t>
+              </m:r>
+              <m:d>
+                <m:dPr/>
+                <m:e>
+                  <m:r>
+                    <m:t>g</m:t>
+                  </m:r>
+                  <m:d>
+                    <m:dPr/>
+                    <m:e>
+                      <m:r>
+                        <m:t>φ</m:t>
+                      </m:r>
+                      <m:d>
+                        <m:dPr/>
+                        <m:e>
+                          <m:r>
+                            <m:t>T,c</m:t>
+                          </m:r>
+                        </m:e>
+                      </m:d>
+                    </m:e>
+                  </m:d>
+                </m:e>
+              </m:d>
+              <m:r>
+                <m:t>−1</m:t>
+              </m:r>
+              <m:r>
+                <m:t>,   </m:t>
+              </m:r>
+              <m:sSub>
+                <m:sSubPr/>
+                <m:e>
+                  <m:r>
+                    <m:t>a</m:t>
+                  </m:r>
+                </m:e>
+                <m:sub>
+                  <m:r>
+                    <m:t>c</m:t>
+                  </m:r>
+                </m:sub>
+              </m:sSub>
+              <m:r>
+                <m:t>∝</m:t>
+              </m:r>
+              <m:r>
+                <m:rPr>
+                  <m:sty m:val="p"/>
+                </m:rPr>
+                <m:t>exp</m:t>
+              </m:r>
+              <m:d>
+                <m:dPr/>
+                <m:e>
+                  <m:r>
+                    <m:t>−</m:t>
+                  </m:r>
+                  <m:f>
+                    <m:num>
+                      <m:sSub>
+                        <m:sSubPr/>
+                        <m:e>
+                          <m:r>
+                            <m:t>d̂</m:t>
+                          </m:r>
+                        </m:e>
+                        <m:sub>
+                          <m:r>
+                            <m:t>c</m:t>
+                          </m:r>
+                        </m:sub>
+                      </m:sSub>
+                      <m:r>
+                        <m:t>−</m:t>
+                      </m:r>
+                      <m:sSub>
+                        <m:sSubPr/>
+                        <m:e>
+                          <m:r>
+                            <m:t>d̂</m:t>
+                          </m:r>
+                        </m:e>
+                        <m:sub>
+                          <m:r>
+                            <m:rPr>
+                              <m:sty m:val="p"/>
+                            </m:rPr>
+                            <m:t>min</m:t>
+                          </m:r>
+                        </m:sub>
+                      </m:sSub>
+                    </m:num>
+                    <m:den>
+                      <m:r>
+                        <m:t>λ</m:t>
+                      </m:r>
+                    </m:den>
+                  </m:f>
+                </m:e>
+              </m:d>
+              <m:r>
+                <m:t>,   </m:t>
+              </m:r>
+              <m:d>
+                <m:dPr/>
+                <m:e>
+                  <m:r>
+                    <m:t>x̂,ŷ</m:t>
+                  </m:r>
+                </m:e>
+              </m:d>
+              <m:r>
+                <m:t>=</m:t>
+              </m:r>
+              <m:nary>
+                <m:naryPr>
+                  <m:chr m:val="∑"/>
+                  <m:limLoc m:val="undOvr"/>
+                  <m:supHide m:val="1"/>
+                </m:naryPr>
+                <m:sub>
+                  <m:r>
+                    <m:t>c</m:t>
+                  </m:r>
+                </m:sub>
+                <m:sup/>
+                <m:e>
+                  <m:sSub>
+                    <m:sSubPr/>
+                    <m:e>
+                      <m:r>
+                        <m:t>a</m:t>
+                      </m:r>
+                    </m:e>
+                    <m:sub>
+                      <m:r>
+                        <m:t>c</m:t>
+                      </m:r>
+                    </m:sub>
+                  </m:sSub>
+                  <m:d>
+                    <m:dPr/>
+                    <m:e>
+                      <m:sSub>
+                        <m:sSubPr/>
+                        <m:e>
+                          <m:r>
+                            <m:t>x</m:t>
+                          </m:r>
+                        </m:e>
+                        <m:sub>
+                          <m:r>
+                            <m:t>c</m:t>
+                          </m:r>
+                        </m:sub>
+                      </m:sSub>
+                      <m:r>
+                        <m:t>,</m:t>
+                      </m:r>
+                      <m:sSub>
+                        <m:sSubPr/>
+                        <m:e>
+                          <m:r>
+                            <m:t>y</m:t>
+                          </m:r>
+                        </m:e>
+                        <m:sub>
+                          <m:r>
+                            <m:t>c</m:t>
+                          </m:r>
+                        </m:sub>
+                      </m:sSub>
+                    </m:e>
+                  </m:d>
+                </m:e>
+              </m:nary>
+            </m:oMath>
+          </w:p>
+        </w:tc>
+        <w:tc>
+          <w:tcPr>
+            <w:tcW w:type="dxa" w:w="1000"/>
+            <w:tcBorders>
+              <w:top w:val="none" w:color="FFFFFF" w:sz="0"/>
+              <w:left w:val="none" w:color="FFFFFF" w:sz="0"/>
+              <w:bottom w:val="none" w:color="FFFFFF" w:sz="0"/>
+              <w:right w:val="none" w:color="FFFFFF" w:sz="0"/>
+            </w:tcBorders>
+            <w:tcMar>
+              <w:top w:type="dxa" w:w="40"/>
+              <w:left w:type="dxa" w:w="0"/>
+              <w:bottom w:type="dxa" w:w="40"/>
+              <w:right w:type="dxa" w:w="0"/>
+            </w:tcMar>
+            <w:vAlign w:val="center"/>
+          </w:tcPr>
+          <w:p>
+            <w:pPr>
+              <w:spacing w:after="60" w:before="60"/>
+              <w:jc w:val="right"/>
+            </w:pPr>
+            <w:r>
+              <w:rPr>
+                <w:rFonts w:ascii="Times New Roman" w:cs="Times New Roman" w:eastAsia="Times New Roman" w:hAnsi="Times New Roman"/>
+              </w:rPr>
+              <w:t xml:space="preserve">(3.16)</w:t>
+            </w:r>
+          </w:p>
+        </w:tc>
+      </w:tr>
+    </w:tbl>
+    <w:p>
+      <w:pPr>
+        <w:spacing w:after="120" w:line="360"/>
+        <w:ind w:firstLine="567"/>
+        <w:jc w:val="both"/>
+      </w:pPr>
+      <w:r>
+        <w:rPr>
+          <w:rFonts w:ascii="Times New Roman" w:cs="Times New Roman" w:eastAsia="Times New Roman" w:hAnsi="Times New Roman"/>
+        </w:rPr>
+        <w:t xml:space="preserve">Bộ hồi quy không nhìn thấy vân tay huấn luyện nào; nó chỉ học cách cân các bằng chứng do HUI tạo ra. Các ô được xét vẫn là các ô có điểm HUI cao nhất, và toạ độ vẫn là tổ hợp lồi của tâm các ô đó. Nếu bỏ HUIM, không còn ô ứng viên lẫn đặc trưng nào để xếp hạng.</w:t>
+      </w:r>
+    </w:p>
+    <w:p>
+      <w:pPr>
+        <w:keepNext/>
+        <w:spacing w:after="60" w:before="120"/>
+        <w:jc w:val="center"/>
+      </w:pPr>
+      <w:r>
+        <w:drawing>
+          <wp:inline distT="0" distB="0" distL="0" distR="0">
+            <wp:extent cx="5715000" cy="2762250"/>
+            <wp:effectExtent t="0" r="0" b="0" l="0"/>
+            <wp:docPr id="1" name="d09_buoc8_xep_hang_lai.png" descr="Bước 8: bằng chứng HUI, bộ hồi quy và toạ độ cuối của vân tay ví dụ" title="Bước 8: bằng chứng HUI, bộ hồi quy và toạ độ cuối của vân tay ví dụ"/>
+            <wp:cNvGraphicFramePr>
+              <a:graphicFrameLocks xmlns:a="http://schemas.openxmlformats.org/drawingml/2006/main" noChangeAspect="1"/>
+            </wp:cNvGraphicFramePr>
+            <a:graphic xmlns:a="http://schemas.openxmlformats.org/drawingml/2006/main">
+              <a:graphicData uri="http://schemas.openxmlformats.org/drawingml/2006/picture">
+                <pic:pic xmlns:pic="http://schemas.openxmlformats.org/drawingml/2006/picture">
+                  <pic:nvPicPr>
+                    <pic:cNvPr id="0" name="" descr=""/>
+                    <pic:cNvPicPr>
+                      <a:picLocks noChangeAspect="1" noChangeArrowheads="1"/>
+                    </pic:cNvPicPr>
+                  </pic:nvPicPr>
+                  <pic:blipFill>
+                    <a:blip r:embed="rId16" cstate="none"/>
+                    <a:srcRect/>
+                    <a:stretch>
+                      <a:fillRect/>
+                    </a:stretch>
+                  </pic:blipFill>
+                  <pic:spPr bwMode="auto">
+                    <a:xfrm>
+                      <a:off x="0" y="0"/>
+                      <a:ext cx="5715000" cy="2762250"/>
+                    </a:xfrm>
+                    <a:prstGeom prst="rect">
+                      <a:avLst/>
+                    </a:prstGeom>
+                  </pic:spPr>
+                </pic:pic>
+              </a:graphicData>
+            </a:graphic>
+          </wp:inline>
+        </w:drawing>
+      </w:r>
+    </w:p>
+    <w:p>
+      <w:pPr>
+        <w:pStyle w:val="CaptionHinh"/>
+      </w:pPr>
+      <w:r>
+        <w:rPr>
+          <w:rFonts w:ascii="Times New Roman" w:cs="Times New Roman" w:eastAsia="Times New Roman" w:hAnsi="Times New Roman"/>
+          <w:b/>
+          <w:bCs/>
+        </w:rPr>
+        <w:t xml:space="preserve">Hình 3.9. </w:t>
+      </w:r>
+      <w:r>
+        <w:rPr>
+          <w:rFonts w:ascii="Times New Roman" w:cs="Times New Roman" w:eastAsia="Times New Roman" w:hAnsi="Times New Roman"/>
+        </w:rPr>
+        <w:t xml:space="preserve">Bước 8: bằng chứng HUI, bộ hồi quy và toạ độ cuối của vân tay ví dụ</w:t>
+      </w:r>
+    </w:p>
+    <w:p>
+      <w:pPr>
+        <w:pStyle w:val="Heading2"/>
+      </w:pPr>
+      <w:r>
+        <w:rPr>
+          <w:rFonts w:ascii="Times New Roman" w:cs="Times New Roman" w:eastAsia="Times New Roman" w:hAnsi="Times New Roman"/>
+        </w:rPr>
+        <w:t xml:space="preserve">3.9. Thuật toán tổng hợp</w:t>
       </w:r>
     </w:p>
     <w:p>
@@ -9900,7 +11731,22 @@
                 <w:sz w:val="23"/>
                 <w:szCs w:val="23"/>
               </w:rPr>
-              <w:t xml:space="preserve">)} của mọi ô</w:t>
+              <w:t xml:space="preserve">)} của mọi ô; lặp lại 1–4 cho mô hình mức cường độ và mô hình abs</w:t>
+            </w:r>
+          </w:p>
+          <w:p>
+            <w:pPr>
+              <w:spacing w:after="30"/>
+            </w:pPr>
+            <w:r>
+              <w:rPr>
+                <w:rFonts w:ascii="Times New Roman" w:cs="Times New Roman" w:eastAsia="Times New Roman" w:hAnsi="Times New Roman"/>
+                <w:b w:val="false"/>
+                <w:bCs w:val="false"/>
+                <w:sz w:val="23"/>
+                <w:szCs w:val="23"/>
+              </w:rPr>
+              <w:t xml:space="preserve">  4b. Trên 6 fold dev: tính φ(T, c) cho các ô ứng viên của mỗi truy vấn dev; học g bằng Gradient Boosting</w:t>
             </w:r>
           </w:p>
           <w:p>
@@ -10065,7 +11911,67 @@
                 <w:sz w:val="23"/>
                 <w:szCs w:val="23"/>
               </w:rPr>
-              <w:t xml:space="preserve">  7. (x̂, ŷ) ← trọng tâm m ô tốt nhất của tầng f theo (3.12)</w:t>
+              <w:t xml:space="preserve">  7. K ô ứng viên ← K ô có S cao nhất của tầng f</w:t>
+            </w:r>
+          </w:p>
+          <w:p>
+            <w:pPr>
+              <w:spacing w:after="30"/>
+            </w:pPr>
+            <w:r>
+              <w:rPr>
+                <w:rFonts w:ascii="Times New Roman" w:cs="Times New Roman" w:eastAsia="Times New Roman" w:hAnsi="Times New Roman"/>
+                <w:b w:val="false"/>
+                <w:bCs w:val="false"/>
+                <w:sz w:val="23"/>
+                <w:szCs w:val="23"/>
+              </w:rPr>
+              <w:t xml:space="preserve">  8. Với mỗi ứng viên: φ(T*, c) theo (3.13)–(3.15), </w:t>
+            </w:r>
+            <w:r>
+              <w:rPr>
+                <w:rFonts w:ascii="Times New Roman" w:cs="Times New Roman" w:eastAsia="Times New Roman" w:hAnsi="Times New Roman"/>
+                <w:b w:val="false"/>
+                <w:bCs w:val="false"/>
+                <w:i/>
+                <w:iCs/>
+                <w:sz w:val="23"/>
+                <w:szCs w:val="23"/>
+              </w:rPr>
+              <w:t xml:space="preserve">d</w:t>
+            </w:r>
+            <w:r>
+              <w:rPr>
+                <w:rFonts w:ascii="Times New Roman" w:cs="Times New Roman" w:eastAsia="Times New Roman" w:hAnsi="Times New Roman"/>
+                <w:b w:val="false"/>
+                <w:bCs w:val="false"/>
+                <w:sz w:val="23"/>
+                <w:szCs w:val="23"/>
+              </w:rPr>
+              <w:t xml:space="preserve">̂</w:t>
+            </w:r>
+            <w:r>
+              <w:rPr>
+                <w:rFonts w:ascii="Times New Roman" w:cs="Times New Roman" w:eastAsia="Times New Roman" w:hAnsi="Times New Roman"/>
+                <w:b w:val="false"/>
+                <w:bCs w:val="false"/>
+                <w:i/>
+                <w:iCs/>
+                <w:sz w:val="23"/>
+                <w:szCs w:val="23"/>
+                <w:vertAlign w:val="subscript"/>
+              </w:rPr>
+              <w:t xml:space="preserve">c</w:t>
+            </w:r>
+            <w:r>
+              <w:rPr>
+                <w:rFonts w:ascii="Times New Roman" w:cs="Times New Roman" w:eastAsia="Times New Roman" w:hAnsi="Times New Roman"/>
+                <w:b w:val="false"/>
+                <w:bCs w:val="false"/>
+                <w:sz w:val="23"/>
+                <w:szCs w:val="23"/>
+              </w:rPr>
+              <w:t xml:space="preserve"> ← g(φ); (x̂, ŷ) theo (3.16)</w:t>
             </w:r>
           </w:p>
           <w:p>
@@ -10097,7 +12003,7 @@
         <w:rPr>
           <w:rFonts w:ascii="Times New Roman" w:cs="Times New Roman" w:eastAsia="Times New Roman" w:hAnsi="Times New Roman"/>
         </w:rPr>
-        <w:t xml:space="preserve">Gọi H là tổng số HUI của mô hình và A là số AP. Chi phí định vị một vân tay là O(H) cho bước 5 (mỗi HUI được xét một lần nhờ biểu diễn ma trận thưa), O(C²) cho làm mượt với C ô, và không phụ thuộc vào số vân tay huấn luyện. Với UJIIndoorLoc, thời gian đo được là 136,35 ms mỗi vân tay trên cài đặt Python.</w:t>
+        <w:t xml:space="preserve">Gọi H là tổng số HUI của mô hình và A là số AP. Chi phí định vị một vân tay là O(H) cho bước 5 trên mỗi mô hình HUI (mỗi HUI được xét một lần nhờ biểu diễn ma trận thưa), O(C²) cho làm mượt với C ô, O(K·A) cho hồ sơ cường độ, và không phụ thuộc vào số vân tay huấn luyện. Với UJIIndoorLoc, thời gian đo được là 266,31 ms mỗi vân tay trên cài đặt Python (136,35 ms khi chỉ dùng mô hình chính).</w:t>
       </w:r>
     </w:p>
     <w:p>
@@ -10156,7 +12062,7 @@
         <w:rPr>
           <w:rFonts w:ascii="Times New Roman" w:cs="Times New Roman" w:eastAsia="Times New Roman" w:hAnsi="Times New Roman"/>
         </w:rPr>
-        <w:t xml:space="preserve">, m, p) được thực hiện trên 6 fold kiểm định tách từ tập huấn luyện. Với UJIIndoorLoc, 9 trong 11 điện thoại của validationData không có trong trainingData, nên các fold được giữ lại theo điện thoại (GroupKFold trên PHONEID) để mô phỏng đúng tình huống gặp thiết bị lạ. Sau khi chọn, EFIM được chạy lại trên toàn bộ tập huấn luyện và mô hình cuối được chấm một lần trên tập kiểm tra. Sai số được tính theo mét thực địa:</w:t>
+        <w:t xml:space="preserve">, m, p) được thực hiện trên 6 fold kiểm định tách từ tập huấn luyện. Với UJIIndoorLoc, 9 trong 11 điện thoại của validationData không có trong trainingData, nên các fold được giữ lại theo điện thoại (GroupKFold trên PHONEID) để mô phỏng đúng tình huống gặp thiết bị lạ. Sau khi chọn, EFIM được chạy lại trên toàn bộ tập huấn luyện và mô hình cuối được chấm một lần trên tập kiểm tra. Bộ hồi quy của Bước 8 cũng chỉ học từ các fold dev, và mọi lựa chọn của Bước 8 (đặc trưng, K, m, λ) dựa trên sai số dev ngoài fold. Sai số được tính theo mét thực địa:</w:t>
       </w:r>
     </w:p>
     <w:tbl>
@@ -10453,7 +12359,7 @@
           <wp:inline distT="0" distB="0" distL="0" distR="0">
             <wp:extent cx="5715000" cy="2933700"/>
             <wp:effectExtent t="0" r="0" b="0" l="0"/>
-            <wp:docPr id="1" name="d09_giao_thuc.png" descr="Giao thức đánh giá và kiểm chứng" title="Giao thức đánh giá và kiểm chứng"/>
+            <wp:docPr id="1" name="d10_giao_thuc.png" descr="Giao thức đánh giá và kiểm chứng" title="Giao thức đánh giá và kiểm chứng"/>
             <wp:cNvGraphicFramePr>
               <a:graphicFrameLocks xmlns:a="http://schemas.openxmlformats.org/drawingml/2006/main" noChangeAspect="1"/>
             </wp:cNvGraphicFramePr>
@@ -10467,7 +12373,7 @@
                     </pic:cNvPicPr>
                   </pic:nvPicPr>
                   <pic:blipFill>
-                    <a:blip r:embed="rId16" cstate="none"/>
+                    <a:blip r:embed="rId17" cstate="none"/>
                     <a:srcRect/>
                     <a:stretch>
                       <a:fillRect/>
@@ -13193,7 +15099,7 @@
                     </pic:cNvPicPr>
                   </pic:nvPicPr>
                   <pic:blipFill>
-                    <a:blip r:embed="rId17" cstate="none"/>
+                    <a:blip r:embed="rId18" cstate="none"/>
                     <a:srcRect/>
                     <a:stretch>
                       <a:fillRect/>
@@ -13236,6 +15142,1079 @@
     </w:p>
     <w:p>
       <w:pPr>
+        <w:spacing w:after="120" w:line="360"/>
+        <w:ind w:firstLine="567"/>
+        <w:jc w:val="both"/>
+      </w:pPr>
+      <w:r>
+        <w:rPr>
+          <w:rFonts w:ascii="Times New Roman" w:cs="Times New Roman" w:eastAsia="Times New Roman" w:hAnsi="Times New Roman"/>
+        </w:rPr>
+        <w:t xml:space="preserve">Bảng 4.2 ghi lại các biến thể của Bước 8 đã thử; mọi con số là sai số dev ngoài fold và tập kiểm tra không được đọc. Trọng số IDF và mô hình mục theo mức cường độ dùng riêng không cải thiện; chúng chỉ có ích khi là bằng chứng bổ sung cho bộ hồi quy. Quyết định tầng bằng một bộ phân loại học trên dev nâng độ chính xác tầng trên dev từ 83,8% lên 88,1% nhưng không giảm sai số vị trí, nên không được dùng.</w:t>
+      </w:r>
+    </w:p>
+    <w:p>
+      <w:pPr>
+        <w:pStyle w:val="CaptionBang"/>
+        <w:keepNext/>
+      </w:pPr>
+      <w:r>
+        <w:rPr>
+          <w:rFonts w:ascii="Times New Roman" w:cs="Times New Roman" w:eastAsia="Times New Roman" w:hAnsi="Times New Roman"/>
+          <w:b/>
+          <w:bCs/>
+        </w:rPr>
+        <w:t xml:space="preserve">Bảng 4.2. </w:t>
+      </w:r>
+      <w:r>
+        <w:rPr>
+          <w:rFonts w:ascii="Times New Roman" w:cs="Times New Roman" w:eastAsia="Times New Roman" w:hAnsi="Times New Roman"/>
+        </w:rPr>
+        <w:t xml:space="preserve">Các biến thể của Bước 8 thử trên dev UJIIndoorLoc (sai số trung bình ngoài fold, 19 937 truy vấn)</w:t>
+      </w:r>
+    </w:p>
+    <w:tbl>
+      <w:tblPr>
+        <w:tblW w:type="dxa" w:w="9000"/>
+        <w:jc w:val="center"/>
+        <w:tblBorders>
+          <w:top w:val="single" w:color="auto" w:sz="4"/>
+          <w:left w:val="single" w:color="auto" w:sz="4"/>
+          <w:bottom w:val="single" w:color="auto" w:sz="4"/>
+          <w:right w:val="single" w:color="auto" w:sz="4"/>
+          <w:insideH w:val="single" w:color="auto" w:sz="4"/>
+          <w:insideV w:val="single" w:color="auto" w:sz="4"/>
+        </w:tblBorders>
+      </w:tblPr>
+      <w:tblGrid>
+        <w:gridCol w:w="5000"/>
+        <w:gridCol w:w="1700"/>
+        <w:gridCol w:w="2300"/>
+      </w:tblGrid>
+      <w:tr>
+        <w:trPr>
+          <w:tblHeader/>
+        </w:trPr>
+        <w:tc>
+          <w:tcPr>
+            <w:tcW w:type="dxa" w:w="5000"/>
+            <w:tcBorders>
+              <w:top w:val="single" w:color="808080" w:sz="4"/>
+              <w:left w:val="single" w:color="808080" w:sz="4"/>
+              <w:bottom w:val="single" w:color="808080" w:sz="4"/>
+              <w:right w:val="single" w:color="808080" w:sz="4"/>
+            </w:tcBorders>
+            <w:shd w:fill="DCE3EC" w:color="auto" w:val="clear"/>
+            <w:tcMar>
+              <w:top w:type="dxa" w:w="50"/>
+              <w:left w:type="dxa" w:w="90"/>
+              <w:bottom w:type="dxa" w:w="50"/>
+              <w:right w:type="dxa" w:w="90"/>
+            </w:tcMar>
+            <w:vAlign w:val="center"/>
+          </w:tcPr>
+          <w:p>
+            <w:pPr>
+              <w:jc w:val="left"/>
+            </w:pPr>
+            <w:r>
+              <w:rPr>
+                <w:rFonts w:ascii="Times New Roman" w:cs="Times New Roman" w:eastAsia="Times New Roman" w:hAnsi="Times New Roman"/>
+                <w:b/>
+                <w:bCs/>
+                <w:sz w:val="21"/>
+                <w:szCs w:val="21"/>
+              </w:rPr>
+              <w:t xml:space="preserve">Biến thể</w:t>
+            </w:r>
+          </w:p>
+        </w:tc>
+        <w:tc>
+          <w:tcPr>
+            <w:tcW w:type="dxa" w:w="1700"/>
+            <w:tcBorders>
+              <w:top w:val="single" w:color="808080" w:sz="4"/>
+              <w:left w:val="single" w:color="808080" w:sz="4"/>
+              <w:bottom w:val="single" w:color="808080" w:sz="4"/>
+              <w:right w:val="single" w:color="808080" w:sz="4"/>
+            </w:tcBorders>
+            <w:shd w:fill="DCE3EC" w:color="auto" w:val="clear"/>
+            <w:tcMar>
+              <w:top w:type="dxa" w:w="50"/>
+              <w:left w:type="dxa" w:w="90"/>
+              <w:bottom w:type="dxa" w:w="50"/>
+              <w:right w:type="dxa" w:w="90"/>
+            </w:tcMar>
+            <w:vAlign w:val="center"/>
+          </w:tcPr>
+          <w:p>
+            <w:pPr>
+              <w:jc w:val="right"/>
+            </w:pPr>
+            <w:r>
+              <w:rPr>
+                <w:rFonts w:ascii="Times New Roman" w:cs="Times New Roman" w:eastAsia="Times New Roman" w:hAnsi="Times New Roman"/>
+                <w:b/>
+                <w:bCs/>
+                <w:sz w:val="21"/>
+                <w:szCs w:val="21"/>
+              </w:rPr>
+              <w:t xml:space="preserve">Dev TB (m)</w:t>
+            </w:r>
+          </w:p>
+        </w:tc>
+        <w:tc>
+          <w:tcPr>
+            <w:tcW w:type="dxa" w:w="2300"/>
+            <w:tcBorders>
+              <w:top w:val="single" w:color="808080" w:sz="4"/>
+              <w:left w:val="single" w:color="808080" w:sz="4"/>
+              <w:bottom w:val="single" w:color="808080" w:sz="4"/>
+              <w:right w:val="single" w:color="808080" w:sz="4"/>
+            </w:tcBorders>
+            <w:shd w:fill="DCE3EC" w:color="auto" w:val="clear"/>
+            <w:tcMar>
+              <w:top w:type="dxa" w:w="50"/>
+              <w:left w:type="dxa" w:w="90"/>
+              <w:bottom w:type="dxa" w:w="50"/>
+              <w:right w:type="dxa" w:w="90"/>
+            </w:tcMar>
+            <w:vAlign w:val="center"/>
+          </w:tcPr>
+          <w:p>
+            <w:pPr>
+              <w:jc w:val="left"/>
+            </w:pPr>
+            <w:r>
+              <w:rPr>
+                <w:rFonts w:ascii="Times New Roman" w:cs="Times New Roman" w:eastAsia="Times New Roman" w:hAnsi="Times New Roman"/>
+                <w:b/>
+                <w:bCs/>
+                <w:sz w:val="21"/>
+                <w:szCs w:val="21"/>
+              </w:rPr>
+              <w:t xml:space="preserve">Kết luận</w:t>
+            </w:r>
+          </w:p>
+        </w:tc>
+      </w:tr>
+      <w:tr>
+        <w:tc>
+          <w:tcPr>
+            <w:tcW w:type="dxa" w:w="5000"/>
+            <w:tcBorders>
+              <w:top w:val="single" w:color="808080" w:sz="4"/>
+              <w:left w:val="single" w:color="808080" w:sz="4"/>
+              <w:bottom w:val="single" w:color="808080" w:sz="4"/>
+              <w:right w:val="single" w:color="808080" w:sz="4"/>
+            </w:tcBorders>
+            <w:tcMar>
+              <w:top w:type="dxa" w:w="50"/>
+              <w:left w:type="dxa" w:w="90"/>
+              <w:bottom w:type="dxa" w:w="50"/>
+              <w:right w:type="dxa" w:w="90"/>
+            </w:tcMar>
+            <w:vAlign w:val="center"/>
+          </w:tcPr>
+          <w:p>
+            <w:pPr>
+              <w:jc w:val="left"/>
+            </w:pPr>
+            <w:r>
+              <w:rPr>
+                <w:rFonts w:ascii="Times New Roman" w:cs="Times New Roman" w:eastAsia="Times New Roman" w:hAnsi="Times New Roman"/>
+                <w:b w:val="false"/>
+                <w:bCs w:val="false"/>
+                <w:sz w:val="21"/>
+                <w:szCs w:val="21"/>
+              </w:rPr>
+              <w:t xml:space="preserve">Bước 1–7, một điểm khớp HUI (v4)</w:t>
+            </w:r>
+          </w:p>
+        </w:tc>
+        <w:tc>
+          <w:tcPr>
+            <w:tcW w:type="dxa" w:w="1700"/>
+            <w:tcBorders>
+              <w:top w:val="single" w:color="808080" w:sz="4"/>
+              <w:left w:val="single" w:color="808080" w:sz="4"/>
+              <w:bottom w:val="single" w:color="808080" w:sz="4"/>
+              <w:right w:val="single" w:color="808080" w:sz="4"/>
+            </w:tcBorders>
+            <w:tcMar>
+              <w:top w:type="dxa" w:w="50"/>
+              <w:left w:type="dxa" w:w="90"/>
+              <w:bottom w:type="dxa" w:w="50"/>
+              <w:right w:type="dxa" w:w="90"/>
+            </w:tcMar>
+            <w:vAlign w:val="center"/>
+          </w:tcPr>
+          <w:p>
+            <w:pPr>
+              <w:jc w:val="right"/>
+            </w:pPr>
+            <w:r>
+              <w:rPr>
+                <w:rFonts w:ascii="Times New Roman" w:cs="Times New Roman" w:eastAsia="Times New Roman" w:hAnsi="Times New Roman"/>
+                <w:b w:val="false"/>
+                <w:bCs w:val="false"/>
+                <w:sz w:val="21"/>
+                <w:szCs w:val="21"/>
+              </w:rPr>
+              <w:t xml:space="preserve">7,65</w:t>
+            </w:r>
+          </w:p>
+        </w:tc>
+        <w:tc>
+          <w:tcPr>
+            <w:tcW w:type="dxa" w:w="2300"/>
+            <w:tcBorders>
+              <w:top w:val="single" w:color="808080" w:sz="4"/>
+              <w:left w:val="single" w:color="808080" w:sz="4"/>
+              <w:bottom w:val="single" w:color="808080" w:sz="4"/>
+              <w:right w:val="single" w:color="808080" w:sz="4"/>
+            </w:tcBorders>
+            <w:tcMar>
+              <w:top w:type="dxa" w:w="50"/>
+              <w:left w:type="dxa" w:w="90"/>
+              <w:bottom w:type="dxa" w:w="50"/>
+              <w:right w:type="dxa" w:w="90"/>
+            </w:tcMar>
+            <w:vAlign w:val="center"/>
+          </w:tcPr>
+          <w:p>
+            <w:pPr>
+              <w:jc w:val="left"/>
+            </w:pPr>
+            <w:r>
+              <w:rPr>
+                <w:rFonts w:ascii="Times New Roman" w:cs="Times New Roman" w:eastAsia="Times New Roman" w:hAnsi="Times New Roman"/>
+                <w:b w:val="false"/>
+                <w:bCs w:val="false"/>
+                <w:sz w:val="21"/>
+                <w:szCs w:val="21"/>
+              </w:rPr>
+              <w:t xml:space="preserve">mốc so sánh</w:t>
+            </w:r>
+          </w:p>
+        </w:tc>
+      </w:tr>
+      <w:tr>
+        <w:tc>
+          <w:tcPr>
+            <w:tcW w:type="dxa" w:w="5000"/>
+            <w:tcBorders>
+              <w:top w:val="single" w:color="808080" w:sz="4"/>
+              <w:left w:val="single" w:color="808080" w:sz="4"/>
+              <w:bottom w:val="single" w:color="808080" w:sz="4"/>
+              <w:right w:val="single" w:color="808080" w:sz="4"/>
+            </w:tcBorders>
+            <w:tcMar>
+              <w:top w:type="dxa" w:w="50"/>
+              <w:left w:type="dxa" w:w="90"/>
+              <w:bottom w:type="dxa" w:w="50"/>
+              <w:right w:type="dxa" w:w="90"/>
+            </w:tcMar>
+            <w:vAlign w:val="center"/>
+          </w:tcPr>
+          <w:p>
+            <w:pPr>
+              <w:jc w:val="left"/>
+            </w:pPr>
+            <w:r>
+              <w:rPr>
+                <w:rFonts w:ascii="Times New Roman" w:cs="Times New Roman" w:eastAsia="Times New Roman" w:hAnsi="Times New Roman"/>
+                <w:b w:val="false"/>
+                <w:bCs w:val="false"/>
+                <w:sz w:val="21"/>
+                <w:szCs w:val="21"/>
+              </w:rPr>
+              <w:t xml:space="preserve">Trọng số IDF của HUI giữa các ô lân cận</w:t>
+            </w:r>
+          </w:p>
+        </w:tc>
+        <w:tc>
+          <w:tcPr>
+            <w:tcW w:type="dxa" w:w="1700"/>
+            <w:tcBorders>
+              <w:top w:val="single" w:color="808080" w:sz="4"/>
+              <w:left w:val="single" w:color="808080" w:sz="4"/>
+              <w:bottom w:val="single" w:color="808080" w:sz="4"/>
+              <w:right w:val="single" w:color="808080" w:sz="4"/>
+            </w:tcBorders>
+            <w:tcMar>
+              <w:top w:type="dxa" w:w="50"/>
+              <w:left w:type="dxa" w:w="90"/>
+              <w:bottom w:type="dxa" w:w="50"/>
+              <w:right w:type="dxa" w:w="90"/>
+            </w:tcMar>
+            <w:vAlign w:val="center"/>
+          </w:tcPr>
+          <w:p>
+            <w:pPr>
+              <w:jc w:val="right"/>
+            </w:pPr>
+            <w:r>
+              <w:rPr>
+                <w:rFonts w:ascii="Times New Roman" w:cs="Times New Roman" w:eastAsia="Times New Roman" w:hAnsi="Times New Roman"/>
+                <w:b w:val="false"/>
+                <w:bCs w:val="false"/>
+                <w:sz w:val="21"/>
+                <w:szCs w:val="21"/>
+              </w:rPr>
+              <w:t xml:space="preserve">7,63</w:t>
+            </w:r>
+          </w:p>
+        </w:tc>
+        <w:tc>
+          <w:tcPr>
+            <w:tcW w:type="dxa" w:w="2300"/>
+            <w:tcBorders>
+              <w:top w:val="single" w:color="808080" w:sz="4"/>
+              <w:left w:val="single" w:color="808080" w:sz="4"/>
+              <w:bottom w:val="single" w:color="808080" w:sz="4"/>
+              <w:right w:val="single" w:color="808080" w:sz="4"/>
+            </w:tcBorders>
+            <w:tcMar>
+              <w:top w:type="dxa" w:w="50"/>
+              <w:left w:type="dxa" w:w="90"/>
+              <w:bottom w:type="dxa" w:w="50"/>
+              <w:right w:type="dxa" w:w="90"/>
+            </w:tcMar>
+            <w:vAlign w:val="center"/>
+          </w:tcPr>
+          <w:p>
+            <w:pPr>
+              <w:jc w:val="left"/>
+            </w:pPr>
+            <w:r>
+              <w:rPr>
+                <w:rFonts w:ascii="Times New Roman" w:cs="Times New Roman" w:eastAsia="Times New Roman" w:hAnsi="Times New Roman"/>
+                <w:b w:val="false"/>
+                <w:bCs w:val="false"/>
+                <w:sz w:val="21"/>
+                <w:szCs w:val="21"/>
+              </w:rPr>
+              <w:t xml:space="preserve">gần như không đổi</w:t>
+            </w:r>
+          </w:p>
+        </w:tc>
+      </w:tr>
+      <w:tr>
+        <w:tc>
+          <w:tcPr>
+            <w:tcW w:type="dxa" w:w="5000"/>
+            <w:tcBorders>
+              <w:top w:val="single" w:color="808080" w:sz="4"/>
+              <w:left w:val="single" w:color="808080" w:sz="4"/>
+              <w:bottom w:val="single" w:color="808080" w:sz="4"/>
+              <w:right w:val="single" w:color="808080" w:sz="4"/>
+            </w:tcBorders>
+            <w:tcMar>
+              <w:top w:type="dxa" w:w="50"/>
+              <w:left w:type="dxa" w:w="90"/>
+              <w:bottom w:type="dxa" w:w="50"/>
+              <w:right w:type="dxa" w:w="90"/>
+            </w:tcMar>
+            <w:vAlign w:val="center"/>
+          </w:tcPr>
+          <w:p>
+            <w:pPr>
+              <w:jc w:val="left"/>
+            </w:pPr>
+            <w:r>
+              <w:rPr>
+                <w:rFonts w:ascii="Times New Roman" w:cs="Times New Roman" w:eastAsia="Times New Roman" w:hAnsi="Times New Roman"/>
+                <w:b w:val="false"/>
+                <w:bCs w:val="false"/>
+                <w:sz w:val="21"/>
+                <w:szCs w:val="21"/>
+              </w:rPr>
+              <w:t xml:space="preserve">Chỉ dùng mô hình mục theo mức cường độ (fold 0)</w:t>
+            </w:r>
+          </w:p>
+        </w:tc>
+        <w:tc>
+          <w:tcPr>
+            <w:tcW w:type="dxa" w:w="1700"/>
+            <w:tcBorders>
+              <w:top w:val="single" w:color="808080" w:sz="4"/>
+              <w:left w:val="single" w:color="808080" w:sz="4"/>
+              <w:bottom w:val="single" w:color="808080" w:sz="4"/>
+              <w:right w:val="single" w:color="808080" w:sz="4"/>
+            </w:tcBorders>
+            <w:tcMar>
+              <w:top w:type="dxa" w:w="50"/>
+              <w:left w:type="dxa" w:w="90"/>
+              <w:bottom w:type="dxa" w:w="50"/>
+              <w:right w:type="dxa" w:w="90"/>
+            </w:tcMar>
+            <w:vAlign w:val="center"/>
+          </w:tcPr>
+          <w:p>
+            <w:pPr>
+              <w:jc w:val="right"/>
+            </w:pPr>
+            <w:r>
+              <w:rPr>
+                <w:rFonts w:ascii="Times New Roman" w:cs="Times New Roman" w:eastAsia="Times New Roman" w:hAnsi="Times New Roman"/>
+                <w:b w:val="false"/>
+                <w:bCs w:val="false"/>
+                <w:sz w:val="21"/>
+                <w:szCs w:val="21"/>
+              </w:rPr>
+              <w:t xml:space="preserve">7,68 so với 7,02</w:t>
+            </w:r>
+          </w:p>
+        </w:tc>
+        <w:tc>
+          <w:tcPr>
+            <w:tcW w:type="dxa" w:w="2300"/>
+            <w:tcBorders>
+              <w:top w:val="single" w:color="808080" w:sz="4"/>
+              <w:left w:val="single" w:color="808080" w:sz="4"/>
+              <w:bottom w:val="single" w:color="808080" w:sz="4"/>
+              <w:right w:val="single" w:color="808080" w:sz="4"/>
+            </w:tcBorders>
+            <w:tcMar>
+              <w:top w:type="dxa" w:w="50"/>
+              <w:left w:type="dxa" w:w="90"/>
+              <w:bottom w:type="dxa" w:w="50"/>
+              <w:right w:type="dxa" w:w="90"/>
+            </w:tcMar>
+            <w:vAlign w:val="center"/>
+          </w:tcPr>
+          <w:p>
+            <w:pPr>
+              <w:jc w:val="left"/>
+            </w:pPr>
+            <w:r>
+              <w:rPr>
+                <w:rFonts w:ascii="Times New Roman" w:cs="Times New Roman" w:eastAsia="Times New Roman" w:hAnsi="Times New Roman"/>
+                <w:b w:val="false"/>
+                <w:bCs w:val="false"/>
+                <w:sz w:val="21"/>
+                <w:szCs w:val="21"/>
+              </w:rPr>
+              <w:t xml:space="preserve">kém hơn khi dùng riêng</w:t>
+            </w:r>
+          </w:p>
+        </w:tc>
+      </w:tr>
+      <w:tr>
+        <w:tc>
+          <w:tcPr>
+            <w:tcW w:type="dxa" w:w="5000"/>
+            <w:tcBorders>
+              <w:top w:val="single" w:color="808080" w:sz="4"/>
+              <w:left w:val="single" w:color="808080" w:sz="4"/>
+              <w:bottom w:val="single" w:color="808080" w:sz="4"/>
+              <w:right w:val="single" w:color="808080" w:sz="4"/>
+            </w:tcBorders>
+            <w:tcMar>
+              <w:top w:type="dxa" w:w="50"/>
+              <w:left w:type="dxa" w:w="90"/>
+              <w:bottom w:type="dxa" w:w="50"/>
+              <w:right w:type="dxa" w:w="90"/>
+            </w:tcMar>
+            <w:vAlign w:val="center"/>
+          </w:tcPr>
+          <w:p>
+            <w:pPr>
+              <w:jc w:val="left"/>
+            </w:pPr>
+            <w:r>
+              <w:rPr>
+                <w:rFonts w:ascii="Times New Roman" w:cs="Times New Roman" w:eastAsia="Times New Roman" w:hAnsi="Times New Roman"/>
+                <w:b w:val="false"/>
+                <w:bCs w:val="false"/>
+                <w:sz w:val="21"/>
+                <w:szCs w:val="21"/>
+              </w:rPr>
+              <w:t xml:space="preserve">Xếp hạng lại bằng các điểm HUI</w:t>
+            </w:r>
+          </w:p>
+        </w:tc>
+        <w:tc>
+          <w:tcPr>
+            <w:tcW w:type="dxa" w:w="1700"/>
+            <w:tcBorders>
+              <w:top w:val="single" w:color="808080" w:sz="4"/>
+              <w:left w:val="single" w:color="808080" w:sz="4"/>
+              <w:bottom w:val="single" w:color="808080" w:sz="4"/>
+              <w:right w:val="single" w:color="808080" w:sz="4"/>
+            </w:tcBorders>
+            <w:tcMar>
+              <w:top w:type="dxa" w:w="50"/>
+              <w:left w:type="dxa" w:w="90"/>
+              <w:bottom w:type="dxa" w:w="50"/>
+              <w:right w:type="dxa" w:w="90"/>
+            </w:tcMar>
+            <w:vAlign w:val="center"/>
+          </w:tcPr>
+          <w:p>
+            <w:pPr>
+              <w:jc w:val="right"/>
+            </w:pPr>
+            <w:r>
+              <w:rPr>
+                <w:rFonts w:ascii="Times New Roman" w:cs="Times New Roman" w:eastAsia="Times New Roman" w:hAnsi="Times New Roman"/>
+                <w:b w:val="false"/>
+                <w:bCs w:val="false"/>
+                <w:sz w:val="21"/>
+                <w:szCs w:val="21"/>
+              </w:rPr>
+              <w:t xml:space="preserve">7,33</w:t>
+            </w:r>
+          </w:p>
+        </w:tc>
+        <w:tc>
+          <w:tcPr>
+            <w:tcW w:type="dxa" w:w="2300"/>
+            <w:tcBorders>
+              <w:top w:val="single" w:color="808080" w:sz="4"/>
+              <w:left w:val="single" w:color="808080" w:sz="4"/>
+              <w:bottom w:val="single" w:color="808080" w:sz="4"/>
+              <w:right w:val="single" w:color="808080" w:sz="4"/>
+            </w:tcBorders>
+            <w:tcMar>
+              <w:top w:type="dxa" w:w="50"/>
+              <w:left w:type="dxa" w:w="90"/>
+              <w:bottom w:type="dxa" w:w="50"/>
+              <w:right w:type="dxa" w:w="90"/>
+            </w:tcMar>
+            <w:vAlign w:val="center"/>
+          </w:tcPr>
+          <w:p>
+            <w:pPr>
+              <w:jc w:val="left"/>
+            </w:pPr>
+            <w:r>
+              <w:rPr>
+                <w:rFonts w:ascii="Times New Roman" w:cs="Times New Roman" w:eastAsia="Times New Roman" w:hAnsi="Times New Roman"/>
+                <w:b w:val="false"/>
+                <w:bCs w:val="false"/>
+                <w:sz w:val="21"/>
+                <w:szCs w:val="21"/>
+              </w:rPr>
+              <w:t xml:space="preserve">cải thiện</w:t>
+            </w:r>
+          </w:p>
+        </w:tc>
+      </w:tr>
+      <w:tr>
+        <w:tc>
+          <w:tcPr>
+            <w:tcW w:type="dxa" w:w="5000"/>
+            <w:tcBorders>
+              <w:top w:val="single" w:color="808080" w:sz="4"/>
+              <w:left w:val="single" w:color="808080" w:sz="4"/>
+              <w:bottom w:val="single" w:color="808080" w:sz="4"/>
+              <w:right w:val="single" w:color="808080" w:sz="4"/>
+            </w:tcBorders>
+            <w:tcMar>
+              <w:top w:type="dxa" w:w="50"/>
+              <w:left w:type="dxa" w:w="90"/>
+              <w:bottom w:type="dxa" w:w="50"/>
+              <w:right w:type="dxa" w:w="90"/>
+            </w:tcMar>
+            <w:vAlign w:val="center"/>
+          </w:tcPr>
+          <w:p>
+            <w:pPr>
+              <w:jc w:val="left"/>
+            </w:pPr>
+            <w:r>
+              <w:rPr>
+                <w:rFonts w:ascii="Times New Roman" w:cs="Times New Roman" w:eastAsia="Times New Roman" w:hAnsi="Times New Roman"/>
+                <w:b w:val="false"/>
+                <w:bCs w:val="false"/>
+                <w:sz w:val="21"/>
+                <w:szCs w:val="21"/>
+              </w:rPr>
+              <w:t xml:space="preserve">+ hồ sơ cường độ suy ra từ HUI</w:t>
+            </w:r>
+          </w:p>
+        </w:tc>
+        <w:tc>
+          <w:tcPr>
+            <w:tcW w:type="dxa" w:w="1700"/>
+            <w:tcBorders>
+              <w:top w:val="single" w:color="808080" w:sz="4"/>
+              <w:left w:val="single" w:color="808080" w:sz="4"/>
+              <w:bottom w:val="single" w:color="808080" w:sz="4"/>
+              <w:right w:val="single" w:color="808080" w:sz="4"/>
+            </w:tcBorders>
+            <w:tcMar>
+              <w:top w:type="dxa" w:w="50"/>
+              <w:left w:type="dxa" w:w="90"/>
+              <w:bottom w:type="dxa" w:w="50"/>
+              <w:right w:type="dxa" w:w="90"/>
+            </w:tcMar>
+            <w:vAlign w:val="center"/>
+          </w:tcPr>
+          <w:p>
+            <w:pPr>
+              <w:jc w:val="right"/>
+            </w:pPr>
+            <w:r>
+              <w:rPr>
+                <w:rFonts w:ascii="Times New Roman" w:cs="Times New Roman" w:eastAsia="Times New Roman" w:hAnsi="Times New Roman"/>
+                <w:b w:val="false"/>
+                <w:bCs w:val="false"/>
+                <w:sz w:val="21"/>
+                <w:szCs w:val="21"/>
+              </w:rPr>
+              <w:t xml:space="preserve">7,19</w:t>
+            </w:r>
+          </w:p>
+        </w:tc>
+        <w:tc>
+          <w:tcPr>
+            <w:tcW w:type="dxa" w:w="2300"/>
+            <w:tcBorders>
+              <w:top w:val="single" w:color="808080" w:sz="4"/>
+              <w:left w:val="single" w:color="808080" w:sz="4"/>
+              <w:bottom w:val="single" w:color="808080" w:sz="4"/>
+              <w:right w:val="single" w:color="808080" w:sz="4"/>
+            </w:tcBorders>
+            <w:tcMar>
+              <w:top w:type="dxa" w:w="50"/>
+              <w:left w:type="dxa" w:w="90"/>
+              <w:bottom w:type="dxa" w:w="50"/>
+              <w:right w:type="dxa" w:w="90"/>
+            </w:tcMar>
+            <w:vAlign w:val="center"/>
+          </w:tcPr>
+          <w:p>
+            <w:pPr>
+              <w:jc w:val="left"/>
+            </w:pPr>
+            <w:r>
+              <w:rPr>
+                <w:rFonts w:ascii="Times New Roman" w:cs="Times New Roman" w:eastAsia="Times New Roman" w:hAnsi="Times New Roman"/>
+                <w:b w:val="false"/>
+                <w:bCs w:val="false"/>
+                <w:sz w:val="21"/>
+                <w:szCs w:val="21"/>
+              </w:rPr>
+              <w:t xml:space="preserve">cải thiện</w:t>
+            </w:r>
+          </w:p>
+        </w:tc>
+      </w:tr>
+      <w:tr>
+        <w:tc>
+          <w:tcPr>
+            <w:tcW w:type="dxa" w:w="5000"/>
+            <w:tcBorders>
+              <w:top w:val="single" w:color="808080" w:sz="4"/>
+              <w:left w:val="single" w:color="808080" w:sz="4"/>
+              <w:bottom w:val="single" w:color="808080" w:sz="4"/>
+              <w:right w:val="single" w:color="808080" w:sz="4"/>
+            </w:tcBorders>
+            <w:tcMar>
+              <w:top w:type="dxa" w:w="50"/>
+              <w:left w:type="dxa" w:w="90"/>
+              <w:bottom w:type="dxa" w:w="50"/>
+              <w:right w:type="dxa" w:w="90"/>
+            </w:tcMar>
+            <w:vAlign w:val="center"/>
+          </w:tcPr>
+          <w:p>
+            <w:pPr>
+              <w:jc w:val="left"/>
+            </w:pPr>
+            <w:r>
+              <w:rPr>
+                <w:rFonts w:ascii="Times New Roman" w:cs="Times New Roman" w:eastAsia="Times New Roman" w:hAnsi="Times New Roman"/>
+                <w:b w:val="false"/>
+                <w:bCs w:val="false"/>
+                <w:sz w:val="21"/>
+                <w:szCs w:val="21"/>
+              </w:rPr>
+              <w:t xml:space="preserve">Ứng viên trên cả toà nhà (không theo tầng)</w:t>
+            </w:r>
+          </w:p>
+        </w:tc>
+        <w:tc>
+          <w:tcPr>
+            <w:tcW w:type="dxa" w:w="1700"/>
+            <w:tcBorders>
+              <w:top w:val="single" w:color="808080" w:sz="4"/>
+              <w:left w:val="single" w:color="808080" w:sz="4"/>
+              <w:bottom w:val="single" w:color="808080" w:sz="4"/>
+              <w:right w:val="single" w:color="808080" w:sz="4"/>
+            </w:tcBorders>
+            <w:tcMar>
+              <w:top w:type="dxa" w:w="50"/>
+              <w:left w:type="dxa" w:w="90"/>
+              <w:bottom w:type="dxa" w:w="50"/>
+              <w:right w:type="dxa" w:w="90"/>
+            </w:tcMar>
+            <w:vAlign w:val="center"/>
+          </w:tcPr>
+          <w:p>
+            <w:pPr>
+              <w:jc w:val="right"/>
+            </w:pPr>
+            <w:r>
+              <w:rPr>
+                <w:rFonts w:ascii="Times New Roman" w:cs="Times New Roman" w:eastAsia="Times New Roman" w:hAnsi="Times New Roman"/>
+                <w:b w:val="false"/>
+                <w:bCs w:val="false"/>
+                <w:sz w:val="21"/>
+                <w:szCs w:val="21"/>
+              </w:rPr>
+              <w:t xml:space="preserve">7,25</w:t>
+            </w:r>
+          </w:p>
+        </w:tc>
+        <w:tc>
+          <w:tcPr>
+            <w:tcW w:type="dxa" w:w="2300"/>
+            <w:tcBorders>
+              <w:top w:val="single" w:color="808080" w:sz="4"/>
+              <w:left w:val="single" w:color="808080" w:sz="4"/>
+              <w:bottom w:val="single" w:color="808080" w:sz="4"/>
+              <w:right w:val="single" w:color="808080" w:sz="4"/>
+            </w:tcBorders>
+            <w:tcMar>
+              <w:top w:type="dxa" w:w="50"/>
+              <w:left w:type="dxa" w:w="90"/>
+              <w:bottom w:type="dxa" w:w="50"/>
+              <w:right w:type="dxa" w:w="90"/>
+            </w:tcMar>
+            <w:vAlign w:val="center"/>
+          </w:tcPr>
+          <w:p>
+            <w:pPr>
+              <w:jc w:val="left"/>
+            </w:pPr>
+            <w:r>
+              <w:rPr>
+                <w:rFonts w:ascii="Times New Roman" w:cs="Times New Roman" w:eastAsia="Times New Roman" w:hAnsi="Times New Roman"/>
+                <w:b w:val="false"/>
+                <w:bCs w:val="false"/>
+                <w:sz w:val="21"/>
+                <w:szCs w:val="21"/>
+              </w:rPr>
+              <w:t xml:space="preserve">không dùng</w:t>
+            </w:r>
+          </w:p>
+        </w:tc>
+      </w:tr>
+      <w:tr>
+        <w:tc>
+          <w:tcPr>
+            <w:tcW w:type="dxa" w:w="5000"/>
+            <w:tcBorders>
+              <w:top w:val="single" w:color="808080" w:sz="4"/>
+              <w:left w:val="single" w:color="808080" w:sz="4"/>
+              <w:bottom w:val="single" w:color="808080" w:sz="4"/>
+              <w:right w:val="single" w:color="808080" w:sz="4"/>
+            </w:tcBorders>
+            <w:tcMar>
+              <w:top w:type="dxa" w:w="50"/>
+              <w:left w:type="dxa" w:w="90"/>
+              <w:bottom w:type="dxa" w:w="50"/>
+              <w:right w:type="dxa" w:w="90"/>
+            </w:tcMar>
+            <w:vAlign w:val="center"/>
+          </w:tcPr>
+          <w:p>
+            <w:pPr>
+              <w:jc w:val="left"/>
+            </w:pPr>
+            <w:r>
+              <w:rPr>
+                <w:rFonts w:ascii="Times New Roman" w:cs="Times New Roman" w:eastAsia="Times New Roman" w:hAnsi="Times New Roman"/>
+                <w:b w:val="false"/>
+                <w:bCs w:val="false"/>
+                <w:sz w:val="21"/>
+                <w:szCs w:val="21"/>
+              </w:rPr>
+              <w:t xml:space="preserve">+ đặc trưng so với các ứng viên khác (v5)</w:t>
+            </w:r>
+          </w:p>
+        </w:tc>
+        <w:tc>
+          <w:tcPr>
+            <w:tcW w:type="dxa" w:w="1700"/>
+            <w:tcBorders>
+              <w:top w:val="single" w:color="808080" w:sz="4"/>
+              <w:left w:val="single" w:color="808080" w:sz="4"/>
+              <w:bottom w:val="single" w:color="808080" w:sz="4"/>
+              <w:right w:val="single" w:color="808080" w:sz="4"/>
+            </w:tcBorders>
+            <w:tcMar>
+              <w:top w:type="dxa" w:w="50"/>
+              <w:left w:type="dxa" w:w="90"/>
+              <w:bottom w:type="dxa" w:w="50"/>
+              <w:right w:type="dxa" w:w="90"/>
+            </w:tcMar>
+            <w:vAlign w:val="center"/>
+          </w:tcPr>
+          <w:p>
+            <w:pPr>
+              <w:jc w:val="right"/>
+            </w:pPr>
+            <w:r>
+              <w:rPr>
+                <w:rFonts w:ascii="Times New Roman" w:cs="Times New Roman" w:eastAsia="Times New Roman" w:hAnsi="Times New Roman"/>
+                <w:b w:val="false"/>
+                <w:bCs w:val="false"/>
+                <w:sz w:val="21"/>
+                <w:szCs w:val="21"/>
+              </w:rPr>
+              <w:t xml:space="preserve">7,08</w:t>
+            </w:r>
+          </w:p>
+        </w:tc>
+        <w:tc>
+          <w:tcPr>
+            <w:tcW w:type="dxa" w:w="2300"/>
+            <w:tcBorders>
+              <w:top w:val="single" w:color="808080" w:sz="4"/>
+              <w:left w:val="single" w:color="808080" w:sz="4"/>
+              <w:bottom w:val="single" w:color="808080" w:sz="4"/>
+              <w:right w:val="single" w:color="808080" w:sz="4"/>
+            </w:tcBorders>
+            <w:tcMar>
+              <w:top w:type="dxa" w:w="50"/>
+              <w:left w:type="dxa" w:w="90"/>
+              <w:bottom w:type="dxa" w:w="50"/>
+              <w:right w:type="dxa" w:w="90"/>
+            </w:tcMar>
+            <w:vAlign w:val="center"/>
+          </w:tcPr>
+          <w:p>
+            <w:pPr>
+              <w:jc w:val="left"/>
+            </w:pPr>
+            <w:r>
+              <w:rPr>
+                <w:rFonts w:ascii="Times New Roman" w:cs="Times New Roman" w:eastAsia="Times New Roman" w:hAnsi="Times New Roman"/>
+                <w:b w:val="false"/>
+                <w:bCs w:val="false"/>
+                <w:sz w:val="21"/>
+                <w:szCs w:val="21"/>
+              </w:rPr>
+              <w:t xml:space="preserve">cải thiện</w:t>
+            </w:r>
+          </w:p>
+        </w:tc>
+      </w:tr>
+      <w:tr>
+        <w:tc>
+          <w:tcPr>
+            <w:tcW w:type="dxa" w:w="5000"/>
+            <w:tcBorders>
+              <w:top w:val="single" w:color="808080" w:sz="4"/>
+              <w:left w:val="single" w:color="808080" w:sz="4"/>
+              <w:bottom w:val="single" w:color="808080" w:sz="4"/>
+              <w:right w:val="single" w:color="808080" w:sz="4"/>
+            </w:tcBorders>
+            <w:tcMar>
+              <w:top w:type="dxa" w:w="50"/>
+              <w:left w:type="dxa" w:w="90"/>
+              <w:bottom w:type="dxa" w:w="50"/>
+              <w:right w:type="dxa" w:w="90"/>
+            </w:tcMar>
+            <w:vAlign w:val="center"/>
+          </w:tcPr>
+          <w:p>
+            <w:pPr>
+              <w:jc w:val="left"/>
+            </w:pPr>
+            <w:r>
+              <w:rPr>
+                <w:rFonts w:ascii="Times New Roman" w:cs="Times New Roman" w:eastAsia="Times New Roman" w:hAnsi="Times New Roman"/>
+                <w:b w:val="false"/>
+                <w:bCs w:val="false"/>
+                <w:sz w:val="21"/>
+                <w:szCs w:val="21"/>
+              </w:rPr>
+              <w:t xml:space="preserve">v5 học khi bỏ ô của chính truy vấn</w:t>
+            </w:r>
+          </w:p>
+        </w:tc>
+        <w:tc>
+          <w:tcPr>
+            <w:tcW w:type="dxa" w:w="1700"/>
+            <w:tcBorders>
+              <w:top w:val="single" w:color="808080" w:sz="4"/>
+              <w:left w:val="single" w:color="808080" w:sz="4"/>
+              <w:bottom w:val="single" w:color="808080" w:sz="4"/>
+              <w:right w:val="single" w:color="808080" w:sz="4"/>
+            </w:tcBorders>
+            <w:tcMar>
+              <w:top w:type="dxa" w:w="50"/>
+              <w:left w:type="dxa" w:w="90"/>
+              <w:bottom w:type="dxa" w:w="50"/>
+              <w:right w:type="dxa" w:w="90"/>
+            </w:tcMar>
+            <w:vAlign w:val="center"/>
+          </w:tcPr>
+          <w:p>
+            <w:pPr>
+              <w:jc w:val="right"/>
+            </w:pPr>
+            <w:r>
+              <w:rPr>
+                <w:rFonts w:ascii="Times New Roman" w:cs="Times New Roman" w:eastAsia="Times New Roman" w:hAnsi="Times New Roman"/>
+                <w:b w:val="false"/>
+                <w:bCs w:val="false"/>
+                <w:sz w:val="21"/>
+                <w:szCs w:val="21"/>
+              </w:rPr>
+              <w:t xml:space="preserve">7,31</w:t>
+            </w:r>
+          </w:p>
+        </w:tc>
+        <w:tc>
+          <w:tcPr>
+            <w:tcW w:type="dxa" w:w="2300"/>
+            <w:tcBorders>
+              <w:top w:val="single" w:color="808080" w:sz="4"/>
+              <w:left w:val="single" w:color="808080" w:sz="4"/>
+              <w:bottom w:val="single" w:color="808080" w:sz="4"/>
+              <w:right w:val="single" w:color="808080" w:sz="4"/>
+            </w:tcBorders>
+            <w:tcMar>
+              <w:top w:type="dxa" w:w="50"/>
+              <w:left w:type="dxa" w:w="90"/>
+              <w:bottom w:type="dxa" w:w="50"/>
+              <w:right w:type="dxa" w:w="90"/>
+            </w:tcMar>
+            <w:vAlign w:val="center"/>
+          </w:tcPr>
+          <w:p>
+            <w:pPr>
+              <w:jc w:val="left"/>
+            </w:pPr>
+            <w:r>
+              <w:rPr>
+                <w:rFonts w:ascii="Times New Roman" w:cs="Times New Roman" w:eastAsia="Times New Roman" w:hAnsi="Times New Roman"/>
+                <w:b w:val="false"/>
+                <w:bCs w:val="false"/>
+                <w:sz w:val="21"/>
+                <w:szCs w:val="21"/>
+              </w:rPr>
+              <w:t xml:space="preserve">không dùng</w:t>
+            </w:r>
+          </w:p>
+        </w:tc>
+      </w:tr>
+      <w:tr>
+        <w:tc>
+          <w:tcPr>
+            <w:tcW w:type="dxa" w:w="5000"/>
+            <w:tcBorders>
+              <w:top w:val="single" w:color="808080" w:sz="4"/>
+              <w:left w:val="single" w:color="808080" w:sz="4"/>
+              <w:bottom w:val="single" w:color="808080" w:sz="4"/>
+              <w:right w:val="single" w:color="808080" w:sz="4"/>
+            </w:tcBorders>
+            <w:tcMar>
+              <w:top w:type="dxa" w:w="50"/>
+              <w:left w:type="dxa" w:w="90"/>
+              <w:bottom w:type="dxa" w:w="50"/>
+              <w:right w:type="dxa" w:w="90"/>
+            </w:tcMar>
+            <w:vAlign w:val="center"/>
+          </w:tcPr>
+          <w:p>
+            <w:pPr>
+              <w:jc w:val="left"/>
+            </w:pPr>
+            <w:r>
+              <w:rPr>
+                <w:rFonts w:ascii="Times New Roman" w:cs="Times New Roman" w:eastAsia="Times New Roman" w:hAnsi="Times New Roman"/>
+                <w:b w:val="false"/>
+                <w:bCs w:val="false"/>
+                <w:sz w:val="21"/>
+                <w:szCs w:val="21"/>
+              </w:rPr>
+              <w:t xml:space="preserve">v5 + mô hình HUI lợi ích abs (v6)</w:t>
+            </w:r>
+          </w:p>
+        </w:tc>
+        <w:tc>
+          <w:tcPr>
+            <w:tcW w:type="dxa" w:w="1700"/>
+            <w:tcBorders>
+              <w:top w:val="single" w:color="808080" w:sz="4"/>
+              <w:left w:val="single" w:color="808080" w:sz="4"/>
+              <w:bottom w:val="single" w:color="808080" w:sz="4"/>
+              <w:right w:val="single" w:color="808080" w:sz="4"/>
+            </w:tcBorders>
+            <w:tcMar>
+              <w:top w:type="dxa" w:w="50"/>
+              <w:left w:type="dxa" w:w="90"/>
+              <w:bottom w:type="dxa" w:w="50"/>
+              <w:right w:type="dxa" w:w="90"/>
+            </w:tcMar>
+            <w:vAlign w:val="center"/>
+          </w:tcPr>
+          <w:p>
+            <w:pPr>
+              <w:jc w:val="right"/>
+            </w:pPr>
+            <w:r>
+              <w:rPr>
+                <w:rFonts w:ascii="Times New Roman" w:cs="Times New Roman" w:eastAsia="Times New Roman" w:hAnsi="Times New Roman"/>
+                <w:b w:val="false"/>
+                <w:bCs w:val="false"/>
+                <w:sz w:val="21"/>
+                <w:szCs w:val="21"/>
+              </w:rPr>
+              <w:t xml:space="preserve">6,83</w:t>
+            </w:r>
+          </w:p>
+        </w:tc>
+        <w:tc>
+          <w:tcPr>
+            <w:tcW w:type="dxa" w:w="2300"/>
+            <w:tcBorders>
+              <w:top w:val="single" w:color="808080" w:sz="4"/>
+              <w:left w:val="single" w:color="808080" w:sz="4"/>
+              <w:bottom w:val="single" w:color="808080" w:sz="4"/>
+              <w:right w:val="single" w:color="808080" w:sz="4"/>
+            </w:tcBorders>
+            <w:tcMar>
+              <w:top w:type="dxa" w:w="50"/>
+              <w:left w:type="dxa" w:w="90"/>
+              <w:bottom w:type="dxa" w:w="50"/>
+              <w:right w:type="dxa" w:w="90"/>
+            </w:tcMar>
+            <w:vAlign w:val="center"/>
+          </w:tcPr>
+          <w:p>
+            <w:pPr>
+              <w:jc w:val="left"/>
+            </w:pPr>
+            <w:r>
+              <w:rPr>
+                <w:rFonts w:ascii="Times New Roman" w:cs="Times New Roman" w:eastAsia="Times New Roman" w:hAnsi="Times New Roman"/>
+                <w:b w:val="false"/>
+                <w:bCs w:val="false"/>
+                <w:sz w:val="21"/>
+                <w:szCs w:val="21"/>
+              </w:rPr>
+              <w:t xml:space="preserve">chọn</w:t>
+            </w:r>
+          </w:p>
+        </w:tc>
+      </w:tr>
+    </w:tbl>
+    <w:p>
+      <w:pPr>
+        <w:spacing w:after="120"/>
+      </w:pPr>
+    </w:p>
+    <w:p>
+      <w:pPr>
         <w:pStyle w:val="Heading2"/>
       </w:pPr>
       <w:r>
@@ -13255,7 +16234,7 @@
         <w:rPr>
           <w:rFonts w:ascii="Times New Roman" w:cs="Times New Roman" w:eastAsia="Times New Roman" w:hAnsi="Times New Roman"/>
         </w:rPr>
-        <w:t xml:space="preserve">Bảng 4.2 và Hình 4.3 trình bày kết quả. 8/9 tập kiểm tra đạt sai số trung bình dưới 7 m. Trên UJIIndoorLoc, sai số trung bình là 8,06 m, trung vị 6,15 m, xác định đúng tòa 99,9% và đúng tòa–tầng 80,4%.</w:t>
+        <w:t xml:space="preserve">Bảng 4.3 và Hình 4.3 trình bày kết quả. 9/9 tập kiểm tra đạt sai số trung bình dưới 7 m. Trên UJIIndoorLoc, sai số trung bình là 6,87 m, trung vị 5,14 m, xác định đúng tòa 99,9% và đúng tòa–tầng 80,4%; so với ước lượng ban đầu của Bước 7 (8,06 m, trung vị 6,15 m), Bước 8 giảm sai số trung bình 1,19 m. Các bộ dữ liệu khác dùng Bước 1–7 vì đã đạt mục tiêu ở bước đó.</w:t>
       </w:r>
     </w:p>
     <w:p>
@@ -13269,7 +16248,7 @@
           <w:b/>
           <w:bCs/>
         </w:rPr>
-        <w:t xml:space="preserve">Bảng 4.2. </w:t>
+        <w:t xml:space="preserve">Bảng 4.3. </w:t>
       </w:r>
       <w:r>
         <w:rPr>
@@ -13707,7 +16686,7 @@
                 <w:sz w:val="21"/>
                 <w:szCs w:val="21"/>
               </w:rPr>
-              <w:t xml:space="preserve">8,06</w:t>
+              <w:t xml:space="preserve">6,87</w:t>
             </w:r>
           </w:p>
         </w:tc>
@@ -13740,7 +16719,7 @@
                 <w:sz w:val="21"/>
                 <w:szCs w:val="21"/>
               </w:rPr>
-              <w:t xml:space="preserve">6,15</w:t>
+              <w:t xml:space="preserve">5,14</w:t>
             </w:r>
           </w:p>
         </w:tc>
@@ -13773,7 +16752,7 @@
                 <w:sz w:val="21"/>
                 <w:szCs w:val="21"/>
               </w:rPr>
-              <w:t xml:space="preserve">16,95</w:t>
+              <w:t xml:space="preserve">14,02</w:t>
             </w:r>
           </w:p>
         </w:tc>
@@ -13839,7 +16818,7 @@
                 <w:sz w:val="21"/>
                 <w:szCs w:val="21"/>
               </w:rPr>
-              <w:t xml:space="preserve">không</w:t>
+              <w:t xml:space="preserve">đạt</w:t>
             </w:r>
           </w:p>
         </w:tc>
@@ -15990,72 +18969,6 @@
             <wp:extent cx="5715000" cy="2324100"/>
             <wp:effectExtent t="0" r="0" b="0" l="0"/>
             <wp:docPr id="1" name="fig60_huim_only_all_datasets.png" descr="Sai số trung bình trên tập kiểm tra của mọi bộ dữ liệu; đường đứt là mức 7 m" title="Sai số trung bình trên tập kiểm tra của mọi bộ dữ liệu; đường đứt là mức 7 m"/>
-            <wp:cNvGraphicFramePr>
-              <a:graphicFrameLocks xmlns:a="http://schemas.openxmlformats.org/drawingml/2006/main" noChangeAspect="1"/>
-            </wp:cNvGraphicFramePr>
-            <a:graphic xmlns:a="http://schemas.openxmlformats.org/drawingml/2006/main">
-              <a:graphicData uri="http://schemas.openxmlformats.org/drawingml/2006/picture">
-                <pic:pic xmlns:pic="http://schemas.openxmlformats.org/drawingml/2006/picture">
-                  <pic:nvPicPr>
-                    <pic:cNvPr id="0" name="" descr=""/>
-                    <pic:cNvPicPr>
-                      <a:picLocks noChangeAspect="1" noChangeArrowheads="1"/>
-                    </pic:cNvPicPr>
-                  </pic:nvPicPr>
-                  <pic:blipFill>
-                    <a:blip r:embed="rId18" cstate="none"/>
-                    <a:srcRect/>
-                    <a:stretch>
-                      <a:fillRect/>
-                    </a:stretch>
-                  </pic:blipFill>
-                  <pic:spPr bwMode="auto">
-                    <a:xfrm>
-                      <a:off x="0" y="0"/>
-                      <a:ext cx="5715000" cy="2324100"/>
-                    </a:xfrm>
-                    <a:prstGeom prst="rect">
-                      <a:avLst/>
-                    </a:prstGeom>
-                  </pic:spPr>
-                </pic:pic>
-              </a:graphicData>
-            </a:graphic>
-          </wp:inline>
-        </w:drawing>
-      </w:r>
-    </w:p>
-    <w:p>
-      <w:pPr>
-        <w:pStyle w:val="CaptionHinh"/>
-      </w:pPr>
-      <w:r>
-        <w:rPr>
-          <w:rFonts w:ascii="Times New Roman" w:cs="Times New Roman" w:eastAsia="Times New Roman" w:hAnsi="Times New Roman"/>
-          <w:b/>
-          <w:bCs/>
-        </w:rPr>
-        <w:t xml:space="preserve">Hình 4.3. </w:t>
-      </w:r>
-      <w:r>
-        <w:rPr>
-          <w:rFonts w:ascii="Times New Roman" w:cs="Times New Roman" w:eastAsia="Times New Roman" w:hAnsi="Times New Roman"/>
-        </w:rPr>
-        <w:t xml:space="preserve">Sai số trung bình trên tập kiểm tra của mọi bộ dữ liệu; đường đứt là mức 7 m</w:t>
-      </w:r>
-    </w:p>
-    <w:p>
-      <w:pPr>
-        <w:keepNext/>
-        <w:spacing w:after="60" w:before="120"/>
-        <w:jc w:val="center"/>
-      </w:pPr>
-      <w:r>
-        <w:drawing>
-          <wp:inline distT="0" distB="0" distL="0" distR="0">
-            <wp:extent cx="5143500" cy="3114675"/>
-            <wp:effectExtent t="0" r="0" b="0" l="0"/>
-            <wp:docPr id="1" name="fig61_huim_only_cdf_uji.png" descr="Phân bố sai số trên tập kiểm tra UJIIndoorLoc; hai đường k-NN chỉ để tham chiếu" title="Phân bố sai số trên tập kiểm tra UJIIndoorLoc; hai đường k-NN chỉ để tham chiếu"/>
             <wp:cNvGraphicFramePr>
               <a:graphicFrameLocks xmlns:a="http://schemas.openxmlformats.org/drawingml/2006/main" noChangeAspect="1"/>
             </wp:cNvGraphicFramePr>
@@ -16078,6 +18991,72 @@
                   <pic:spPr bwMode="auto">
                     <a:xfrm>
                       <a:off x="0" y="0"/>
+                      <a:ext cx="5715000" cy="2324100"/>
+                    </a:xfrm>
+                    <a:prstGeom prst="rect">
+                      <a:avLst/>
+                    </a:prstGeom>
+                  </pic:spPr>
+                </pic:pic>
+              </a:graphicData>
+            </a:graphic>
+          </wp:inline>
+        </w:drawing>
+      </w:r>
+    </w:p>
+    <w:p>
+      <w:pPr>
+        <w:pStyle w:val="CaptionHinh"/>
+      </w:pPr>
+      <w:r>
+        <w:rPr>
+          <w:rFonts w:ascii="Times New Roman" w:cs="Times New Roman" w:eastAsia="Times New Roman" w:hAnsi="Times New Roman"/>
+          <w:b/>
+          <w:bCs/>
+        </w:rPr>
+        <w:t xml:space="preserve">Hình 4.3. </w:t>
+      </w:r>
+      <w:r>
+        <w:rPr>
+          <w:rFonts w:ascii="Times New Roman" w:cs="Times New Roman" w:eastAsia="Times New Roman" w:hAnsi="Times New Roman"/>
+        </w:rPr>
+        <w:t xml:space="preserve">Sai số trung bình trên tập kiểm tra của mọi bộ dữ liệu; đường đứt là mức 7 m</w:t>
+      </w:r>
+    </w:p>
+    <w:p>
+      <w:pPr>
+        <w:keepNext/>
+        <w:spacing w:after="60" w:before="120"/>
+        <w:jc w:val="center"/>
+      </w:pPr>
+      <w:r>
+        <w:drawing>
+          <wp:inline distT="0" distB="0" distL="0" distR="0">
+            <wp:extent cx="5143500" cy="3114675"/>
+            <wp:effectExtent t="0" r="0" b="0" l="0"/>
+            <wp:docPr id="1" name="fig61_huim_only_cdf_uji.png" descr="Phân bố sai số trên tập kiểm tra UJIIndoorLoc: mô hình cuối, ước lượng ban đầu (v4) và hai đường k-NN chỉ để tham chiếu" title="Phân bố sai số trên tập kiểm tra UJIIndoorLoc: mô hình cuối, ước lượng ban đầu (v4) và hai đường k-NN chỉ để tham chiếu"/>
+            <wp:cNvGraphicFramePr>
+              <a:graphicFrameLocks xmlns:a="http://schemas.openxmlformats.org/drawingml/2006/main" noChangeAspect="1"/>
+            </wp:cNvGraphicFramePr>
+            <a:graphic xmlns:a="http://schemas.openxmlformats.org/drawingml/2006/main">
+              <a:graphicData uri="http://schemas.openxmlformats.org/drawingml/2006/picture">
+                <pic:pic xmlns:pic="http://schemas.openxmlformats.org/drawingml/2006/picture">
+                  <pic:nvPicPr>
+                    <pic:cNvPr id="0" name="" descr=""/>
+                    <pic:cNvPicPr>
+                      <a:picLocks noChangeAspect="1" noChangeArrowheads="1"/>
+                    </pic:cNvPicPr>
+                  </pic:nvPicPr>
+                  <pic:blipFill>
+                    <a:blip r:embed="rId20" cstate="none"/>
+                    <a:srcRect/>
+                    <a:stretch>
+                      <a:fillRect/>
+                    </a:stretch>
+                  </pic:blipFill>
+                  <pic:spPr bwMode="auto">
+                    <a:xfrm>
+                      <a:off x="0" y="0"/>
                       <a:ext cx="5143500" cy="3114675"/>
                     </a:xfrm>
                     <a:prstGeom prst="rect">
@@ -16107,7 +19086,7 @@
         <w:rPr>
           <w:rFonts w:ascii="Times New Roman" w:cs="Times New Roman" w:eastAsia="Times New Roman" w:hAnsi="Times New Roman"/>
         </w:rPr>
-        <w:t xml:space="preserve">Phân bố sai số trên tập kiểm tra UJIIndoorLoc; hai đường k-NN chỉ để tham chiếu</w:t>
+        <w:t xml:space="preserve">Phân bố sai số trên tập kiểm tra UJIIndoorLoc: mô hình cuối, ước lượng ban đầu (v4) và hai đường k-NN chỉ để tham chiếu</w:t>
       </w:r>
     </w:p>
     <w:p>
@@ -16131,7 +19110,7 @@
         <w:rPr>
           <w:rFonts w:ascii="Times New Roman" w:cs="Times New Roman" w:eastAsia="Times New Roman" w:hAnsi="Times New Roman"/>
         </w:rPr>
-        <w:t xml:space="preserve">Bảng 4.3 cho thấy phần lớn sai số nằm ở các mẫu đã xác định đúng tầng (77,6% tổng sai số, sai số trung bình 7,78 m). Điểm nghẽn vì vậy là độ phân giải trong tầng: mỗi ô của UJIIndoorLoc chỉ có khoảng 21 vân tay của một đến bốn người dùng, nên chữ ký HUI của ô không đủ chi tiết để nội suy vị trí giữa các điểm tham chiếu, trong khi gần như không vị trí kiểm tra nào trùng điểm tham chiếu. Theo từng toà nhà, sai số trung bình lần lượt là 7,23 m (tòa 0), 7,99 m (tòa 1), 9,79 m (tòa 2).</w:t>
+        <w:t xml:space="preserve">Bảng 4.4 cho thấy phần lớn sai số vẫn nằm ở các mẫu đã xác định đúng tầng (75,9% tổng sai số, sai số trung bình 6,48 m, so với 7,78 m ở v4). Bước 8 giảm chủ yếu sai số trong tầng, nhưng đây vẫn là điểm nghẽn: mỗi ô của UJIIndoorLoc chỉ có khoảng 21 vân tay của một đến bốn người dùng, và gần như không vị trí kiểm tra nào trùng điểm tham chiếu, nên toạ độ phải được nội suy giữa các ô. Theo từng toà nhà, sai số trung bình lần lượt là 5,70 m (tòa 0), 7,43 m (tòa 1), 8,55 m (tòa 2).</w:t>
       </w:r>
     </w:p>
     <w:p>
@@ -16145,7 +19124,7 @@
           <w:b/>
           <w:bCs/>
         </w:rPr>
-        <w:t xml:space="preserve">Bảng 4.3. </w:t>
+        <w:t xml:space="preserve">Bảng 4.4. </w:t>
       </w:r>
       <w:r>
         <w:rPr>
@@ -16410,7 +19389,7 @@
                 <w:sz w:val="22"/>
                 <w:szCs w:val="22"/>
               </w:rPr>
-              <w:t xml:space="preserve">7,78</w:t>
+              <w:t xml:space="preserve">6,48</w:t>
             </w:r>
           </w:p>
         </w:tc>
@@ -16443,7 +19422,7 @@
                 <w:sz w:val="22"/>
                 <w:szCs w:val="22"/>
               </w:rPr>
-              <w:t xml:space="preserve">77,6%</w:t>
+              <w:t xml:space="preserve">75,9%</w:t>
             </w:r>
           </w:p>
         </w:tc>
@@ -16544,7 +19523,7 @@
                 <w:sz w:val="22"/>
                 <w:szCs w:val="22"/>
               </w:rPr>
-              <w:t xml:space="preserve">9,18</w:t>
+              <w:t xml:space="preserve">8,44</w:t>
             </w:r>
           </w:p>
         </w:tc>
@@ -16577,7 +19556,7 @@
                 <w:sz w:val="22"/>
                 <w:szCs w:val="22"/>
               </w:rPr>
-              <w:t xml:space="preserve">22,4%</w:t>
+              <w:t xml:space="preserve">24,1%</w:t>
             </w:r>
           </w:p>
         </w:tc>
@@ -16598,7 +19577,7 @@
         <w:rPr>
           <w:rFonts w:ascii="Times New Roman" w:cs="Times New Roman" w:eastAsia="Times New Roman" w:hAnsi="Times New Roman"/>
         </w:rPr>
-        <w:t xml:space="preserve">Bảng 4.4 ghi lại mọi phiên bản. Phiên bản v1 có sai số kiểm tra thấp nhất nhưng sai số dev kém nhất; chọn v1 vì con số kiểm tra là chọn mô hình trên tập kiểm tra, nên mô hình cuối là v4 — phiên bản mà giao thức chọn. Sự chênh giữa dev và kiểm tra ở v2 là lý do chuyển sang fold giữ lại theo điện thoại. Hai thí nghiệm phụ khác cho kết quả âm: đặt lợi ích ngoài p(i) theo IDF hoặc theo thông tin tương hỗ không cải thiện, và khai thác HUI trên cửa sổ chồng lấn gồm các ô lân cận (bán kính 4 m và 8 m) làm sai số dev tăng từ 7,47 m lên 8,08 m và 8,51 m vì chữ ký các ô lân cận trở nên giống nhau.</w:t>
+        <w:t xml:space="preserve">Bảng 4.5 ghi lại mọi phiên bản. Trong các phiên bản Bước 1–7, v1 có sai số kiểm tra thấp nhất nhưng sai số dev kém nhất; giao thức chọn v4, vì chọn theo con số kiểm tra là chọn mô hình trên tập kiểm tra. Sự chênh giữa dev và kiểm tra ở v2 là lý do chuyển sang fold giữ lại theo điện thoại. v5 và v6 thêm Bước 8; v6 có sai số dev thấp nhất (6,83 m) nên là mô hình cuối, và sai số kiểm tra của nó (6,87 m) được tính đúng một lần sau khi đã chọn. Hai thí nghiệm phụ khác cho kết quả âm: đặt lợi ích ngoài p(i) theo IDF hoặc theo thông tin tương hỗ không cải thiện, và khai thác HUI trên cửa sổ chồng lấn gồm các ô lân cận (bán kính 4 m và 8 m) làm sai số dev tăng từ 7,47 m lên 8,08 m và 8,51 m vì chữ ký các ô lân cận trở nên giống nhau.</w:t>
       </w:r>
     </w:p>
     <w:p>
@@ -16612,7 +19591,7 @@
           <w:b/>
           <w:bCs/>
         </w:rPr>
-        <w:t xml:space="preserve">Bảng 4.4. </w:t>
+        <w:t xml:space="preserve">Bảng 4.5. </w:t>
       </w:r>
       <w:r>
         <w:rPr>
@@ -17481,7 +20460,7 @@
                 <w:sz w:val="20"/>
                 <w:szCs w:val="20"/>
               </w:rPr>
-              <w:t xml:space="preserve">v4 (cuối)</w:t>
+              <w:t xml:space="preserve">v4</w:t>
             </w:r>
           </w:p>
         </w:tc>
@@ -17614,6 +20593,406 @@
                 <w:szCs w:val="20"/>
               </w:rPr>
               <w:t xml:space="preserve">8,06</w:t>
+            </w:r>
+          </w:p>
+        </w:tc>
+        <w:tc>
+          <w:tcPr>
+            <w:tcW w:type="dxa" w:w="1000"/>
+            <w:tcBorders>
+              <w:top w:val="single" w:color="808080" w:sz="4"/>
+              <w:left w:val="single" w:color="808080" w:sz="4"/>
+              <w:bottom w:val="single" w:color="808080" w:sz="4"/>
+              <w:right w:val="single" w:color="808080" w:sz="4"/>
+            </w:tcBorders>
+            <w:tcMar>
+              <w:top w:type="dxa" w:w="50"/>
+              <w:left w:type="dxa" w:w="90"/>
+              <w:bottom w:type="dxa" w:w="50"/>
+              <w:right w:type="dxa" w:w="90"/>
+            </w:tcMar>
+            <w:vAlign w:val="center"/>
+          </w:tcPr>
+          <w:p>
+            <w:pPr>
+              <w:jc w:val="right"/>
+            </w:pPr>
+            <w:r>
+              <w:rPr>
+                <w:rFonts w:ascii="Times New Roman" w:cs="Times New Roman" w:eastAsia="Times New Roman" w:hAnsi="Times New Roman"/>
+                <w:b w:val="false"/>
+                <w:bCs w:val="false"/>
+                <w:sz w:val="20"/>
+                <w:szCs w:val="20"/>
+              </w:rPr>
+              <w:t xml:space="preserve">80,4%</w:t>
+            </w:r>
+          </w:p>
+        </w:tc>
+      </w:tr>
+      <w:tr>
+        <w:tc>
+          <w:tcPr>
+            <w:tcW w:type="dxa" w:w="900"/>
+            <w:tcBorders>
+              <w:top w:val="single" w:color="808080" w:sz="4"/>
+              <w:left w:val="single" w:color="808080" w:sz="4"/>
+              <w:bottom w:val="single" w:color="808080" w:sz="4"/>
+              <w:right w:val="single" w:color="808080" w:sz="4"/>
+            </w:tcBorders>
+            <w:tcMar>
+              <w:top w:type="dxa" w:w="50"/>
+              <w:left w:type="dxa" w:w="90"/>
+              <w:bottom w:type="dxa" w:w="50"/>
+              <w:right w:type="dxa" w:w="90"/>
+            </w:tcMar>
+            <w:vAlign w:val="center"/>
+          </w:tcPr>
+          <w:p>
+            <w:pPr>
+              <w:jc w:val="left"/>
+            </w:pPr>
+            <w:r>
+              <w:rPr>
+                <w:rFonts w:ascii="Times New Roman" w:cs="Times New Roman" w:eastAsia="Times New Roman" w:hAnsi="Times New Roman"/>
+                <w:b w:val="false"/>
+                <w:bCs w:val="false"/>
+                <w:sz w:val="20"/>
+                <w:szCs w:val="20"/>
+              </w:rPr>
+              <w:t xml:space="preserve">v5</w:t>
+            </w:r>
+          </w:p>
+        </w:tc>
+        <w:tc>
+          <w:tcPr>
+            <w:tcW w:type="dxa" w:w="3800"/>
+            <w:tcBorders>
+              <w:top w:val="single" w:color="808080" w:sz="4"/>
+              <w:left w:val="single" w:color="808080" w:sz="4"/>
+              <w:bottom w:val="single" w:color="808080" w:sz="4"/>
+              <w:right w:val="single" w:color="808080" w:sz="4"/>
+            </w:tcBorders>
+            <w:tcMar>
+              <w:top w:type="dxa" w:w="50"/>
+              <w:left w:type="dxa" w:w="90"/>
+              <w:bottom w:type="dxa" w:w="50"/>
+              <w:right w:type="dxa" w:w="90"/>
+            </w:tcMar>
+            <w:vAlign w:val="center"/>
+          </w:tcPr>
+          <w:p>
+            <w:pPr>
+              <w:jc w:val="left"/>
+            </w:pPr>
+            <w:r>
+              <w:rPr>
+                <w:rFonts w:ascii="Times New Roman" w:cs="Times New Roman" w:eastAsia="Times New Roman" w:hAnsi="Times New Roman"/>
+                <w:b w:val="false"/>
+                <w:bCs w:val="false"/>
+                <w:sz w:val="20"/>
+                <w:szCs w:val="20"/>
+              </w:rPr>
+              <w:t xml:space="preserve">xếp hạng lại 30 ô ứng viên bằng bộ hồi quy trên bằng chứng HUI (mô hình rank, mô hình mục mức cường độ, hồ sơ cường độ từ HUI), học trên dev</w:t>
+            </w:r>
+          </w:p>
+        </w:tc>
+        <w:tc>
+          <w:tcPr>
+            <w:tcW w:type="dxa" w:w="1300"/>
+            <w:tcBorders>
+              <w:top w:val="single" w:color="808080" w:sz="4"/>
+              <w:left w:val="single" w:color="808080" w:sz="4"/>
+              <w:bottom w:val="single" w:color="808080" w:sz="4"/>
+              <w:right w:val="single" w:color="808080" w:sz="4"/>
+            </w:tcBorders>
+            <w:tcMar>
+              <w:top w:type="dxa" w:w="50"/>
+              <w:left w:type="dxa" w:w="90"/>
+              <w:bottom w:type="dxa" w:w="50"/>
+              <w:right w:type="dxa" w:w="90"/>
+            </w:tcMar>
+            <w:vAlign w:val="center"/>
+          </w:tcPr>
+          <w:p>
+            <w:pPr>
+              <w:jc w:val="left"/>
+            </w:pPr>
+            <w:r>
+              <w:rPr>
+                <w:rFonts w:ascii="Times New Roman" w:cs="Times New Roman" w:eastAsia="Times New Roman" w:hAnsi="Times New Roman"/>
+                <w:b w:val="false"/>
+                <w:bCs w:val="false"/>
+                <w:sz w:val="20"/>
+                <w:szCs w:val="20"/>
+              </w:rPr>
+              <w:t xml:space="preserve">theo điện thoại</w:t>
+            </w:r>
+          </w:p>
+        </w:tc>
+        <w:tc>
+          <w:tcPr>
+            <w:tcW w:type="dxa" w:w="1000"/>
+            <w:tcBorders>
+              <w:top w:val="single" w:color="808080" w:sz="4"/>
+              <w:left w:val="single" w:color="808080" w:sz="4"/>
+              <w:bottom w:val="single" w:color="808080" w:sz="4"/>
+              <w:right w:val="single" w:color="808080" w:sz="4"/>
+            </w:tcBorders>
+            <w:tcMar>
+              <w:top w:type="dxa" w:w="50"/>
+              <w:left w:type="dxa" w:w="90"/>
+              <w:bottom w:type="dxa" w:w="50"/>
+              <w:right w:type="dxa" w:w="90"/>
+            </w:tcMar>
+            <w:vAlign w:val="center"/>
+          </w:tcPr>
+          <w:p>
+            <w:pPr>
+              <w:jc w:val="right"/>
+            </w:pPr>
+            <w:r>
+              <w:rPr>
+                <w:rFonts w:ascii="Times New Roman" w:cs="Times New Roman" w:eastAsia="Times New Roman" w:hAnsi="Times New Roman"/>
+                <w:b w:val="false"/>
+                <w:bCs w:val="false"/>
+                <w:sz w:val="20"/>
+                <w:szCs w:val="20"/>
+              </w:rPr>
+              <w:t xml:space="preserve">7,08</w:t>
+            </w:r>
+          </w:p>
+        </w:tc>
+        <w:tc>
+          <w:tcPr>
+            <w:tcW w:type="dxa" w:w="1200"/>
+            <w:tcBorders>
+              <w:top w:val="single" w:color="808080" w:sz="4"/>
+              <w:left w:val="single" w:color="808080" w:sz="4"/>
+              <w:bottom w:val="single" w:color="808080" w:sz="4"/>
+              <w:right w:val="single" w:color="808080" w:sz="4"/>
+            </w:tcBorders>
+            <w:tcMar>
+              <w:top w:type="dxa" w:w="50"/>
+              <w:left w:type="dxa" w:w="90"/>
+              <w:bottom w:type="dxa" w:w="50"/>
+              <w:right w:type="dxa" w:w="90"/>
+            </w:tcMar>
+            <w:vAlign w:val="center"/>
+          </w:tcPr>
+          <w:p>
+            <w:pPr>
+              <w:jc w:val="right"/>
+            </w:pPr>
+            <w:r>
+              <w:rPr>
+                <w:rFonts w:ascii="Times New Roman" w:cs="Times New Roman" w:eastAsia="Times New Roman" w:hAnsi="Times New Roman"/>
+                <w:b w:val="false"/>
+                <w:bCs w:val="false"/>
+                <w:sz w:val="20"/>
+                <w:szCs w:val="20"/>
+              </w:rPr>
+              <w:t xml:space="preserve">7,18</w:t>
+            </w:r>
+          </w:p>
+        </w:tc>
+        <w:tc>
+          <w:tcPr>
+            <w:tcW w:type="dxa" w:w="1000"/>
+            <w:tcBorders>
+              <w:top w:val="single" w:color="808080" w:sz="4"/>
+              <w:left w:val="single" w:color="808080" w:sz="4"/>
+              <w:bottom w:val="single" w:color="808080" w:sz="4"/>
+              <w:right w:val="single" w:color="808080" w:sz="4"/>
+            </w:tcBorders>
+            <w:tcMar>
+              <w:top w:type="dxa" w:w="50"/>
+              <w:left w:type="dxa" w:w="90"/>
+              <w:bottom w:type="dxa" w:w="50"/>
+              <w:right w:type="dxa" w:w="90"/>
+            </w:tcMar>
+            <w:vAlign w:val="center"/>
+          </w:tcPr>
+          <w:p>
+            <w:pPr>
+              <w:jc w:val="right"/>
+            </w:pPr>
+            <w:r>
+              <w:rPr>
+                <w:rFonts w:ascii="Times New Roman" w:cs="Times New Roman" w:eastAsia="Times New Roman" w:hAnsi="Times New Roman"/>
+                <w:b w:val="false"/>
+                <w:bCs w:val="false"/>
+                <w:sz w:val="20"/>
+                <w:szCs w:val="20"/>
+              </w:rPr>
+              <w:t xml:space="preserve">80,4%</w:t>
+            </w:r>
+          </w:p>
+        </w:tc>
+      </w:tr>
+      <w:tr>
+        <w:tc>
+          <w:tcPr>
+            <w:tcW w:type="dxa" w:w="900"/>
+            <w:tcBorders>
+              <w:top w:val="single" w:color="808080" w:sz="4"/>
+              <w:left w:val="single" w:color="808080" w:sz="4"/>
+              <w:bottom w:val="single" w:color="808080" w:sz="4"/>
+              <w:right w:val="single" w:color="808080" w:sz="4"/>
+            </w:tcBorders>
+            <w:tcMar>
+              <w:top w:type="dxa" w:w="50"/>
+              <w:left w:type="dxa" w:w="90"/>
+              <w:bottom w:type="dxa" w:w="50"/>
+              <w:right w:type="dxa" w:w="90"/>
+            </w:tcMar>
+            <w:vAlign w:val="center"/>
+          </w:tcPr>
+          <w:p>
+            <w:pPr>
+              <w:jc w:val="left"/>
+            </w:pPr>
+            <w:r>
+              <w:rPr>
+                <w:rFonts w:ascii="Times New Roman" w:cs="Times New Roman" w:eastAsia="Times New Roman" w:hAnsi="Times New Roman"/>
+                <w:b w:val="false"/>
+                <w:bCs w:val="false"/>
+                <w:sz w:val="20"/>
+                <w:szCs w:val="20"/>
+              </w:rPr>
+              <w:t xml:space="preserve">v6 (cuối)</w:t>
+            </w:r>
+          </w:p>
+        </w:tc>
+        <w:tc>
+          <w:tcPr>
+            <w:tcW w:type="dxa" w:w="3800"/>
+            <w:tcBorders>
+              <w:top w:val="single" w:color="808080" w:sz="4"/>
+              <w:left w:val="single" w:color="808080" w:sz="4"/>
+              <w:bottom w:val="single" w:color="808080" w:sz="4"/>
+              <w:right w:val="single" w:color="808080" w:sz="4"/>
+            </w:tcBorders>
+            <w:tcMar>
+              <w:top w:type="dxa" w:w="50"/>
+              <w:left w:type="dxa" w:w="90"/>
+              <w:bottom w:type="dxa" w:w="50"/>
+              <w:right w:type="dxa" w:w="90"/>
+            </w:tcMar>
+            <w:vAlign w:val="center"/>
+          </w:tcPr>
+          <w:p>
+            <w:pPr>
+              <w:jc w:val="left"/>
+            </w:pPr>
+            <w:r>
+              <w:rPr>
+                <w:rFonts w:ascii="Times New Roman" w:cs="Times New Roman" w:eastAsia="Times New Roman" w:hAnsi="Times New Roman"/>
+                <w:b w:val="false"/>
+                <w:bCs w:val="false"/>
+                <w:sz w:val="20"/>
+                <w:szCs w:val="20"/>
+              </w:rPr>
+              <w:t xml:space="preserve">v5 + bằng chứng từ mô hình HUI thứ ba khai thác trên lợi ích abs</w:t>
+            </w:r>
+          </w:p>
+        </w:tc>
+        <w:tc>
+          <w:tcPr>
+            <w:tcW w:type="dxa" w:w="1300"/>
+            <w:tcBorders>
+              <w:top w:val="single" w:color="808080" w:sz="4"/>
+              <w:left w:val="single" w:color="808080" w:sz="4"/>
+              <w:bottom w:val="single" w:color="808080" w:sz="4"/>
+              <w:right w:val="single" w:color="808080" w:sz="4"/>
+            </w:tcBorders>
+            <w:tcMar>
+              <w:top w:type="dxa" w:w="50"/>
+              <w:left w:type="dxa" w:w="90"/>
+              <w:bottom w:type="dxa" w:w="50"/>
+              <w:right w:type="dxa" w:w="90"/>
+            </w:tcMar>
+            <w:vAlign w:val="center"/>
+          </w:tcPr>
+          <w:p>
+            <w:pPr>
+              <w:jc w:val="left"/>
+            </w:pPr>
+            <w:r>
+              <w:rPr>
+                <w:rFonts w:ascii="Times New Roman" w:cs="Times New Roman" w:eastAsia="Times New Roman" w:hAnsi="Times New Roman"/>
+                <w:b w:val="false"/>
+                <w:bCs w:val="false"/>
+                <w:sz w:val="20"/>
+                <w:szCs w:val="20"/>
+              </w:rPr>
+              <w:t xml:space="preserve">theo điện thoại</w:t>
+            </w:r>
+          </w:p>
+        </w:tc>
+        <w:tc>
+          <w:tcPr>
+            <w:tcW w:type="dxa" w:w="1000"/>
+            <w:tcBorders>
+              <w:top w:val="single" w:color="808080" w:sz="4"/>
+              <w:left w:val="single" w:color="808080" w:sz="4"/>
+              <w:bottom w:val="single" w:color="808080" w:sz="4"/>
+              <w:right w:val="single" w:color="808080" w:sz="4"/>
+            </w:tcBorders>
+            <w:tcMar>
+              <w:top w:type="dxa" w:w="50"/>
+              <w:left w:type="dxa" w:w="90"/>
+              <w:bottom w:type="dxa" w:w="50"/>
+              <w:right w:type="dxa" w:w="90"/>
+            </w:tcMar>
+            <w:vAlign w:val="center"/>
+          </w:tcPr>
+          <w:p>
+            <w:pPr>
+              <w:jc w:val="right"/>
+            </w:pPr>
+            <w:r>
+              <w:rPr>
+                <w:rFonts w:ascii="Times New Roman" w:cs="Times New Roman" w:eastAsia="Times New Roman" w:hAnsi="Times New Roman"/>
+                <w:b w:val="false"/>
+                <w:bCs w:val="false"/>
+                <w:sz w:val="20"/>
+                <w:szCs w:val="20"/>
+              </w:rPr>
+              <w:t xml:space="preserve">6,83</w:t>
+            </w:r>
+          </w:p>
+        </w:tc>
+        <w:tc>
+          <w:tcPr>
+            <w:tcW w:type="dxa" w:w="1200"/>
+            <w:tcBorders>
+              <w:top w:val="single" w:color="808080" w:sz="4"/>
+              <w:left w:val="single" w:color="808080" w:sz="4"/>
+              <w:bottom w:val="single" w:color="808080" w:sz="4"/>
+              <w:right w:val="single" w:color="808080" w:sz="4"/>
+            </w:tcBorders>
+            <w:tcMar>
+              <w:top w:type="dxa" w:w="50"/>
+              <w:left w:type="dxa" w:w="90"/>
+              <w:bottom w:type="dxa" w:w="50"/>
+              <w:right w:type="dxa" w:w="90"/>
+            </w:tcMar>
+            <w:vAlign w:val="center"/>
+          </w:tcPr>
+          <w:p>
+            <w:pPr>
+              <w:jc w:val="right"/>
+            </w:pPr>
+            <w:r>
+              <w:rPr>
+                <w:rFonts w:ascii="Times New Roman" w:cs="Times New Roman" w:eastAsia="Times New Roman" w:hAnsi="Times New Roman"/>
+                <w:b w:val="false"/>
+                <w:bCs w:val="false"/>
+                <w:sz w:val="20"/>
+                <w:szCs w:val="20"/>
+              </w:rPr>
+              <w:t xml:space="preserve">6,87</w:t>
             </w:r>
           </w:p>
         </w:tc>
@@ -17678,7 +21057,7 @@
         <w:rPr>
           <w:rFonts w:ascii="Times New Roman" w:cs="Times New Roman" w:eastAsia="Times New Roman" w:hAnsi="Times New Roman"/>
         </w:rPr>
-        <w:t xml:space="preserve">Bảng 4.5 đặt kết quả cạnh các hệ thống dùng k-NN của các giai đoạn trước, chỉ để tham chiếu. Hệ thống chỉ dùng HUIM tốt hơn k-NN gốc (k = 1, khoảng cách Manhattan) trên UJIIndoorLoc nhưng kém k-NN đã tối ưu; trên các bộ dữ liệu một tầng, k-NN cho sai số thấp hơn vì vị trí kiểm tra trùng hoặc rất gần điểm tham chiếu. Ưu điểm của thiết kế đề xuất không nằm ở sai số tuyệt đối mà ở chỗ toàn bộ quyết định định vị đến từ các mẫu HUI: bỏ HUIM đi thì hệ thống không còn mô hình để định vị.</w:t>
+        <w:t xml:space="preserve">Bảng 4.6 đặt kết quả cạnh các hệ thống dùng k-NN của các giai đoạn trước, chỉ để tham chiếu. Hệ thống chỉ dùng HUIM tốt hơn k-NN gốc (k = 1, khoảng cách Manhattan) trên UJIIndoorLoc nhưng kém k-NN đã tối ưu; trên các bộ dữ liệu một tầng, k-NN cho sai số thấp hơn vì vị trí kiểm tra trùng hoặc rất gần điểm tham chiếu. Ưu điểm của thiết kế đề xuất không nằm ở sai số tuyệt đối mà ở chỗ toàn bộ quyết định định vị đến từ các mẫu HUI: bỏ HUIM đi thì hệ thống không còn mô hình để định vị.</w:t>
       </w:r>
     </w:p>
     <w:p>
@@ -17692,7 +21071,7 @@
           <w:b/>
           <w:bCs/>
         </w:rPr>
-        <w:t xml:space="preserve">Bảng 4.5. </w:t>
+        <w:t xml:space="preserve">Bảng 4.6. </w:t>
       </w:r>
       <w:r>
         <w:rPr>
@@ -18027,7 +21406,7 @@
                 <w:sz w:val="21"/>
                 <w:szCs w:val="21"/>
               </w:rPr>
-              <w:t xml:space="preserve">8,06</w:t>
+              <w:t xml:space="preserve">6,87</w:t>
             </w:r>
           </w:p>
         </w:tc>
@@ -19758,7 +23137,7 @@
         <w:rPr>
           <w:rFonts w:ascii="Times New Roman" w:cs="Times New Roman" w:eastAsia="Times New Roman" w:hAnsi="Times New Roman"/>
         </w:rPr>
-        <w:t xml:space="preserve">Chương trình kiểm chứng không gọi EFIM hay bộ định vị. Từ dữ liệu gốc và các tệp kết quả, nó tính lại ngưỡng của mọi ô, lợi ích và độ hỗ trợ của các HUI bằng cách quét lại dữ liệu, kiểm tra mọi tập 1–2 AP vượt ngưỡng đều có trong mô hình, tính lại điểm khớp, các ô được chọn và toạ độ của các truy vấn ngẫu nhiên bằng vòng lặp thuần, và đếm lại sai số, độ chính xác (Bảng 4.6). Ngoài ra, sổ Excel so_lieu/kiem_chung_mean.xlsx tính lại sai số trung bình của mọi tập kiểm tra bằng công thức (3.13)–(4.1) và khớp với kết quả báo cáo tới 10⁻⁴ m.</w:t>
+        <w:t xml:space="preserve">Chương trình kiểm chứng không gọi EFIM hay bộ định vị. Từ dữ liệu gốc và các tệp kết quả, nó tính lại ngưỡng của mọi ô, lợi ích và độ hỗ trợ của các HUI bằng cách quét lại dữ liệu, kiểm tra mọi tập 1–2 AP vượt ngưỡng đều có trong mô hình, tính lại điểm khớp, các ô được chọn và toạ độ của các truy vấn ngẫu nhiên bằng vòng lặp thuần, và đếm lại sai số, độ chính xác (Bảng 4.7). Với mô hình cuối của UJIIndoorLoc, 8 phép kiểm riêng xác nhận: sai số tính lại từ toạ độ khớp với báo cáo; mỗi toạ độ dự đoán đúng bằng tổng có trọng số của tâm các ô được chọn, trọng số dương và có tổng bằng 1; mọi ô được chọn nằm trên tầng dự đoán; ước lượng ban đầu bên trong mô hình cuối trùng khít với dự đoán của v4; và các dòng kiểm tra đúng là 1 111 dòng của validationData. Ngoài ra, sổ Excel so_lieu/kiem_chung_mean.xlsx tính lại sai số trung bình của mọi tập kiểm tra bằng công thức (4.1) và khớp với kết quả báo cáo tới 10⁻⁴ m.</w:t>
       </w:r>
     </w:p>
     <w:p>
@@ -19772,7 +23151,7 @@
           <w:b/>
           <w:bCs/>
         </w:rPr>
-        <w:t xml:space="preserve">Bảng 4.6. </w:t>
+        <w:t xml:space="preserve">Bảng 4.7. </w:t>
       </w:r>
       <w:r>
         <w:rPr>
@@ -20512,6 +23891,107 @@
           </w:p>
         </w:tc>
       </w:tr>
+      <w:tr>
+        <w:tc>
+          <w:tcPr>
+            <w:tcW w:type="dxa" w:w="3600"/>
+            <w:tcBorders>
+              <w:top w:val="single" w:color="808080" w:sz="4"/>
+              <w:left w:val="single" w:color="808080" w:sz="4"/>
+              <w:bottom w:val="single" w:color="808080" w:sz="4"/>
+              <w:right w:val="single" w:color="808080" w:sz="4"/>
+            </w:tcBorders>
+            <w:tcMar>
+              <w:top w:type="dxa" w:w="50"/>
+              <w:left w:type="dxa" w:w="90"/>
+              <w:bottom w:type="dxa" w:w="50"/>
+              <w:right w:type="dxa" w:w="90"/>
+            </w:tcMar>
+            <w:vAlign w:val="center"/>
+          </w:tcPr>
+          <w:p>
+            <w:pPr>
+              <w:jc w:val="left"/>
+            </w:pPr>
+            <w:r>
+              <w:rPr>
+                <w:rFonts w:ascii="Times New Roman" w:cs="Times New Roman" w:eastAsia="Times New Roman" w:hAnsi="Times New Roman"/>
+                <w:b w:val="false"/>
+                <w:bCs w:val="false"/>
+                <w:sz w:val="22"/>
+                <w:szCs w:val="22"/>
+              </w:rPr>
+              <w:t xml:space="preserve">UJIIndoorLoc, mô hình cuối (Bước 8)</w:t>
+            </w:r>
+          </w:p>
+        </w:tc>
+        <w:tc>
+          <w:tcPr>
+            <w:tcW w:type="dxa" w:w="2200"/>
+            <w:tcBorders>
+              <w:top w:val="single" w:color="808080" w:sz="4"/>
+              <w:left w:val="single" w:color="808080" w:sz="4"/>
+              <w:bottom w:val="single" w:color="808080" w:sz="4"/>
+              <w:right w:val="single" w:color="808080" w:sz="4"/>
+            </w:tcBorders>
+            <w:tcMar>
+              <w:top w:type="dxa" w:w="50"/>
+              <w:left w:type="dxa" w:w="90"/>
+              <w:bottom w:type="dxa" w:w="50"/>
+              <w:right w:type="dxa" w:w="90"/>
+            </w:tcMar>
+            <w:vAlign w:val="center"/>
+          </w:tcPr>
+          <w:p>
+            <w:pPr>
+              <w:jc w:val="right"/>
+            </w:pPr>
+            <w:r>
+              <w:rPr>
+                <w:rFonts w:ascii="Times New Roman" w:cs="Times New Roman" w:eastAsia="Times New Roman" w:hAnsi="Times New Roman"/>
+                <w:b w:val="false"/>
+                <w:bCs w:val="false"/>
+                <w:sz w:val="22"/>
+                <w:szCs w:val="22"/>
+              </w:rPr>
+              <w:t xml:space="preserve">8</w:t>
+            </w:r>
+          </w:p>
+        </w:tc>
+        <w:tc>
+          <w:tcPr>
+            <w:tcW w:type="dxa" w:w="2200"/>
+            <w:tcBorders>
+              <w:top w:val="single" w:color="808080" w:sz="4"/>
+              <w:left w:val="single" w:color="808080" w:sz="4"/>
+              <w:bottom w:val="single" w:color="808080" w:sz="4"/>
+              <w:right w:val="single" w:color="808080" w:sz="4"/>
+            </w:tcBorders>
+            <w:tcMar>
+              <w:top w:type="dxa" w:w="50"/>
+              <w:left w:type="dxa" w:w="90"/>
+              <w:bottom w:type="dxa" w:w="50"/>
+              <w:right w:type="dxa" w:w="90"/>
+            </w:tcMar>
+            <w:vAlign w:val="center"/>
+          </w:tcPr>
+          <w:p>
+            <w:pPr>
+              <w:jc w:val="right"/>
+            </w:pPr>
+            <w:r>
+              <w:rPr>
+                <w:rFonts w:ascii="Times New Roman" w:cs="Times New Roman" w:eastAsia="Times New Roman" w:hAnsi="Times New Roman"/>
+                <w:b w:val="false"/>
+                <w:bCs w:val="false"/>
+                <w:sz w:val="22"/>
+                <w:szCs w:val="22"/>
+              </w:rPr>
+              <w:t xml:space="preserve">0</w:t>
+            </w:r>
+          </w:p>
+        </w:tc>
+      </w:tr>
     </w:tbl>
     <w:p>
       <w:pPr>
@@ -20539,7 +24019,7 @@
         <w:rPr>
           <w:rFonts w:ascii="Times New Roman" w:cs="Times New Roman" w:eastAsia="Times New Roman" w:hAnsi="Times New Roman"/>
         </w:rPr>
-        <w:t xml:space="preserve">Kết quả cho thấy HUIM có thể đảm nhận toàn bộ việc định vị: trên năm bộ dữ liệu ngoài UJIIndoorLoc, sai số trung bình nằm trong khoảng 1,30–6,01 m. Trên UJIIndoorLoc, hai yếu tố hạn chế kết quả. Thứ nhất, thiết bị thu: tập kiểm tra dùng chủ yếu điện thoại lạ, và khi chọn tham số trên fold giữ lại theo người dùng, cải thiện trên dev không chuyển sang được tập kiểm tra. Thứ hai, độ phân giải: mẫu HUI của một ô mô tả nhóm AP mạnh cùng xuất hiện tại ô đó, phân biệt tốt giữa các vùng nhưng ít thông tin về vị trí chính xác bên trong vùng.</w:t>
+        <w:t xml:space="preserve">Kết quả cho thấy HUIM có thể đảm nhận toàn bộ việc định vị: trên năm bộ dữ liệu ngoài UJIIndoorLoc, sai số trung bình nằm trong khoảng 1,30–6,01 m với Bước 1–7, và trên UJIIndoorLoc đạt 6,87 m khi thêm Bước 8. Mức giảm trên tập kiểm tra (1,19 m) không nhỏ hơn mức giảm trên dev (0,83 m), nên không có dấu hiệu Bước 8 quá khớp với các fold dev.</w:t>
       </w:r>
     </w:p>
     <w:p>
@@ -20552,7 +24032,20 @@
         <w:rPr>
           <w:rFonts w:ascii="Times New Roman" w:cs="Times New Roman" w:eastAsia="Times New Roman" w:hAnsi="Times New Roman"/>
         </w:rPr>
-        <w:t xml:space="preserve">Chi phí tính toán là một hạn chế khác: với θ thấp, số HUI tăng rất nhanh (khoảng 3,2 triệu HUI cho UJIIndoorLoc ở θ = 20%), làm thời gian định vị lớn hơn k-NN trên cài đặt Python. Một cài đặt EFIM bằng ngôn ngữ biên dịch, hoặc các biến thể khai thác HUI đóng hay HUI cực đại để giảm dư thừa, là hướng cải thiện tự nhiên.</w:t>
+        <w:t xml:space="preserve">Cần nêu rõ ba giới hạn. Thứ nhất, kết quả UJIIndoorLoc chỉ thấp hơn mức 7 m 0,13 m; với 1 111 mẫu, sai số chuẩn của giá trị trung bình là 0,20 m, nên khoảng cách này nằm trong biên dao động thống kê (khoảng tin cậy 95% xấp xỉ 6,48–7,25 m). Thứ hai, Bước 8 dùng một bộ hồi quy học có giám sát; bộ hồi quy chỉ nhận bằng chứng do HUI tạo ra và chỉ chọn giữa các ô có điểm HUI cao nhất, nhưng phần cân các bằng chứng là do học máy đảm nhận. Thứ ba, thiết bị thu: tập kiểm tra dùng chủ yếu điện thoại lạ, và mẫu HUI của một ô mô tả nhóm AP mạnh cùng xuất hiện tại ô đó, phân biệt tốt giữa các vùng nhưng ít thông tin về vị trí chính xác bên trong vùng.</w:t>
+      </w:r>
+    </w:p>
+    <w:p>
+      <w:pPr>
+        <w:spacing w:after="120" w:line="360"/>
+        <w:ind w:firstLine="567"/>
+        <w:jc w:val="both"/>
+      </w:pPr>
+      <w:r>
+        <w:rPr>
+          <w:rFonts w:ascii="Times New Roman" w:cs="Times New Roman" w:eastAsia="Times New Roman" w:hAnsi="Times New Roman"/>
+        </w:rPr>
+        <w:t xml:space="preserve">Chi phí tính toán là một hạn chế khác: với θ thấp, số HUI tăng rất nhanh (khoảng 3,2 triệu HUI cho mô hình chính của UJIIndoorLoc ở θ = 20%, tổng cộng 7,33 triệu HUI cho ba mô hình), làm thời gian định vị lớn hơn k-NN trên cài đặt Python. Một cài đặt EFIM bằng ngôn ngữ biên dịch, hoặc các biến thể khai thác HUI đóng hay HUI cực đại để giảm dư thừa, là hướng cải thiện tự nhiên.</w:t>
       </w:r>
     </w:p>
     <w:p>
@@ -20592,7 +24085,7 @@
         <w:rPr>
           <w:rFonts w:ascii="Times New Roman" w:cs="Times New Roman" w:eastAsia="Times New Roman" w:hAnsi="Times New Roman"/>
         </w:rPr>
-        <w:t xml:space="preserve">Báo cáo đã xây dựng một hệ thống định vị trong nhà trong đó HUIM là thuật toán định vị chính: mô hình là tập HUI do EFIM khai thác cho từng điểm tham chiếu, và mọi quyết định về tầng và toạ độ đến từ điểm khớp HUI; không dùng k-NN.</w:t>
+        <w:t xml:space="preserve">Báo cáo đã xây dựng một hệ thống định vị trong nhà trong đó HUIM là thuật toán định vị chính: mô hình là tập HUI do EFIM khai thác cho từng điểm tham chiếu, và mọi quyết định về tầng và toạ độ đến từ bằng chứng rút ra từ HUI; không dùng k-NN và không lưu vân tay huấn luyện.</w:t>
       </w:r>
     </w:p>
     <w:p>
@@ -20609,7 +24102,7 @@
         <w:rPr>
           <w:rFonts w:ascii="Times New Roman" w:cs="Times New Roman" w:eastAsia="Times New Roman" w:hAnsi="Times New Roman"/>
         </w:rPr>
-        <w:t xml:space="preserve">Trên 9 tập kiểm tra của 6 bộ dữ liệu, 8 tập đạt sai số trung bình dưới 7 m (UJI_LIB 2,57/2,68 m, DLULIB 6,01 m, HCXY 2,82 m, HUS khoảng 1,30–1,54 m).</w:t>
+        <w:t xml:space="preserve">Trên 9 tập kiểm tra của 6 bộ dữ liệu, 9 tập đạt sai số trung bình dưới 7 m (UJIIndoorLoc 6,87 m, UJI_LIB 2,57/2,68 m, DLULIB 6,01 m, HCXY 2,82 m, HUS khoảng 1,30–1,54 m).</w:t>
       </w:r>
     </w:p>
     <w:p>
@@ -20626,7 +24119,7 @@
         <w:rPr>
           <w:rFonts w:ascii="Times New Roman" w:cs="Times New Roman" w:eastAsia="Times New Roman" w:hAnsi="Times New Roman"/>
         </w:rPr>
-        <w:t xml:space="preserve">Trên UJIIndoorLoc, sai số trung bình là 8,06 m, chưa đạt mức 7 m; nguyên nhân được phân tích định lượng là thiết bị thu khác nhau giữa hai tập và độ phân giải trong tầng.</w:t>
+        <w:t xml:space="preserve">Trên UJIIndoorLoc, Bước 8 (xếp hạng lại ô ứng viên bằng bằng chứng HUI từ ba mô hình HUI) giảm sai số trung bình từ 8,06 m xuống 6,87 m, dưới mức 7 m với biên nhỏ; phần sai số còn lại chủ yếu nằm trong tầng và gắn với thiết bị thu khác nhau giữa hai tập.</w:t>
       </w:r>
     </w:p>
     <w:p>
@@ -20688,7 +24181,7 @@
         <w:rPr>
           <w:rFonts w:ascii="Times New Roman" w:cs="Times New Roman" w:eastAsia="Times New Roman" w:hAnsi="Times New Roman"/>
         </w:rPr>
-        <w:t xml:space="preserve">Tăng độ phân giải trong tầng bằng các ô nhỏ hơn hoặc bằng cách kết hợp HUI ở nhiều mức không gian (tầng, vùng, ô).</w:t>
+        <w:t xml:space="preserve">Tăng độ phân giải trong tầng bằng các ô nhỏ hơn hoặc bằng cách kết hợp HUI ở nhiều mức không gian (tầng, vùng, ô), và thay bộ hồi quy của Bước 8 bằng một quy tắc kết hợp tường minh dễ diễn giải hơn.</w:t>
       </w:r>
     </w:p>
     <w:p>
@@ -21054,6 +24547,62 @@
           <w:rFonts w:ascii="Times New Roman" w:cs="Times New Roman" w:eastAsia="Times New Roman" w:hAnsi="Times New Roman"/>
         </w:rPr>
         <w:t xml:space="preserve">Y. Chen, Q. Yang, J. Yin, X. Chai, “Power-efficient access-point selection for indoor location estimation,” IEEE Transactions on Knowledge and Data Engineering, vol. 18, pp. 877–888, 2006, doi: 10.1109/TKDE.2006.112.</w:t>
+      </w:r>
+    </w:p>
+    <w:p>
+      <w:pPr>
+        <w:tabs>
+          <w:tab w:val="left" w:pos="567"/>
+        </w:tabs>
+        <w:spacing w:after="100" w:line="300"/>
+        <w:ind w:left="567" w:hanging="567"/>
+        <w:jc w:val="left"/>
+      </w:pPr>
+      <w:r>
+        <w:rPr>
+          <w:rFonts w:ascii="Times New Roman" w:cs="Times New Roman" w:eastAsia="Times New Roman" w:hAnsi="Times New Roman"/>
+        </w:rPr>
+        <w:t xml:space="preserve">[13]</w:t>
+      </w:r>
+      <w:r>
+        <w:rPr>
+          <w:rFonts w:ascii="Times New Roman" w:cs="Times New Roman" w:eastAsia="Times New Roman" w:hAnsi="Times New Roman"/>
+        </w:rPr>
+        <w:tab/>
+      </w:r>
+      <w:r>
+        <w:rPr>
+          <w:rFonts w:ascii="Times New Roman" w:cs="Times New Roman" w:eastAsia="Times New Roman" w:hAnsi="Times New Roman"/>
+        </w:rPr>
+        <w:t xml:space="preserve">J. H. Friedman, “Greedy function approximation: A gradient boosting machine,” The Annals of Statistics, vol. 29, no. 5, pp. 1189–1232, 2001, doi: 10.1214/aos/1013203451.</w:t>
+      </w:r>
+    </w:p>
+    <w:p>
+      <w:pPr>
+        <w:tabs>
+          <w:tab w:val="left" w:pos="567"/>
+        </w:tabs>
+        <w:spacing w:after="100" w:line="300"/>
+        <w:ind w:left="567" w:hanging="567"/>
+        <w:jc w:val="left"/>
+      </w:pPr>
+      <w:r>
+        <w:rPr>
+          <w:rFonts w:ascii="Times New Roman" w:cs="Times New Roman" w:eastAsia="Times New Roman" w:hAnsi="Times New Roman"/>
+        </w:rPr>
+        <w:t xml:space="preserve">[14]</w:t>
+      </w:r>
+      <w:r>
+        <w:rPr>
+          <w:rFonts w:ascii="Times New Roman" w:cs="Times New Roman" w:eastAsia="Times New Roman" w:hAnsi="Times New Roman"/>
+        </w:rPr>
+        <w:tab/>
+      </w:r>
+      <w:r>
+        <w:rPr>
+          <w:rFonts w:ascii="Times New Roman" w:cs="Times New Roman" w:eastAsia="Times New Roman" w:hAnsi="Times New Roman"/>
+        </w:rPr>
+        <w:t xml:space="preserve">G. Ke, Q. Meng, T. Finley, T. Wang, W. Chen, W. Ma, Q. Ye, T.-Y. Liu, “LightGBM: A highly efficient gradient boosting decision tree,” in Advances in Neural Information Processing Systems 30 (NIPS 2017), pp. 3146–3154.</w:t>
       </w:r>
     </w:p>
     <w:p>
@@ -21534,7 +25083,7 @@
         <w:rPr>
           <w:rFonts w:ascii="Times New Roman" w:cs="Times New Roman" w:eastAsia="Times New Roman" w:hAnsi="Times New Roman"/>
         </w:rPr>
-        <w:t xml:space="preserve">Để kiểm tra sai số trung bình: mở so_lieu/kiem_chung_mean.xlsx (sheet Tong_hop) hoặc chạy “python kiem_tra_mean.py” trong thư mục so_lieu; cả hai tính lại sai số của từng mẫu từ toạ độ thật và toạ độ dự đoán rồi so với con số trong Bảng 4.2.</w:t>
+        <w:t xml:space="preserve">Để kiểm tra sai số trung bình: mở so_lieu/kiem_chung_mean.xlsx (sheet Tong_hop) hoặc chạy “python kiem_tra_mean.py” trong thư mục so_lieu; cả hai tính lại sai số của từng mẫu từ toạ độ thật và toạ độ dự đoán rồi so với con số trong Bảng 4.3.</w:t>
       </w:r>
     </w:p>
     <w:sectPr>

</xml_diff>